<commit_message>
Add model type column to scalable women- and youth-led models table
Co-Authored-By: Claude Opus 5.5 <noreply@anthropic.com>
Claude-Session: https://claude.ai/code/session_01MNFGowooBRn67hG766h929
</commit_message>
<xml_diff>
--- a/KAZA_MSME_Investment_Readiness_Assessment.docx
+++ b/KAZA_MSME_Investment_Readiness_Assessment.docx
@@ -171,7 +171,7 @@
             </w:rPr>
             <w:fldChar w:fldCharType="separate"/>
           </w:r>
-          <w:hyperlink w:anchor="__RefHeading___Toc2903_2470420549">
+          <w:hyperlink w:anchor="__RefHeading___Toc2930_616069264">
             <w:r>
               <w:rPr>
                 <w:rStyle w:val="IndexLink"/>
@@ -191,7 +191,7 @@
             </w:tabs>
             <w:rPr/>
           </w:pPr>
-          <w:hyperlink w:anchor="__RefHeading___Toc2905_2470420549">
+          <w:hyperlink w:anchor="__RefHeading___Toc2932_616069264">
             <w:r>
               <w:rPr>
                 <w:rStyle w:val="IndexLink"/>
@@ -211,7 +211,7 @@
             </w:tabs>
             <w:rPr/>
           </w:pPr>
-          <w:hyperlink w:anchor="__RefHeading___Toc2907_2470420549">
+          <w:hyperlink w:anchor="__RefHeading___Toc2934_616069264">
             <w:r>
               <w:rPr>
                 <w:rStyle w:val="IndexLink"/>
@@ -231,7 +231,7 @@
             </w:tabs>
             <w:rPr/>
           </w:pPr>
-          <w:hyperlink w:anchor="__RefHeading___Toc2909_2470420549">
+          <w:hyperlink w:anchor="__RefHeading___Toc2936_616069264">
             <w:r>
               <w:rPr>
                 <w:rStyle w:val="IndexLink"/>
@@ -251,7 +251,7 @@
             </w:tabs>
             <w:rPr/>
           </w:pPr>
-          <w:hyperlink w:anchor="__RefHeading___Toc2911_2470420549">
+          <w:hyperlink w:anchor="__RefHeading___Toc2938_616069264">
             <w:r>
               <w:rPr>
                 <w:rStyle w:val="IndexLink"/>
@@ -271,7 +271,7 @@
             </w:tabs>
             <w:rPr/>
           </w:pPr>
-          <w:hyperlink w:anchor="__RefHeading___Toc2913_2470420549">
+          <w:hyperlink w:anchor="__RefHeading___Toc2940_616069264">
             <w:r>
               <w:rPr>
                 <w:rStyle w:val="IndexLink"/>
@@ -291,7 +291,7 @@
             </w:tabs>
             <w:rPr/>
           </w:pPr>
-          <w:hyperlink w:anchor="__RefHeading___Toc2915_2470420549">
+          <w:hyperlink w:anchor="__RefHeading___Toc2942_616069264">
             <w:r>
               <w:rPr>
                 <w:rStyle w:val="IndexLink"/>
@@ -311,7 +311,7 @@
             </w:tabs>
             <w:rPr/>
           </w:pPr>
-          <w:hyperlink w:anchor="__RefHeading___Toc2917_2470420549">
+          <w:hyperlink w:anchor="__RefHeading___Toc2944_616069264">
             <w:r>
               <w:rPr>
                 <w:rStyle w:val="IndexLink"/>
@@ -331,7 +331,7 @@
             </w:tabs>
             <w:rPr/>
           </w:pPr>
-          <w:hyperlink w:anchor="__RefHeading___Toc2919_2470420549">
+          <w:hyperlink w:anchor="__RefHeading___Toc2946_616069264">
             <w:r>
               <w:rPr>
                 <w:rStyle w:val="IndexLink"/>
@@ -351,7 +351,7 @@
             </w:tabs>
             <w:rPr/>
           </w:pPr>
-          <w:hyperlink w:anchor="__RefHeading___Toc2921_2470420549">
+          <w:hyperlink w:anchor="__RefHeading___Toc2948_616069264">
             <w:r>
               <w:rPr>
                 <w:rStyle w:val="IndexLink"/>
@@ -371,7 +371,7 @@
             </w:tabs>
             <w:rPr/>
           </w:pPr>
-          <w:hyperlink w:anchor="__RefHeading___Toc2923_2470420549">
+          <w:hyperlink w:anchor="__RefHeading___Toc2950_616069264">
             <w:r>
               <w:rPr>
                 <w:rStyle w:val="IndexLink"/>
@@ -391,7 +391,7 @@
             </w:tabs>
             <w:rPr/>
           </w:pPr>
-          <w:hyperlink w:anchor="__RefHeading___Toc2925_2470420549">
+          <w:hyperlink w:anchor="__RefHeading___Toc2952_616069264">
             <w:r>
               <w:rPr>
                 <w:rStyle w:val="IndexLink"/>
@@ -411,7 +411,7 @@
             </w:tabs>
             <w:rPr/>
           </w:pPr>
-          <w:hyperlink w:anchor="__RefHeading___Toc2927_2470420549">
+          <w:hyperlink w:anchor="__RefHeading___Toc2954_616069264">
             <w:r>
               <w:rPr>
                 <w:rStyle w:val="IndexLink"/>
@@ -431,7 +431,7 @@
             </w:tabs>
             <w:rPr/>
           </w:pPr>
-          <w:hyperlink w:anchor="__RefHeading___Toc2929_2470420549">
+          <w:hyperlink w:anchor="__RefHeading___Toc2956_616069264">
             <w:r>
               <w:rPr>
                 <w:rStyle w:val="IndexLink"/>
@@ -451,7 +451,7 @@
             </w:tabs>
             <w:rPr/>
           </w:pPr>
-          <w:hyperlink w:anchor="__RefHeading___Toc2931_2470420549">
+          <w:hyperlink w:anchor="__RefHeading___Toc2958_616069264">
             <w:r>
               <w:rPr>
                 <w:rStyle w:val="IndexLink"/>
@@ -471,7 +471,7 @@
             </w:tabs>
             <w:rPr/>
           </w:pPr>
-          <w:hyperlink w:anchor="__RefHeading___Toc2933_2470420549">
+          <w:hyperlink w:anchor="__RefHeading___Toc2960_616069264">
             <w:r>
               <w:rPr>
                 <w:rStyle w:val="IndexLink"/>
@@ -491,7 +491,7 @@
             </w:tabs>
             <w:rPr/>
           </w:pPr>
-          <w:hyperlink w:anchor="__RefHeading___Toc2935_2470420549">
+          <w:hyperlink w:anchor="__RefHeading___Toc2962_616069264">
             <w:r>
               <w:rPr>
                 <w:rStyle w:val="IndexLink"/>
@@ -511,7 +511,7 @@
             </w:tabs>
             <w:rPr/>
           </w:pPr>
-          <w:hyperlink w:anchor="__RefHeading___Toc2937_2470420549">
+          <w:hyperlink w:anchor="__RefHeading___Toc2964_616069264">
             <w:r>
               <w:rPr>
                 <w:rStyle w:val="IndexLink"/>
@@ -531,7 +531,7 @@
             </w:tabs>
             <w:rPr/>
           </w:pPr>
-          <w:hyperlink w:anchor="__RefHeading___Toc2939_2470420549">
+          <w:hyperlink w:anchor="__RefHeading___Toc2966_616069264">
             <w:r>
               <w:rPr>
                 <w:rStyle w:val="IndexLink"/>
@@ -551,7 +551,7 @@
             </w:tabs>
             <w:rPr/>
           </w:pPr>
-          <w:hyperlink w:anchor="__RefHeading___Toc2941_2470420549">
+          <w:hyperlink w:anchor="__RefHeading___Toc2968_616069264">
             <w:r>
               <w:rPr>
                 <w:rStyle w:val="IndexLink"/>
@@ -571,7 +571,7 @@
             </w:tabs>
             <w:rPr/>
           </w:pPr>
-          <w:hyperlink w:anchor="__RefHeading___Toc2943_2470420549">
+          <w:hyperlink w:anchor="__RefHeading___Toc2970_616069264">
             <w:r>
               <w:rPr>
                 <w:rStyle w:val="IndexLink"/>
@@ -591,7 +591,7 @@
             </w:tabs>
             <w:rPr/>
           </w:pPr>
-          <w:hyperlink w:anchor="__RefHeading___Toc2945_2470420549">
+          <w:hyperlink w:anchor="__RefHeading___Toc2972_616069264">
             <w:r>
               <w:rPr>
                 <w:rStyle w:val="IndexLink"/>
@@ -611,7 +611,7 @@
             </w:tabs>
             <w:rPr/>
           </w:pPr>
-          <w:hyperlink w:anchor="__RefHeading___Toc2947_2470420549">
+          <w:hyperlink w:anchor="__RefHeading___Toc2974_616069264">
             <w:r>
               <w:rPr>
                 <w:rStyle w:val="IndexLink"/>
@@ -631,7 +631,7 @@
             </w:tabs>
             <w:rPr/>
           </w:pPr>
-          <w:hyperlink w:anchor="__RefHeading___Toc2949_2470420549">
+          <w:hyperlink w:anchor="__RefHeading___Toc2976_616069264">
             <w:r>
               <w:rPr>
                 <w:rStyle w:val="IndexLink"/>
@@ -651,7 +651,7 @@
             </w:tabs>
             <w:rPr/>
           </w:pPr>
-          <w:hyperlink w:anchor="__RefHeading___Toc2951_2470420549">
+          <w:hyperlink w:anchor="__RefHeading___Toc2978_616069264">
             <w:r>
               <w:rPr>
                 <w:rStyle w:val="IndexLink"/>
@@ -671,7 +671,7 @@
             </w:tabs>
             <w:rPr/>
           </w:pPr>
-          <w:hyperlink w:anchor="__RefHeading___Toc2953_2470420549">
+          <w:hyperlink w:anchor="__RefHeading___Toc2980_616069264">
             <w:r>
               <w:rPr>
                 <w:rStyle w:val="IndexLink"/>
@@ -691,7 +691,7 @@
             </w:tabs>
             <w:rPr/>
           </w:pPr>
-          <w:hyperlink w:anchor="__RefHeading___Toc2955_2470420549">
+          <w:hyperlink w:anchor="__RefHeading___Toc2982_616069264">
             <w:r>
               <w:rPr>
                 <w:rStyle w:val="IndexLink"/>
@@ -711,7 +711,7 @@
             </w:tabs>
             <w:rPr/>
           </w:pPr>
-          <w:hyperlink w:anchor="__RefHeading___Toc2957_2470420549">
+          <w:hyperlink w:anchor="__RefHeading___Toc2984_616069264">
             <w:r>
               <w:rPr>
                 <w:rStyle w:val="IndexLink"/>
@@ -731,7 +731,7 @@
             </w:tabs>
             <w:rPr/>
           </w:pPr>
-          <w:hyperlink w:anchor="__RefHeading___Toc2959_2470420549">
+          <w:hyperlink w:anchor="__RefHeading___Toc2986_616069264">
             <w:r>
               <w:rPr>
                 <w:rStyle w:val="IndexLink"/>
@@ -751,7 +751,7 @@
             </w:tabs>
             <w:rPr/>
           </w:pPr>
-          <w:hyperlink w:anchor="__RefHeading___Toc2961_2470420549">
+          <w:hyperlink w:anchor="__RefHeading___Toc2988_616069264">
             <w:r>
               <w:rPr>
                 <w:rStyle w:val="IndexLink"/>
@@ -771,7 +771,7 @@
             </w:tabs>
             <w:rPr/>
           </w:pPr>
-          <w:hyperlink w:anchor="__RefHeading___Toc2963_2470420549">
+          <w:hyperlink w:anchor="__RefHeading___Toc2990_616069264">
             <w:r>
               <w:rPr>
                 <w:rStyle w:val="IndexLink"/>
@@ -791,7 +791,7 @@
             </w:tabs>
             <w:rPr/>
           </w:pPr>
-          <w:hyperlink w:anchor="__RefHeading___Toc2965_2470420549">
+          <w:hyperlink w:anchor="__RefHeading___Toc2992_616069264">
             <w:r>
               <w:rPr>
                 <w:rStyle w:val="IndexLink"/>
@@ -811,7 +811,7 @@
             </w:tabs>
             <w:rPr/>
           </w:pPr>
-          <w:hyperlink w:anchor="__RefHeading___Toc2967_2470420549">
+          <w:hyperlink w:anchor="__RefHeading___Toc2994_616069264">
             <w:r>
               <w:rPr>
                 <w:rStyle w:val="IndexLink"/>
@@ -831,7 +831,7 @@
             </w:tabs>
             <w:rPr/>
           </w:pPr>
-          <w:hyperlink w:anchor="__RefHeading___Toc2969_2470420549">
+          <w:hyperlink w:anchor="__RefHeading___Toc2996_616069264">
             <w:r>
               <w:rPr>
                 <w:rStyle w:val="IndexLink"/>
@@ -851,7 +851,7 @@
             </w:tabs>
             <w:rPr/>
           </w:pPr>
-          <w:hyperlink w:anchor="__RefHeading___Toc2971_2470420549">
+          <w:hyperlink w:anchor="__RefHeading___Toc2998_616069264">
             <w:r>
               <w:rPr>
                 <w:rStyle w:val="IndexLink"/>
@@ -871,7 +871,7 @@
             </w:tabs>
             <w:rPr/>
           </w:pPr>
-          <w:hyperlink w:anchor="__RefHeading___Toc2973_2470420549">
+          <w:hyperlink w:anchor="__RefHeading___Toc3000_616069264">
             <w:r>
               <w:rPr>
                 <w:rStyle w:val="IndexLink"/>
@@ -891,7 +891,7 @@
             </w:tabs>
             <w:rPr/>
           </w:pPr>
-          <w:hyperlink w:anchor="__RefHeading___Toc2975_2470420549">
+          <w:hyperlink w:anchor="__RefHeading___Toc3002_616069264">
             <w:r>
               <w:rPr>
                 <w:rStyle w:val="IndexLink"/>
@@ -911,7 +911,7 @@
             </w:tabs>
             <w:rPr/>
           </w:pPr>
-          <w:hyperlink w:anchor="__RefHeading___Toc2977_2470420549">
+          <w:hyperlink w:anchor="__RefHeading___Toc3004_616069264">
             <w:r>
               <w:rPr>
                 <w:rStyle w:val="IndexLink"/>
@@ -931,7 +931,7 @@
             </w:tabs>
             <w:rPr/>
           </w:pPr>
-          <w:hyperlink w:anchor="__RefHeading___Toc2979_2470420549">
+          <w:hyperlink w:anchor="__RefHeading___Toc3006_616069264">
             <w:r>
               <w:rPr>
                 <w:rStyle w:val="IndexLink"/>
@@ -951,7 +951,7 @@
             </w:tabs>
             <w:rPr/>
           </w:pPr>
-          <w:hyperlink w:anchor="__RefHeading___Toc2981_2470420549">
+          <w:hyperlink w:anchor="__RefHeading___Toc3008_616069264">
             <w:r>
               <w:rPr>
                 <w:rStyle w:val="IndexLink"/>
@@ -971,7 +971,7 @@
             </w:tabs>
             <w:rPr/>
           </w:pPr>
-          <w:hyperlink w:anchor="__RefHeading___Toc2983_2470420549">
+          <w:hyperlink w:anchor="__RefHeading___Toc3010_616069264">
             <w:r>
               <w:rPr>
                 <w:rStyle w:val="IndexLink"/>
@@ -991,7 +991,7 @@
             </w:tabs>
             <w:rPr/>
           </w:pPr>
-          <w:hyperlink w:anchor="__RefHeading___Toc2985_2470420549">
+          <w:hyperlink w:anchor="__RefHeading___Toc3012_616069264">
             <w:r>
               <w:rPr>
                 <w:rStyle w:val="IndexLink"/>
@@ -1011,7 +1011,7 @@
             </w:tabs>
             <w:rPr/>
           </w:pPr>
-          <w:hyperlink w:anchor="__RefHeading___Toc2987_2470420549">
+          <w:hyperlink w:anchor="__RefHeading___Toc3014_616069264">
             <w:r>
               <w:rPr>
                 <w:rStyle w:val="IndexLink"/>
@@ -1031,7 +1031,7 @@
             </w:tabs>
             <w:rPr/>
           </w:pPr>
-          <w:hyperlink w:anchor="__RefHeading___Toc2989_2470420549">
+          <w:hyperlink w:anchor="__RefHeading___Toc3016_616069264">
             <w:r>
               <w:rPr>
                 <w:rStyle w:val="IndexLink"/>
@@ -1051,7 +1051,7 @@
             </w:tabs>
             <w:rPr/>
           </w:pPr>
-          <w:hyperlink w:anchor="__RefHeading___Toc2991_2470420549">
+          <w:hyperlink w:anchor="__RefHeading___Toc3018_616069264">
             <w:r>
               <w:rPr>
                 <w:rStyle w:val="IndexLink"/>
@@ -1071,7 +1071,7 @@
             </w:tabs>
             <w:rPr/>
           </w:pPr>
-          <w:hyperlink w:anchor="__RefHeading___Toc2993_2470420549">
+          <w:hyperlink w:anchor="__RefHeading___Toc3020_616069264">
             <w:r>
               <w:rPr>
                 <w:rStyle w:val="IndexLink"/>
@@ -1091,7 +1091,7 @@
             </w:tabs>
             <w:rPr/>
           </w:pPr>
-          <w:hyperlink w:anchor="__RefHeading___Toc2995_2470420549">
+          <w:hyperlink w:anchor="__RefHeading___Toc3022_616069264">
             <w:r>
               <w:rPr>
                 <w:rStyle w:val="IndexLink"/>
@@ -1111,7 +1111,7 @@
             </w:tabs>
             <w:rPr/>
           </w:pPr>
-          <w:hyperlink w:anchor="__RefHeading___Toc2997_2470420549">
+          <w:hyperlink w:anchor="__RefHeading___Toc3024_616069264">
             <w:r>
               <w:rPr>
                 <w:rStyle w:val="IndexLink"/>
@@ -1131,7 +1131,7 @@
             </w:tabs>
             <w:rPr/>
           </w:pPr>
-          <w:hyperlink w:anchor="__RefHeading___Toc2999_2470420549">
+          <w:hyperlink w:anchor="__RefHeading___Toc3026_616069264">
             <w:r>
               <w:rPr>
                 <w:rStyle w:val="IndexLink"/>
@@ -4512,7 +4512,7 @@
       <w:r>
         <w:br w:type="page"/>
       </w:r>
-      <w:bookmarkStart w:id="0" w:name="__RefHeading___Toc2903_2470420549"/>
+      <w:bookmarkStart w:id="0" w:name="__RefHeading___Toc2930_616069264"/>
       <w:bookmarkEnd w:id="0"/>
       <w:r>
         <w:rPr/>
@@ -4828,7 +4828,7 @@
         <w:spacing w:before="0" w:after="240"/>
         <w:rPr/>
       </w:pPr>
-      <w:bookmarkStart w:id="1" w:name="__RefHeading___Toc2905_2470420549"/>
+      <w:bookmarkStart w:id="1" w:name="__RefHeading___Toc2932_616069264"/>
       <w:bookmarkEnd w:id="1"/>
       <w:r>
         <w:rPr/>
@@ -4840,7 +4840,7 @@
         <w:pStyle w:val="Heading2"/>
         <w:rPr/>
       </w:pPr>
-      <w:bookmarkStart w:id="2" w:name="__RefHeading___Toc2907_2470420549"/>
+      <w:bookmarkStart w:id="2" w:name="__RefHeading___Toc2934_616069264"/>
       <w:bookmarkEnd w:id="2"/>
       <w:r>
         <w:rPr/>
@@ -4968,7 +4968,7 @@
         <w:pStyle w:val="Heading2"/>
         <w:rPr/>
       </w:pPr>
-      <w:bookmarkStart w:id="3" w:name="__RefHeading___Toc2909_2470420549"/>
+      <w:bookmarkStart w:id="3" w:name="__RefHeading___Toc2936_616069264"/>
       <w:bookmarkEnd w:id="3"/>
       <w:r>
         <w:rPr/>
@@ -5470,7 +5470,7 @@
         <w:pStyle w:val="Heading2"/>
         <w:rPr/>
       </w:pPr>
-      <w:bookmarkStart w:id="4" w:name="__RefHeading___Toc2911_2470420549"/>
+      <w:bookmarkStart w:id="4" w:name="__RefHeading___Toc2938_616069264"/>
       <w:bookmarkEnd w:id="4"/>
       <w:r>
         <w:rPr/>
@@ -6420,7 +6420,7 @@
         <w:pStyle w:val="Heading2"/>
         <w:rPr/>
       </w:pPr>
-      <w:bookmarkStart w:id="5" w:name="__RefHeading___Toc2913_2470420549"/>
+      <w:bookmarkStart w:id="5" w:name="__RefHeading___Toc2940_616069264"/>
       <w:bookmarkEnd w:id="5"/>
       <w:r>
         <w:rPr/>
@@ -6541,7 +6541,7 @@
         <w:spacing w:before="0" w:after="240"/>
         <w:rPr/>
       </w:pPr>
-      <w:bookmarkStart w:id="6" w:name="__RefHeading___Toc2915_2470420549"/>
+      <w:bookmarkStart w:id="6" w:name="__RefHeading___Toc2942_616069264"/>
       <w:bookmarkEnd w:id="6"/>
       <w:r>
         <w:rPr/>
@@ -6553,7 +6553,7 @@
         <w:pStyle w:val="Heading2"/>
         <w:rPr/>
       </w:pPr>
-      <w:bookmarkStart w:id="7" w:name="__RefHeading___Toc2917_2470420549"/>
+      <w:bookmarkStart w:id="7" w:name="__RefHeading___Toc2944_616069264"/>
       <w:bookmarkEnd w:id="7"/>
       <w:r>
         <w:rPr/>
@@ -6815,7 +6815,7 @@
         <w:pStyle w:val="Heading2"/>
         <w:rPr/>
       </w:pPr>
-      <w:bookmarkStart w:id="8" w:name="__RefHeading___Toc2919_2470420549"/>
+      <w:bookmarkStart w:id="8" w:name="__RefHeading___Toc2946_616069264"/>
       <w:bookmarkEnd w:id="8"/>
       <w:r>
         <w:rPr/>
@@ -7401,7 +7401,7 @@
         <w:spacing w:before="0" w:after="240"/>
         <w:rPr/>
       </w:pPr>
-      <w:bookmarkStart w:id="9" w:name="__RefHeading___Toc2921_2470420549"/>
+      <w:bookmarkStart w:id="9" w:name="__RefHeading___Toc2948_616069264"/>
       <w:bookmarkEnd w:id="9"/>
       <w:r>
         <w:rPr/>
@@ -7413,7 +7413,7 @@
         <w:pStyle w:val="Heading2"/>
         <w:rPr/>
       </w:pPr>
-      <w:bookmarkStart w:id="10" w:name="__RefHeading___Toc2923_2470420549"/>
+      <w:bookmarkStart w:id="10" w:name="__RefHeading___Toc2950_616069264"/>
       <w:bookmarkEnd w:id="10"/>
       <w:r>
         <w:rPr/>
@@ -7541,7 +7541,7 @@
         <w:pStyle w:val="Heading2"/>
         <w:rPr/>
       </w:pPr>
-      <w:bookmarkStart w:id="11" w:name="__RefHeading___Toc2925_2470420549"/>
+      <w:bookmarkStart w:id="11" w:name="__RefHeading___Toc2952_616069264"/>
       <w:bookmarkEnd w:id="11"/>
       <w:r>
         <w:rPr/>
@@ -7722,7 +7722,7 @@
         <w:spacing w:before="0" w:after="240"/>
         <w:rPr/>
       </w:pPr>
-      <w:bookmarkStart w:id="12" w:name="__RefHeading___Toc2927_2470420549"/>
+      <w:bookmarkStart w:id="12" w:name="__RefHeading___Toc2954_616069264"/>
       <w:bookmarkEnd w:id="12"/>
       <w:r>
         <w:rPr/>
@@ -7734,7 +7734,7 @@
         <w:pStyle w:val="Heading2"/>
         <w:rPr/>
       </w:pPr>
-      <w:bookmarkStart w:id="13" w:name="__RefHeading___Toc2929_2470420549"/>
+      <w:bookmarkStart w:id="13" w:name="__RefHeading___Toc2956_616069264"/>
       <w:bookmarkEnd w:id="13"/>
       <w:r>
         <w:rPr/>
@@ -7862,7 +7862,7 @@
         <w:pStyle w:val="Heading2"/>
         <w:rPr/>
       </w:pPr>
-      <w:bookmarkStart w:id="14" w:name="__RefHeading___Toc2931_2470420549"/>
+      <w:bookmarkStart w:id="14" w:name="__RefHeading___Toc2958_616069264"/>
       <w:bookmarkEnd w:id="14"/>
       <w:r>
         <w:rPr/>
@@ -7941,7 +7941,7 @@
         <w:pStyle w:val="Heading2"/>
         <w:rPr/>
       </w:pPr>
-      <w:bookmarkStart w:id="15" w:name="__RefHeading___Toc2933_2470420549"/>
+      <w:bookmarkStart w:id="15" w:name="__RefHeading___Toc2960_616069264"/>
       <w:bookmarkEnd w:id="15"/>
       <w:r>
         <w:rPr/>
@@ -8070,7 +8070,7 @@
         <w:pStyle w:val="Heading2"/>
         <w:rPr/>
       </w:pPr>
-      <w:bookmarkStart w:id="16" w:name="__RefHeading___Toc2935_2470420549"/>
+      <w:bookmarkStart w:id="16" w:name="__RefHeading___Toc2962_616069264"/>
       <w:bookmarkEnd w:id="16"/>
       <w:r>
         <w:rPr/>
@@ -10035,7 +10035,7 @@
         <w:spacing w:before="0" w:after="240"/>
         <w:rPr/>
       </w:pPr>
-      <w:bookmarkStart w:id="17" w:name="__RefHeading___Toc2937_2470420549"/>
+      <w:bookmarkStart w:id="17" w:name="__RefHeading___Toc2964_616069264"/>
       <w:bookmarkEnd w:id="17"/>
       <w:r>
         <w:rPr/>
@@ -10047,7 +10047,7 @@
         <w:pStyle w:val="Heading2"/>
         <w:rPr/>
       </w:pPr>
-      <w:bookmarkStart w:id="18" w:name="__RefHeading___Toc2939_2470420549"/>
+      <w:bookmarkStart w:id="18" w:name="__RefHeading___Toc2966_616069264"/>
       <w:bookmarkEnd w:id="18"/>
       <w:r>
         <w:rPr/>
@@ -10070,7 +10070,7 @@
         <w:pStyle w:val="Heading2"/>
         <w:rPr/>
       </w:pPr>
-      <w:bookmarkStart w:id="19" w:name="__RefHeading___Toc2941_2470420549"/>
+      <w:bookmarkStart w:id="19" w:name="__RefHeading___Toc2968_616069264"/>
       <w:bookmarkEnd w:id="19"/>
       <w:r>
         <w:rPr/>
@@ -10227,7 +10227,7 @@
         <w:pStyle w:val="Heading2"/>
         <w:rPr/>
       </w:pPr>
-      <w:bookmarkStart w:id="20" w:name="__RefHeading___Toc2943_2470420549"/>
+      <w:bookmarkStart w:id="20" w:name="__RefHeading___Toc2970_616069264"/>
       <w:bookmarkEnd w:id="20"/>
       <w:r>
         <w:rPr/>
@@ -10344,7 +10344,7 @@
         <w:pStyle w:val="Heading2"/>
         <w:rPr/>
       </w:pPr>
-      <w:bookmarkStart w:id="21" w:name="__RefHeading___Toc2945_2470420549"/>
+      <w:bookmarkStart w:id="21" w:name="__RefHeading___Toc2972_616069264"/>
       <w:bookmarkEnd w:id="21"/>
       <w:r>
         <w:rPr/>
@@ -11229,7 +11229,7 @@
         <w:spacing w:before="0" w:after="240"/>
         <w:rPr/>
       </w:pPr>
-      <w:bookmarkStart w:id="22" w:name="__RefHeading___Toc2947_2470420549"/>
+      <w:bookmarkStart w:id="22" w:name="__RefHeading___Toc2974_616069264"/>
       <w:bookmarkEnd w:id="22"/>
       <w:r>
         <w:rPr/>
@@ -11252,7 +11252,7 @@
         <w:pStyle w:val="Heading2"/>
         <w:rPr/>
       </w:pPr>
-      <w:bookmarkStart w:id="23" w:name="__RefHeading___Toc2949_2470420549"/>
+      <w:bookmarkStart w:id="23" w:name="__RefHeading___Toc2976_616069264"/>
       <w:bookmarkEnd w:id="23"/>
       <w:r>
         <w:rPr/>
@@ -12482,7 +12482,7 @@
         <w:pStyle w:val="Heading2"/>
         <w:rPr/>
       </w:pPr>
-      <w:bookmarkStart w:id="24" w:name="__RefHeading___Toc2951_2470420549"/>
+      <w:bookmarkStart w:id="24" w:name="__RefHeading___Toc2978_616069264"/>
       <w:bookmarkEnd w:id="24"/>
       <w:r>
         <w:rPr/>
@@ -12652,7 +12652,7 @@
         <w:pStyle w:val="Heading2"/>
         <w:rPr/>
       </w:pPr>
-      <w:bookmarkStart w:id="25" w:name="__RefHeading___Toc2953_2470420549"/>
+      <w:bookmarkStart w:id="25" w:name="__RefHeading___Toc2980_616069264"/>
       <w:bookmarkEnd w:id="25"/>
       <w:r>
         <w:rPr/>
@@ -13623,7 +13623,7 @@
         <w:spacing w:before="0" w:after="240"/>
         <w:rPr/>
       </w:pPr>
-      <w:bookmarkStart w:id="26" w:name="__RefHeading___Toc2955_2470420549"/>
+      <w:bookmarkStart w:id="26" w:name="__RefHeading___Toc2982_616069264"/>
       <w:bookmarkEnd w:id="26"/>
       <w:r>
         <w:rPr/>
@@ -13646,7 +13646,7 @@
         <w:pStyle w:val="Heading2"/>
         <w:rPr/>
       </w:pPr>
-      <w:bookmarkStart w:id="27" w:name="__RefHeading___Toc2957_2470420549"/>
+      <w:bookmarkStart w:id="27" w:name="__RefHeading___Toc2984_616069264"/>
       <w:bookmarkEnd w:id="27"/>
       <w:r>
         <w:rPr/>
@@ -16581,7 +16581,7 @@
         <w:pStyle w:val="Heading2"/>
         <w:rPr/>
       </w:pPr>
-      <w:bookmarkStart w:id="28" w:name="__RefHeading___Toc2959_2470420549"/>
+      <w:bookmarkStart w:id="28" w:name="__RefHeading___Toc2986_616069264"/>
       <w:bookmarkEnd w:id="28"/>
       <w:r>
         <w:rPr/>
@@ -16825,7 +16825,7 @@
         <w:pStyle w:val="Heading2"/>
         <w:rPr/>
       </w:pPr>
-      <w:bookmarkStart w:id="29" w:name="__RefHeading___Toc2961_2470420549"/>
+      <w:bookmarkStart w:id="29" w:name="__RefHeading___Toc2988_616069264"/>
       <w:bookmarkEnd w:id="29"/>
       <w:r>
         <w:rPr/>
@@ -18275,7 +18275,7 @@
         <w:pStyle w:val="Heading2"/>
         <w:rPr/>
       </w:pPr>
-      <w:bookmarkStart w:id="30" w:name="__RefHeading___Toc2963_2470420549"/>
+      <w:bookmarkStart w:id="30" w:name="__RefHeading___Toc2990_616069264"/>
       <w:bookmarkEnd w:id="30"/>
       <w:r>
         <w:rPr/>
@@ -18361,7 +18361,7 @@
         <w:spacing w:before="0" w:after="240"/>
         <w:rPr/>
       </w:pPr>
-      <w:bookmarkStart w:id="31" w:name="__RefHeading___Toc2965_2470420549"/>
+      <w:bookmarkStart w:id="31" w:name="__RefHeading___Toc2992_616069264"/>
       <w:bookmarkEnd w:id="31"/>
       <w:r>
         <w:rPr/>
@@ -18373,7 +18373,7 @@
         <w:pStyle w:val="Heading2"/>
         <w:rPr/>
       </w:pPr>
-      <w:bookmarkStart w:id="32" w:name="__RefHeading___Toc2967_2470420549"/>
+      <w:bookmarkStart w:id="32" w:name="__RefHeading___Toc2994_616069264"/>
       <w:bookmarkEnd w:id="32"/>
       <w:r>
         <w:rPr/>
@@ -19338,7 +19338,7 @@
         <w:pStyle w:val="Heading2"/>
         <w:rPr/>
       </w:pPr>
-      <w:bookmarkStart w:id="33" w:name="__RefHeading___Toc2969_2470420549"/>
+      <w:bookmarkStart w:id="33" w:name="__RefHeading___Toc2996_616069264"/>
       <w:bookmarkEnd w:id="33"/>
       <w:r>
         <w:rPr/>
@@ -20368,7 +20368,7 @@
         <w:pStyle w:val="Heading2"/>
         <w:rPr/>
       </w:pPr>
-      <w:bookmarkStart w:id="34" w:name="__RefHeading___Toc2971_2470420549"/>
+      <w:bookmarkStart w:id="34" w:name="__RefHeading___Toc2998_616069264"/>
       <w:bookmarkEnd w:id="34"/>
       <w:r>
         <w:rPr/>
@@ -21297,7 +21297,7 @@
         <w:spacing w:before="0" w:after="240"/>
         <w:rPr/>
       </w:pPr>
-      <w:bookmarkStart w:id="35" w:name="__RefHeading___Toc2973_2470420549"/>
+      <w:bookmarkStart w:id="35" w:name="__RefHeading___Toc3000_616069264"/>
       <w:bookmarkEnd w:id="35"/>
       <w:r>
         <w:rPr/>
@@ -21312,7 +21312,7 @@
       </w:pPr>
       <w:r>
         <w:rPr/>
-        <w:t>The evidence contains few enterprise cases, and most rest on single interviews. The models below show investment potential and are relevant to women or youth. Where the evidence does not state who leads the enterprise, the table says so.</w:t>
+        <w:t>The evidence contains few enterprise cases, and most rest on single interviews. The models below show investment potential and are relevant to women or youth. The model type column classifies each case by organisational form, value chain and value chain node (Section 2.2). Where the evidence does not state who leads the enterprise, the table says so.</w:t>
       </w:r>
     </w:p>
     <w:p>
@@ -21356,10 +21356,11 @@
         </w:tblCellMar>
       </w:tblPr>
       <w:tblGrid>
-        <w:gridCol w:w="1899"/>
-        <w:gridCol w:w="2700"/>
-        <w:gridCol w:w="1801"/>
-        <w:gridCol w:w="2625"/>
+        <w:gridCol w:w="1600"/>
+        <w:gridCol w:w="1500"/>
+        <w:gridCol w:w="2400"/>
+        <w:gridCol w:w="1498"/>
+        <w:gridCol w:w="2028"/>
       </w:tblGrid>
       <w:tr>
         <w:trPr>
@@ -21367,7 +21368,7 @@
         </w:trPr>
         <w:tc>
           <w:tcPr>
-            <w:tcW w:w="1899" w:type="dxa"/>
+            <w:tcW w:w="1600" w:type="dxa"/>
             <w:tcBorders>
               <w:top w:val="single" w:sz="4" w:space="0" w:color="B7C4BB"/>
               <w:left w:val="single" w:sz="4" w:space="0" w:color="B7C4BB"/>
@@ -21396,7 +21397,7 @@
         </w:tc>
         <w:tc>
           <w:tcPr>
-            <w:tcW w:w="2700" w:type="dxa"/>
+            <w:tcW w:w="1500" w:type="dxa"/>
             <w:tcBorders>
               <w:top w:val="single" w:sz="4" w:space="0" w:color="B7C4BB"/>
               <w:left w:val="single" w:sz="4" w:space="0" w:color="B7C4BB"/>
@@ -21419,13 +21420,13 @@
                 <w:sz w:val="18"/>
                 <w:szCs w:val="18"/>
               </w:rPr>
-              <w:t>Evidence</w:t>
-            </w:r>
-          </w:p>
-        </w:tc>
-        <w:tc>
-          <w:tcPr>
-            <w:tcW w:w="1801" w:type="dxa"/>
+              <w:t>Model type</w:t>
+            </w:r>
+          </w:p>
+        </w:tc>
+        <w:tc>
+          <w:tcPr>
+            <w:tcW w:w="2400" w:type="dxa"/>
             <w:tcBorders>
               <w:top w:val="single" w:sz="4" w:space="0" w:color="B7C4BB"/>
               <w:left w:val="single" w:sz="4" w:space="0" w:color="B7C4BB"/>
@@ -21448,13 +21449,42 @@
                 <w:sz w:val="18"/>
                 <w:szCs w:val="18"/>
               </w:rPr>
+              <w:t>Evidence</w:t>
+            </w:r>
+          </w:p>
+        </w:tc>
+        <w:tc>
+          <w:tcPr>
+            <w:tcW w:w="1498" w:type="dxa"/>
+            <w:tcBorders>
+              <w:top w:val="single" w:sz="4" w:space="0" w:color="B7C4BB"/>
+              <w:left w:val="single" w:sz="4" w:space="0" w:color="B7C4BB"/>
+              <w:bottom w:val="single" w:sz="4" w:space="0" w:color="B7C4BB"/>
+              <w:right w:val="single" w:sz="4" w:space="0" w:color="B7C4BB"/>
+            </w:tcBorders>
+            <w:shd w:color="auto" w:fill="1F5135" w:val="clear"/>
+          </w:tcPr>
+          <w:p>
+            <w:pPr>
+              <w:pStyle w:val="Normal"/>
+              <w:spacing w:lineRule="exact" w:line="252" w:before="0" w:after="0"/>
+              <w:rPr/>
+            </w:pPr>
+            <w:r>
+              <w:rPr>
+                <w:b/>
+                <w:bCs/>
+                <w:color w:val="FFFFFF"/>
+                <w:sz w:val="18"/>
+                <w:szCs w:val="18"/>
+              </w:rPr>
               <w:t>Investment potential</w:t>
             </w:r>
           </w:p>
         </w:tc>
         <w:tc>
           <w:tcPr>
-            <w:tcW w:w="2625" w:type="dxa"/>
+            <w:tcW w:w="2028" w:type="dxa"/>
             <w:tcBorders>
               <w:top w:val="single" w:sz="4" w:space="0" w:color="B7C4BB"/>
               <w:left w:val="single" w:sz="4" w:space="0" w:color="B7C4BB"/>
@@ -21488,7 +21518,7 @@
         </w:trPr>
         <w:tc>
           <w:tcPr>
-            <w:tcW w:w="1899" w:type="dxa"/>
+            <w:tcW w:w="1600" w:type="dxa"/>
             <w:tcBorders>
               <w:top w:val="single" w:sz="4" w:space="0" w:color="B7C4BB"/>
               <w:left w:val="single" w:sz="4" w:space="0" w:color="B7C4BB"/>
@@ -21513,7 +21543,32 @@
         </w:tc>
         <w:tc>
           <w:tcPr>
-            <w:tcW w:w="2700" w:type="dxa"/>
+            <w:tcW w:w="1500" w:type="dxa"/>
+            <w:tcBorders>
+              <w:top w:val="single" w:sz="4" w:space="0" w:color="B7C4BB"/>
+              <w:left w:val="single" w:sz="4" w:space="0" w:color="B7C4BB"/>
+              <w:bottom w:val="single" w:sz="4" w:space="0" w:color="B7C4BB"/>
+              <w:right w:val="single" w:sz="4" w:space="0" w:color="B7C4BB"/>
+            </w:tcBorders>
+          </w:tcPr>
+          <w:p>
+            <w:pPr>
+              <w:pStyle w:val="Normal"/>
+              <w:spacing w:lineRule="exact" w:line="252" w:before="0" w:after="0"/>
+              <w:rPr/>
+            </w:pPr>
+            <w:r>
+              <w:rPr>
+                <w:sz w:val="18"/>
+                <w:szCs w:val="18"/>
+              </w:rPr>
+              <w:t>Women-led producer and processing cooperative (nature-positive products; node B)</w:t>
+            </w:r>
+          </w:p>
+        </w:tc>
+        <w:tc>
+          <w:tcPr>
+            <w:tcW w:w="2400" w:type="dxa"/>
             <w:tcBorders>
               <w:top w:val="single" w:sz="4" w:space="0" w:color="B7C4BB"/>
               <w:left w:val="single" w:sz="4" w:space="0" w:color="B7C4BB"/>
@@ -21538,7 +21593,7 @@
         </w:tc>
         <w:tc>
           <w:tcPr>
-            <w:tcW w:w="1801" w:type="dxa"/>
+            <w:tcW w:w="1498" w:type="dxa"/>
             <w:tcBorders>
               <w:top w:val="single" w:sz="4" w:space="0" w:color="B7C4BB"/>
               <w:left w:val="single" w:sz="4" w:space="0" w:color="B7C4BB"/>
@@ -21563,7 +21618,7 @@
         </w:tc>
         <w:tc>
           <w:tcPr>
-            <w:tcW w:w="2625" w:type="dxa"/>
+            <w:tcW w:w="2028" w:type="dxa"/>
             <w:tcBorders>
               <w:top w:val="single" w:sz="4" w:space="0" w:color="B7C4BB"/>
               <w:left w:val="single" w:sz="4" w:space="0" w:color="B7C4BB"/>
@@ -21593,7 +21648,7 @@
         </w:trPr>
         <w:tc>
           <w:tcPr>
-            <w:tcW w:w="1899" w:type="dxa"/>
+            <w:tcW w:w="1600" w:type="dxa"/>
             <w:tcBorders>
               <w:top w:val="single" w:sz="4" w:space="0" w:color="B7C4BB"/>
               <w:left w:val="single" w:sz="4" w:space="0" w:color="B7C4BB"/>
@@ -21618,7 +21673,32 @@
         </w:tc>
         <w:tc>
           <w:tcPr>
-            <w:tcW w:w="2700" w:type="dxa"/>
+            <w:tcW w:w="1500" w:type="dxa"/>
+            <w:tcBorders>
+              <w:top w:val="single" w:sz="4" w:space="0" w:color="B7C4BB"/>
+              <w:left w:val="single" w:sz="4" w:space="0" w:color="B7C4BB"/>
+              <w:bottom w:val="single" w:sz="4" w:space="0" w:color="B7C4BB"/>
+              <w:right w:val="single" w:sz="4" w:space="0" w:color="B7C4BB"/>
+            </w:tcBorders>
+          </w:tcPr>
+          <w:p>
+            <w:pPr>
+              <w:pStyle w:val="Normal"/>
+              <w:spacing w:lineRule="exact" w:line="252" w:before="0" w:after="0"/>
+              <w:rPr/>
+            </w:pPr>
+            <w:r>
+              <w:rPr>
+                <w:sz w:val="18"/>
+                <w:szCs w:val="18"/>
+              </w:rPr>
+              <w:t>Artisan aggregation hub (crafts; node B)</w:t>
+            </w:r>
+          </w:p>
+        </w:tc>
+        <w:tc>
+          <w:tcPr>
+            <w:tcW w:w="2400" w:type="dxa"/>
             <w:tcBorders>
               <w:top w:val="single" w:sz="4" w:space="0" w:color="B7C4BB"/>
               <w:left w:val="single" w:sz="4" w:space="0" w:color="B7C4BB"/>
@@ -21643,7 +21723,7 @@
         </w:tc>
         <w:tc>
           <w:tcPr>
-            <w:tcW w:w="1801" w:type="dxa"/>
+            <w:tcW w:w="1498" w:type="dxa"/>
             <w:tcBorders>
               <w:top w:val="single" w:sz="4" w:space="0" w:color="B7C4BB"/>
               <w:left w:val="single" w:sz="4" w:space="0" w:color="B7C4BB"/>
@@ -21668,7 +21748,7 @@
         </w:tc>
         <w:tc>
           <w:tcPr>
-            <w:tcW w:w="2625" w:type="dxa"/>
+            <w:tcW w:w="2028" w:type="dxa"/>
             <w:tcBorders>
               <w:top w:val="single" w:sz="4" w:space="0" w:color="B7C4BB"/>
               <w:left w:val="single" w:sz="4" w:space="0" w:color="B7C4BB"/>
@@ -21698,7 +21778,7 @@
         </w:trPr>
         <w:tc>
           <w:tcPr>
-            <w:tcW w:w="1899" w:type="dxa"/>
+            <w:tcW w:w="1600" w:type="dxa"/>
             <w:tcBorders>
               <w:top w:val="single" w:sz="4" w:space="0" w:color="B7C4BB"/>
               <w:left w:val="single" w:sz="4" w:space="0" w:color="B7C4BB"/>
@@ -21723,7 +21803,32 @@
         </w:tc>
         <w:tc>
           <w:tcPr>
-            <w:tcW w:w="2700" w:type="dxa"/>
+            <w:tcW w:w="1500" w:type="dxa"/>
+            <w:tcBorders>
+              <w:top w:val="single" w:sz="4" w:space="0" w:color="B7C4BB"/>
+              <w:left w:val="single" w:sz="4" w:space="0" w:color="B7C4BB"/>
+              <w:bottom w:val="single" w:sz="4" w:space="0" w:color="B7C4BB"/>
+              <w:right w:val="single" w:sz="4" w:space="0" w:color="B7C4BB"/>
+            </w:tcBorders>
+          </w:tcPr>
+          <w:p>
+            <w:pPr>
+              <w:pStyle w:val="Normal"/>
+              <w:spacing w:lineRule="exact" w:line="252" w:before="0" w:after="0"/>
+              <w:rPr/>
+            </w:pPr>
+            <w:r>
+              <w:rPr>
+                <w:sz w:val="18"/>
+                <w:szCs w:val="18"/>
+              </w:rPr>
+              <w:t>Community conservation enterprise cluster (nature-positive products; nodes A-B)</w:t>
+            </w:r>
+          </w:p>
+        </w:tc>
+        <w:tc>
+          <w:tcPr>
+            <w:tcW w:w="2400" w:type="dxa"/>
             <w:tcBorders>
               <w:top w:val="single" w:sz="4" w:space="0" w:color="B7C4BB"/>
               <w:left w:val="single" w:sz="4" w:space="0" w:color="B7C4BB"/>
@@ -21748,7 +21853,7 @@
         </w:tc>
         <w:tc>
           <w:tcPr>
-            <w:tcW w:w="1801" w:type="dxa"/>
+            <w:tcW w:w="1498" w:type="dxa"/>
             <w:tcBorders>
               <w:top w:val="single" w:sz="4" w:space="0" w:color="B7C4BB"/>
               <w:left w:val="single" w:sz="4" w:space="0" w:color="B7C4BB"/>
@@ -21773,7 +21878,7 @@
         </w:tc>
         <w:tc>
           <w:tcPr>
-            <w:tcW w:w="2625" w:type="dxa"/>
+            <w:tcW w:w="2028" w:type="dxa"/>
             <w:tcBorders>
               <w:top w:val="single" w:sz="4" w:space="0" w:color="B7C4BB"/>
               <w:left w:val="single" w:sz="4" w:space="0" w:color="B7C4BB"/>
@@ -21803,7 +21908,7 @@
         </w:trPr>
         <w:tc>
           <w:tcPr>
-            <w:tcW w:w="1899" w:type="dxa"/>
+            <w:tcW w:w="1600" w:type="dxa"/>
             <w:tcBorders>
               <w:top w:val="single" w:sz="4" w:space="0" w:color="B7C4BB"/>
               <w:left w:val="single" w:sz="4" w:space="0" w:color="B7C4BB"/>
@@ -21828,7 +21933,32 @@
         </w:tc>
         <w:tc>
           <w:tcPr>
-            <w:tcW w:w="2700" w:type="dxa"/>
+            <w:tcW w:w="1500" w:type="dxa"/>
+            <w:tcBorders>
+              <w:top w:val="single" w:sz="4" w:space="0" w:color="B7C4BB"/>
+              <w:left w:val="single" w:sz="4" w:space="0" w:color="B7C4BB"/>
+              <w:bottom w:val="single" w:sz="4" w:space="0" w:color="B7C4BB"/>
+              <w:right w:val="single" w:sz="4" w:space="0" w:color="B7C4BB"/>
+            </w:tcBorders>
+          </w:tcPr>
+          <w:p>
+            <w:pPr>
+              <w:pStyle w:val="Normal"/>
+              <w:spacing w:lineRule="exact" w:line="252" w:before="0" w:after="0"/>
+              <w:rPr/>
+            </w:pPr>
+            <w:r>
+              <w:rPr>
+                <w:sz w:val="18"/>
+                <w:szCs w:val="18"/>
+              </w:rPr>
+              <w:t>Community-trust social enterprise (waste and circular economy; nodes B, E)</w:t>
+            </w:r>
+          </w:p>
+        </w:tc>
+        <w:tc>
+          <w:tcPr>
+            <w:tcW w:w="2400" w:type="dxa"/>
             <w:tcBorders>
               <w:top w:val="single" w:sz="4" w:space="0" w:color="B7C4BB"/>
               <w:left w:val="single" w:sz="4" w:space="0" w:color="B7C4BB"/>
@@ -21853,7 +21983,7 @@
         </w:tc>
         <w:tc>
           <w:tcPr>
-            <w:tcW w:w="1801" w:type="dxa"/>
+            <w:tcW w:w="1498" w:type="dxa"/>
             <w:tcBorders>
               <w:top w:val="single" w:sz="4" w:space="0" w:color="B7C4BB"/>
               <w:left w:val="single" w:sz="4" w:space="0" w:color="B7C4BB"/>
@@ -21878,7 +22008,7 @@
         </w:tc>
         <w:tc>
           <w:tcPr>
-            <w:tcW w:w="2625" w:type="dxa"/>
+            <w:tcW w:w="2028" w:type="dxa"/>
             <w:tcBorders>
               <w:top w:val="single" w:sz="4" w:space="0" w:color="B7C4BB"/>
               <w:left w:val="single" w:sz="4" w:space="0" w:color="B7C4BB"/>
@@ -21908,7 +22038,7 @@
         </w:trPr>
         <w:tc>
           <w:tcPr>
-            <w:tcW w:w="1899" w:type="dxa"/>
+            <w:tcW w:w="1600" w:type="dxa"/>
             <w:tcBorders>
               <w:top w:val="single" w:sz="4" w:space="0" w:color="B7C4BB"/>
               <w:left w:val="single" w:sz="4" w:space="0" w:color="B7C4BB"/>
@@ -21933,7 +22063,32 @@
         </w:tc>
         <w:tc>
           <w:tcPr>
-            <w:tcW w:w="2700" w:type="dxa"/>
+            <w:tcW w:w="1500" w:type="dxa"/>
+            <w:tcBorders>
+              <w:top w:val="single" w:sz="4" w:space="0" w:color="B7C4BB"/>
+              <w:left w:val="single" w:sz="4" w:space="0" w:color="B7C4BB"/>
+              <w:bottom w:val="single" w:sz="4" w:space="0" w:color="B7C4BB"/>
+              <w:right w:val="single" w:sz="4" w:space="0" w:color="B7C4BB"/>
+            </w:tcBorders>
+          </w:tcPr>
+          <w:p>
+            <w:pPr>
+              <w:pStyle w:val="Normal"/>
+              <w:spacing w:lineRule="exact" w:line="252" w:before="0" w:after="0"/>
+              <w:rPr/>
+            </w:pPr>
+            <w:r>
+              <w:rPr>
+                <w:sz w:val="18"/>
+                <w:szCs w:val="18"/>
+              </w:rPr>
+              <w:t>Conservancy-linked benefit-sharing enterprise (honey; nodes A, E)</w:t>
+            </w:r>
+          </w:p>
+        </w:tc>
+        <w:tc>
+          <w:tcPr>
+            <w:tcW w:w="2400" w:type="dxa"/>
             <w:tcBorders>
               <w:top w:val="single" w:sz="4" w:space="0" w:color="B7C4BB"/>
               <w:left w:val="single" w:sz="4" w:space="0" w:color="B7C4BB"/>
@@ -21958,7 +22113,7 @@
         </w:tc>
         <w:tc>
           <w:tcPr>
-            <w:tcW w:w="1801" w:type="dxa"/>
+            <w:tcW w:w="1498" w:type="dxa"/>
             <w:tcBorders>
               <w:top w:val="single" w:sz="4" w:space="0" w:color="B7C4BB"/>
               <w:left w:val="single" w:sz="4" w:space="0" w:color="B7C4BB"/>
@@ -21983,7 +22138,7 @@
         </w:tc>
         <w:tc>
           <w:tcPr>
-            <w:tcW w:w="2625" w:type="dxa"/>
+            <w:tcW w:w="2028" w:type="dxa"/>
             <w:tcBorders>
               <w:top w:val="single" w:sz="4" w:space="0" w:color="B7C4BB"/>
               <w:left w:val="single" w:sz="4" w:space="0" w:color="B7C4BB"/>
@@ -22013,7 +22168,7 @@
         </w:trPr>
         <w:tc>
           <w:tcPr>
-            <w:tcW w:w="1899" w:type="dxa"/>
+            <w:tcW w:w="1600" w:type="dxa"/>
             <w:tcBorders>
               <w:top w:val="single" w:sz="4" w:space="0" w:color="B7C4BB"/>
               <w:left w:val="single" w:sz="4" w:space="0" w:color="B7C4BB"/>
@@ -22038,7 +22193,32 @@
         </w:tc>
         <w:tc>
           <w:tcPr>
-            <w:tcW w:w="2700" w:type="dxa"/>
+            <w:tcW w:w="1500" w:type="dxa"/>
+            <w:tcBorders>
+              <w:top w:val="single" w:sz="4" w:space="0" w:color="B7C4BB"/>
+              <w:left w:val="single" w:sz="4" w:space="0" w:color="B7C4BB"/>
+              <w:bottom w:val="single" w:sz="4" w:space="0" w:color="B7C4BB"/>
+              <w:right w:val="single" w:sz="4" w:space="0" w:color="B7C4BB"/>
+            </w:tcBorders>
+          </w:tcPr>
+          <w:p>
+            <w:pPr>
+              <w:pStyle w:val="Normal"/>
+              <w:spacing w:lineRule="exact" w:line="252" w:before="0" w:after="0"/>
+              <w:rPr/>
+            </w:pPr>
+            <w:r>
+              <w:rPr>
+                <w:sz w:val="18"/>
+                <w:szCs w:val="18"/>
+              </w:rPr>
+              <w:t>Producer cooperative supplying anchors under contract (food; nodes A-C)</w:t>
+            </w:r>
+          </w:p>
+        </w:tc>
+        <w:tc>
+          <w:tcPr>
+            <w:tcW w:w="2400" w:type="dxa"/>
             <w:tcBorders>
               <w:top w:val="single" w:sz="4" w:space="0" w:color="B7C4BB"/>
               <w:left w:val="single" w:sz="4" w:space="0" w:color="B7C4BB"/>
@@ -22063,7 +22243,7 @@
         </w:tc>
         <w:tc>
           <w:tcPr>
-            <w:tcW w:w="1801" w:type="dxa"/>
+            <w:tcW w:w="1498" w:type="dxa"/>
             <w:tcBorders>
               <w:top w:val="single" w:sz="4" w:space="0" w:color="B7C4BB"/>
               <w:left w:val="single" w:sz="4" w:space="0" w:color="B7C4BB"/>
@@ -22088,7 +22268,7 @@
         </w:tc>
         <w:tc>
           <w:tcPr>
-            <w:tcW w:w="2625" w:type="dxa"/>
+            <w:tcW w:w="2028" w:type="dxa"/>
             <w:tcBorders>
               <w:top w:val="single" w:sz="4" w:space="0" w:color="B7C4BB"/>
               <w:left w:val="single" w:sz="4" w:space="0" w:color="B7C4BB"/>
@@ -22118,7 +22298,7 @@
         </w:trPr>
         <w:tc>
           <w:tcPr>
-            <w:tcW w:w="1899" w:type="dxa"/>
+            <w:tcW w:w="1600" w:type="dxa"/>
             <w:tcBorders>
               <w:top w:val="single" w:sz="4" w:space="0" w:color="B7C4BB"/>
               <w:left w:val="single" w:sz="4" w:space="0" w:color="B7C4BB"/>
@@ -22143,7 +22323,32 @@
         </w:tc>
         <w:tc>
           <w:tcPr>
-            <w:tcW w:w="2700" w:type="dxa"/>
+            <w:tcW w:w="1500" w:type="dxa"/>
+            <w:tcBorders>
+              <w:top w:val="single" w:sz="4" w:space="0" w:color="B7C4BB"/>
+              <w:left w:val="single" w:sz="4" w:space="0" w:color="B7C4BB"/>
+              <w:bottom w:val="single" w:sz="4" w:space="0" w:color="B7C4BB"/>
+              <w:right w:val="single" w:sz="4" w:space="0" w:color="B7C4BB"/>
+            </w:tcBorders>
+          </w:tcPr>
+          <w:p>
+            <w:pPr>
+              <w:pStyle w:val="Normal"/>
+              <w:spacing w:lineRule="exact" w:line="252" w:before="0" w:after="0"/>
+              <w:rPr/>
+            </w:pPr>
+            <w:r>
+              <w:rPr>
+                <w:sz w:val="18"/>
+                <w:szCs w:val="18"/>
+              </w:rPr>
+              <w:t>Anchor-led supplier development programme (several chains; node C)</w:t>
+            </w:r>
+          </w:p>
+        </w:tc>
+        <w:tc>
+          <w:tcPr>
+            <w:tcW w:w="2400" w:type="dxa"/>
             <w:tcBorders>
               <w:top w:val="single" w:sz="4" w:space="0" w:color="B7C4BB"/>
               <w:left w:val="single" w:sz="4" w:space="0" w:color="B7C4BB"/>
@@ -22168,7 +22373,7 @@
         </w:tc>
         <w:tc>
           <w:tcPr>
-            <w:tcW w:w="1801" w:type="dxa"/>
+            <w:tcW w:w="1498" w:type="dxa"/>
             <w:tcBorders>
               <w:top w:val="single" w:sz="4" w:space="0" w:color="B7C4BB"/>
               <w:left w:val="single" w:sz="4" w:space="0" w:color="B7C4BB"/>
@@ -22193,7 +22398,7 @@
         </w:tc>
         <w:tc>
           <w:tcPr>
-            <w:tcW w:w="2625" w:type="dxa"/>
+            <w:tcW w:w="2028" w:type="dxa"/>
             <w:tcBorders>
               <w:top w:val="single" w:sz="4" w:space="0" w:color="B7C4BB"/>
               <w:left w:val="single" w:sz="4" w:space="0" w:color="B7C4BB"/>
@@ -22223,7 +22428,7 @@
         </w:trPr>
         <w:tc>
           <w:tcPr>
-            <w:tcW w:w="1899" w:type="dxa"/>
+            <w:tcW w:w="1600" w:type="dxa"/>
             <w:tcBorders>
               <w:top w:val="single" w:sz="4" w:space="0" w:color="B7C4BB"/>
               <w:left w:val="single" w:sz="4" w:space="0" w:color="B7C4BB"/>
@@ -22248,7 +22453,32 @@
         </w:tc>
         <w:tc>
           <w:tcPr>
-            <w:tcW w:w="2700" w:type="dxa"/>
+            <w:tcW w:w="1500" w:type="dxa"/>
+            <w:tcBorders>
+              <w:top w:val="single" w:sz="4" w:space="0" w:color="B7C4BB"/>
+              <w:left w:val="single" w:sz="4" w:space="0" w:color="B7C4BB"/>
+              <w:bottom w:val="single" w:sz="4" w:space="0" w:color="B7C4BB"/>
+              <w:right w:val="single" w:sz="4" w:space="0" w:color="B7C4BB"/>
+            </w:tcBorders>
+          </w:tcPr>
+          <w:p>
+            <w:pPr>
+              <w:pStyle w:val="Normal"/>
+              <w:spacing w:lineRule="exact" w:line="252" w:before="0" w:after="0"/>
+              <w:rPr/>
+            </w:pPr>
+            <w:r>
+              <w:rPr>
+                <w:sz w:val="18"/>
+                <w:szCs w:val="18"/>
+              </w:rPr>
+              <w:t>Owner-operator service micro-enterprise (guiding and transport; node D)</w:t>
+            </w:r>
+          </w:p>
+        </w:tc>
+        <w:tc>
+          <w:tcPr>
+            <w:tcW w:w="2400" w:type="dxa"/>
             <w:tcBorders>
               <w:top w:val="single" w:sz="4" w:space="0" w:color="B7C4BB"/>
               <w:left w:val="single" w:sz="4" w:space="0" w:color="B7C4BB"/>
@@ -22273,7 +22503,7 @@
         </w:tc>
         <w:tc>
           <w:tcPr>
-            <w:tcW w:w="1801" w:type="dxa"/>
+            <w:tcW w:w="1498" w:type="dxa"/>
             <w:tcBorders>
               <w:top w:val="single" w:sz="4" w:space="0" w:color="B7C4BB"/>
               <w:left w:val="single" w:sz="4" w:space="0" w:color="B7C4BB"/>
@@ -22298,7 +22528,7 @@
         </w:tc>
         <w:tc>
           <w:tcPr>
-            <w:tcW w:w="2625" w:type="dxa"/>
+            <w:tcW w:w="2028" w:type="dxa"/>
             <w:tcBorders>
               <w:top w:val="single" w:sz="4" w:space="0" w:color="B7C4BB"/>
               <w:left w:val="single" w:sz="4" w:space="0" w:color="B7C4BB"/>
@@ -22353,7 +22583,7 @@
         <w:spacing w:before="0" w:after="240"/>
         <w:rPr/>
       </w:pPr>
-      <w:bookmarkStart w:id="36" w:name="__RefHeading___Toc2975_2470420549"/>
+      <w:bookmarkStart w:id="36" w:name="__RefHeading___Toc3002_616069264"/>
       <w:bookmarkEnd w:id="36"/>
       <w:r>
         <w:rPr/>
@@ -22365,7 +22595,7 @@
         <w:pStyle w:val="Heading2"/>
         <w:rPr/>
       </w:pPr>
-      <w:bookmarkStart w:id="37" w:name="__RefHeading___Toc2977_2470420549"/>
+      <w:bookmarkStart w:id="37" w:name="__RefHeading___Toc3004_616069264"/>
       <w:bookmarkEnd w:id="37"/>
       <w:r>
         <w:rPr/>
@@ -22986,7 +23216,7 @@
         <w:pStyle w:val="Heading2"/>
         <w:rPr/>
       </w:pPr>
-      <w:bookmarkStart w:id="38" w:name="__RefHeading___Toc2979_2470420549"/>
+      <w:bookmarkStart w:id="38" w:name="__RefHeading___Toc3006_616069264"/>
       <w:bookmarkEnd w:id="38"/>
       <w:r>
         <w:rPr/>
@@ -23166,7 +23396,7 @@
         <w:pStyle w:val="Heading2"/>
         <w:rPr/>
       </w:pPr>
-      <w:bookmarkStart w:id="39" w:name="__RefHeading___Toc2981_2470420549"/>
+      <w:bookmarkStart w:id="39" w:name="__RefHeading___Toc3008_616069264"/>
       <w:bookmarkEnd w:id="39"/>
       <w:r>
         <w:rPr/>
@@ -23304,7 +23534,7 @@
         <w:pStyle w:val="Heading2"/>
         <w:rPr/>
       </w:pPr>
-      <w:bookmarkStart w:id="40" w:name="__RefHeading___Toc2983_2470420549"/>
+      <w:bookmarkStart w:id="40" w:name="__RefHeading___Toc3010_616069264"/>
       <w:bookmarkEnd w:id="40"/>
       <w:r>
         <w:rPr/>
@@ -23820,7 +24050,7 @@
         <w:pStyle w:val="Heading2"/>
         <w:rPr/>
       </w:pPr>
-      <w:bookmarkStart w:id="41" w:name="__RefHeading___Toc2985_2470420549"/>
+      <w:bookmarkStart w:id="41" w:name="__RefHeading___Toc3012_616069264"/>
       <w:bookmarkEnd w:id="41"/>
       <w:r>
         <w:rPr/>
@@ -24707,7 +24937,7 @@
         <w:pStyle w:val="Heading2"/>
         <w:rPr/>
       </w:pPr>
-      <w:bookmarkStart w:id="42" w:name="__RefHeading___Toc2987_2470420549"/>
+      <w:bookmarkStart w:id="42" w:name="__RefHeading___Toc3014_616069264"/>
       <w:bookmarkEnd w:id="42"/>
       <w:r>
         <w:rPr/>
@@ -24857,7 +25087,7 @@
         <w:pStyle w:val="Heading2"/>
         <w:rPr/>
       </w:pPr>
-      <w:bookmarkStart w:id="43" w:name="__RefHeading___Toc2989_2470420549"/>
+      <w:bookmarkStart w:id="43" w:name="__RefHeading___Toc3016_616069264"/>
       <w:bookmarkEnd w:id="43"/>
       <w:r>
         <w:rPr/>
@@ -24985,7 +25215,7 @@
         <w:pStyle w:val="Heading2"/>
         <w:rPr/>
       </w:pPr>
-      <w:bookmarkStart w:id="44" w:name="__RefHeading___Toc2991_2470420549"/>
+      <w:bookmarkStart w:id="44" w:name="__RefHeading___Toc3018_616069264"/>
       <w:bookmarkEnd w:id="44"/>
       <w:r>
         <w:rPr/>
@@ -25092,7 +25322,7 @@
         <w:pStyle w:val="Heading2"/>
         <w:rPr/>
       </w:pPr>
-      <w:bookmarkStart w:id="45" w:name="__RefHeading___Toc2993_2470420549"/>
+      <w:bookmarkStart w:id="45" w:name="__RefHeading___Toc3020_616069264"/>
       <w:bookmarkEnd w:id="45"/>
       <w:r>
         <w:rPr/>
@@ -25234,7 +25464,7 @@
         <w:spacing w:before="0" w:after="240"/>
         <w:rPr/>
       </w:pPr>
-      <w:bookmarkStart w:id="46" w:name="__RefHeading___Toc2995_2470420549"/>
+      <w:bookmarkStart w:id="46" w:name="__RefHeading___Toc3022_616069264"/>
       <w:bookmarkEnd w:id="46"/>
       <w:r>
         <w:rPr/>
@@ -26358,7 +26588,7 @@
         <w:spacing w:before="0" w:after="240"/>
         <w:rPr/>
       </w:pPr>
-      <w:bookmarkStart w:id="47" w:name="__RefHeading___Toc2997_2470420549"/>
+      <w:bookmarkStart w:id="47" w:name="__RefHeading___Toc3024_616069264"/>
       <w:bookmarkEnd w:id="47"/>
       <w:r>
         <w:rPr/>
@@ -26998,7 +27228,7 @@
         <w:spacing w:before="0" w:after="240"/>
         <w:rPr/>
       </w:pPr>
-      <w:bookmarkStart w:id="48" w:name="__RefHeading___Toc2999_2470420549"/>
+      <w:bookmarkStart w:id="48" w:name="__RefHeading___Toc3026_616069264"/>
       <w:bookmarkEnd w:id="48"/>
       <w:r>
         <w:rPr/>

</xml_diff>

<commit_message>
Add narrative edition of the investment readiness assessment and verify references
- Every table now has a prose version; build_ira.js --narrative produces an
  edition with no tables (KAZA_MSME_Investment_Readiness_Assessment_Narrative.docx)
- References checked against their sources; figures that could not be
  confirmed were corrected, replaced with confirmed figures or removed
- Table edition rebuilt with the same corrections

Co-Authored-By: Claude Opus 5.5 <noreply@anthropic.com>
Claude-Session: https://claude.ai/code/session_01MNFGowooBRn67hG766h929
</commit_message>
<xml_diff>
--- a/KAZA_MSME_Investment_Readiness_Assessment.docx
+++ b/KAZA_MSME_Investment_Readiness_Assessment.docx
@@ -171,7 +171,7 @@
             </w:rPr>
             <w:fldChar w:fldCharType="separate"/>
           </w:r>
-          <w:hyperlink w:anchor="__RefHeading___Toc2930_616069264">
+          <w:hyperlink w:anchor="__RefHeading___Toc2943_3770744645">
             <w:r>
               <w:rPr>
                 <w:rStyle w:val="IndexLink"/>
@@ -191,7 +191,7 @@
             </w:tabs>
             <w:rPr/>
           </w:pPr>
-          <w:hyperlink w:anchor="__RefHeading___Toc2932_616069264">
+          <w:hyperlink w:anchor="__RefHeading___Toc2945_3770744645">
             <w:r>
               <w:rPr>
                 <w:rStyle w:val="IndexLink"/>
@@ -211,7 +211,7 @@
             </w:tabs>
             <w:rPr/>
           </w:pPr>
-          <w:hyperlink w:anchor="__RefHeading___Toc2934_616069264">
+          <w:hyperlink w:anchor="__RefHeading___Toc2947_3770744645">
             <w:r>
               <w:rPr>
                 <w:rStyle w:val="IndexLink"/>
@@ -231,7 +231,7 @@
             </w:tabs>
             <w:rPr/>
           </w:pPr>
-          <w:hyperlink w:anchor="__RefHeading___Toc2936_616069264">
+          <w:hyperlink w:anchor="__RefHeading___Toc2949_3770744645">
             <w:r>
               <w:rPr>
                 <w:rStyle w:val="IndexLink"/>
@@ -251,7 +251,7 @@
             </w:tabs>
             <w:rPr/>
           </w:pPr>
-          <w:hyperlink w:anchor="__RefHeading___Toc2938_616069264">
+          <w:hyperlink w:anchor="__RefHeading___Toc2951_3770744645">
             <w:r>
               <w:rPr>
                 <w:rStyle w:val="IndexLink"/>
@@ -271,7 +271,7 @@
             </w:tabs>
             <w:rPr/>
           </w:pPr>
-          <w:hyperlink w:anchor="__RefHeading___Toc2940_616069264">
+          <w:hyperlink w:anchor="__RefHeading___Toc2953_3770744645">
             <w:r>
               <w:rPr>
                 <w:rStyle w:val="IndexLink"/>
@@ -291,7 +291,7 @@
             </w:tabs>
             <w:rPr/>
           </w:pPr>
-          <w:hyperlink w:anchor="__RefHeading___Toc2942_616069264">
+          <w:hyperlink w:anchor="__RefHeading___Toc2955_3770744645">
             <w:r>
               <w:rPr>
                 <w:rStyle w:val="IndexLink"/>
@@ -311,7 +311,7 @@
             </w:tabs>
             <w:rPr/>
           </w:pPr>
-          <w:hyperlink w:anchor="__RefHeading___Toc2944_616069264">
+          <w:hyperlink w:anchor="__RefHeading___Toc2957_3770744645">
             <w:r>
               <w:rPr>
                 <w:rStyle w:val="IndexLink"/>
@@ -331,7 +331,7 @@
             </w:tabs>
             <w:rPr/>
           </w:pPr>
-          <w:hyperlink w:anchor="__RefHeading___Toc2946_616069264">
+          <w:hyperlink w:anchor="__RefHeading___Toc2959_3770744645">
             <w:r>
               <w:rPr>
                 <w:rStyle w:val="IndexLink"/>
@@ -351,7 +351,7 @@
             </w:tabs>
             <w:rPr/>
           </w:pPr>
-          <w:hyperlink w:anchor="__RefHeading___Toc2948_616069264">
+          <w:hyperlink w:anchor="__RefHeading___Toc2961_3770744645">
             <w:r>
               <w:rPr>
                 <w:rStyle w:val="IndexLink"/>
@@ -371,7 +371,7 @@
             </w:tabs>
             <w:rPr/>
           </w:pPr>
-          <w:hyperlink w:anchor="__RefHeading___Toc2950_616069264">
+          <w:hyperlink w:anchor="__RefHeading___Toc2963_3770744645">
             <w:r>
               <w:rPr>
                 <w:rStyle w:val="IndexLink"/>
@@ -391,7 +391,7 @@
             </w:tabs>
             <w:rPr/>
           </w:pPr>
-          <w:hyperlink w:anchor="__RefHeading___Toc2952_616069264">
+          <w:hyperlink w:anchor="__RefHeading___Toc2965_3770744645">
             <w:r>
               <w:rPr>
                 <w:rStyle w:val="IndexLink"/>
@@ -411,7 +411,7 @@
             </w:tabs>
             <w:rPr/>
           </w:pPr>
-          <w:hyperlink w:anchor="__RefHeading___Toc2954_616069264">
+          <w:hyperlink w:anchor="__RefHeading___Toc2967_3770744645">
             <w:r>
               <w:rPr>
                 <w:rStyle w:val="IndexLink"/>
@@ -431,7 +431,7 @@
             </w:tabs>
             <w:rPr/>
           </w:pPr>
-          <w:hyperlink w:anchor="__RefHeading___Toc2956_616069264">
+          <w:hyperlink w:anchor="__RefHeading___Toc2969_3770744645">
             <w:r>
               <w:rPr>
                 <w:rStyle w:val="IndexLink"/>
@@ -451,7 +451,7 @@
             </w:tabs>
             <w:rPr/>
           </w:pPr>
-          <w:hyperlink w:anchor="__RefHeading___Toc2958_616069264">
+          <w:hyperlink w:anchor="__RefHeading___Toc2971_3770744645">
             <w:r>
               <w:rPr>
                 <w:rStyle w:val="IndexLink"/>
@@ -471,7 +471,7 @@
             </w:tabs>
             <w:rPr/>
           </w:pPr>
-          <w:hyperlink w:anchor="__RefHeading___Toc2960_616069264">
+          <w:hyperlink w:anchor="__RefHeading___Toc2973_3770744645">
             <w:r>
               <w:rPr>
                 <w:rStyle w:val="IndexLink"/>
@@ -491,7 +491,7 @@
             </w:tabs>
             <w:rPr/>
           </w:pPr>
-          <w:hyperlink w:anchor="__RefHeading___Toc2962_616069264">
+          <w:hyperlink w:anchor="__RefHeading___Toc2975_3770744645">
             <w:r>
               <w:rPr>
                 <w:rStyle w:val="IndexLink"/>
@@ -511,7 +511,7 @@
             </w:tabs>
             <w:rPr/>
           </w:pPr>
-          <w:hyperlink w:anchor="__RefHeading___Toc2964_616069264">
+          <w:hyperlink w:anchor="__RefHeading___Toc2977_3770744645">
             <w:r>
               <w:rPr>
                 <w:rStyle w:val="IndexLink"/>
@@ -531,7 +531,7 @@
             </w:tabs>
             <w:rPr/>
           </w:pPr>
-          <w:hyperlink w:anchor="__RefHeading___Toc2966_616069264">
+          <w:hyperlink w:anchor="__RefHeading___Toc2979_3770744645">
             <w:r>
               <w:rPr>
                 <w:rStyle w:val="IndexLink"/>
@@ -551,7 +551,7 @@
             </w:tabs>
             <w:rPr/>
           </w:pPr>
-          <w:hyperlink w:anchor="__RefHeading___Toc2968_616069264">
+          <w:hyperlink w:anchor="__RefHeading___Toc2981_3770744645">
             <w:r>
               <w:rPr>
                 <w:rStyle w:val="IndexLink"/>
@@ -571,7 +571,7 @@
             </w:tabs>
             <w:rPr/>
           </w:pPr>
-          <w:hyperlink w:anchor="__RefHeading___Toc2970_616069264">
+          <w:hyperlink w:anchor="__RefHeading___Toc2983_3770744645">
             <w:r>
               <w:rPr>
                 <w:rStyle w:val="IndexLink"/>
@@ -591,7 +591,7 @@
             </w:tabs>
             <w:rPr/>
           </w:pPr>
-          <w:hyperlink w:anchor="__RefHeading___Toc2972_616069264">
+          <w:hyperlink w:anchor="__RefHeading___Toc2985_3770744645">
             <w:r>
               <w:rPr>
                 <w:rStyle w:val="IndexLink"/>
@@ -611,7 +611,7 @@
             </w:tabs>
             <w:rPr/>
           </w:pPr>
-          <w:hyperlink w:anchor="__RefHeading___Toc2974_616069264">
+          <w:hyperlink w:anchor="__RefHeading___Toc2987_3770744645">
             <w:r>
               <w:rPr>
                 <w:rStyle w:val="IndexLink"/>
@@ -631,7 +631,7 @@
             </w:tabs>
             <w:rPr/>
           </w:pPr>
-          <w:hyperlink w:anchor="__RefHeading___Toc2976_616069264">
+          <w:hyperlink w:anchor="__RefHeading___Toc2989_3770744645">
             <w:r>
               <w:rPr>
                 <w:rStyle w:val="IndexLink"/>
@@ -651,7 +651,7 @@
             </w:tabs>
             <w:rPr/>
           </w:pPr>
-          <w:hyperlink w:anchor="__RefHeading___Toc2978_616069264">
+          <w:hyperlink w:anchor="__RefHeading___Toc2991_3770744645">
             <w:r>
               <w:rPr>
                 <w:rStyle w:val="IndexLink"/>
@@ -671,7 +671,7 @@
             </w:tabs>
             <w:rPr/>
           </w:pPr>
-          <w:hyperlink w:anchor="__RefHeading___Toc2980_616069264">
+          <w:hyperlink w:anchor="__RefHeading___Toc2993_3770744645">
             <w:r>
               <w:rPr>
                 <w:rStyle w:val="IndexLink"/>
@@ -691,14 +691,14 @@
             </w:tabs>
             <w:rPr/>
           </w:pPr>
-          <w:hyperlink w:anchor="__RefHeading___Toc2982_616069264">
+          <w:hyperlink w:anchor="__RefHeading___Toc2995_3770744645">
             <w:r>
               <w:rPr>
                 <w:rStyle w:val="IndexLink"/>
               </w:rPr>
               <w:t>7. Enabling Environment</w:t>
               <w:tab/>
-              <w:t>24</w:t>
+              <w:t>25</w:t>
             </w:r>
           </w:hyperlink>
         </w:p>
@@ -711,14 +711,14 @@
             </w:tabs>
             <w:rPr/>
           </w:pPr>
-          <w:hyperlink w:anchor="__RefHeading___Toc2984_616069264">
+          <w:hyperlink w:anchor="__RefHeading___Toc2997_3770744645">
             <w:r>
               <w:rPr>
                 <w:rStyle w:val="IndexLink"/>
               </w:rPr>
               <w:t>7.1 National and Regional Regulatory Frameworks</w:t>
               <w:tab/>
-              <w:t>24</w:t>
+              <w:t>25</w:t>
             </w:r>
           </w:hyperlink>
         </w:p>
@@ -731,14 +731,14 @@
             </w:tabs>
             <w:rPr/>
           </w:pPr>
-          <w:hyperlink w:anchor="__RefHeading___Toc2986_616069264">
+          <w:hyperlink w:anchor="__RefHeading___Toc2999_3770744645">
             <w:r>
               <w:rPr>
                 <w:rStyle w:val="IndexLink"/>
               </w:rPr>
               <w:t>7.2 Market Access and Linkages with Larger Operators</w:t>
               <w:tab/>
-              <w:t>28</w:t>
+              <w:t>29</w:t>
             </w:r>
           </w:hyperlink>
         </w:p>
@@ -751,14 +751,14 @@
             </w:tabs>
             <w:rPr/>
           </w:pPr>
-          <w:hyperlink w:anchor="__RefHeading___Toc2988_616069264">
+          <w:hyperlink w:anchor="__RefHeading___Toc3001_3770744645">
             <w:r>
               <w:rPr>
                 <w:rStyle w:val="IndexLink"/>
               </w:rPr>
               <w:t>7.3 Business Development Services</w:t>
               <w:tab/>
-              <w:t>30</w:t>
+              <w:t>31</w:t>
             </w:r>
           </w:hyperlink>
         </w:p>
@@ -771,14 +771,14 @@
             </w:tabs>
             <w:rPr/>
           </w:pPr>
-          <w:hyperlink w:anchor="__RefHeading___Toc2990_616069264">
+          <w:hyperlink w:anchor="__RefHeading___Toc3003_3770744645">
             <w:r>
               <w:rPr>
                 <w:rStyle w:val="IndexLink"/>
               </w:rPr>
               <w:t>7.4 Policy Conditions</w:t>
               <w:tab/>
-              <w:t>32</w:t>
+              <w:t>33</w:t>
             </w:r>
           </w:hyperlink>
         </w:p>
@@ -791,14 +791,14 @@
             </w:tabs>
             <w:rPr/>
           </w:pPr>
-          <w:hyperlink w:anchor="__RefHeading___Toc2992_616069264">
+          <w:hyperlink w:anchor="__RefHeading___Toc3005_3770744645">
             <w:r>
               <w:rPr>
                 <w:rStyle w:val="IndexLink"/>
               </w:rPr>
               <w:t>8. Readiness for Financial Products</w:t>
               <w:tab/>
-              <w:t>34</w:t>
+              <w:t>35</w:t>
             </w:r>
           </w:hyperlink>
         </w:p>
@@ -811,14 +811,14 @@
             </w:tabs>
             <w:rPr/>
           </w:pPr>
-          <w:hyperlink w:anchor="__RefHeading___Toc2994_616069264">
+          <w:hyperlink w:anchor="__RefHeading___Toc3007_3770744645">
             <w:r>
               <w:rPr>
                 <w:rStyle w:val="IndexLink"/>
               </w:rPr>
               <w:t>8.1 The Effect of Seasonality on Debt</w:t>
               <w:tab/>
-              <w:t>34</w:t>
+              <w:t>35</w:t>
             </w:r>
           </w:hyperlink>
         </w:p>
@@ -831,14 +831,14 @@
             </w:tabs>
             <w:rPr/>
           </w:pPr>
-          <w:hyperlink w:anchor="__RefHeading___Toc2996_616069264">
+          <w:hyperlink w:anchor="__RefHeading___Toc3009_3770744645">
             <w:r>
               <w:rPr>
                 <w:rStyle w:val="IndexLink"/>
               </w:rPr>
               <w:t>8.2 MSME Readiness by Product</w:t>
               <w:tab/>
-              <w:t>34</w:t>
+              <w:t>35</w:t>
             </w:r>
           </w:hyperlink>
         </w:p>
@@ -851,14 +851,14 @@
             </w:tabs>
             <w:rPr/>
           </w:pPr>
-          <w:hyperlink w:anchor="__RefHeading___Toc2998_616069264">
+          <w:hyperlink w:anchor="__RefHeading___Toc3011_3770744645">
             <w:r>
               <w:rPr>
                 <w:rStyle w:val="IndexLink"/>
               </w:rPr>
               <w:t>8.3 Financial Institution Readiness by Product</w:t>
               <w:tab/>
-              <w:t>35</w:t>
+              <w:t>36</w:t>
             </w:r>
           </w:hyperlink>
         </w:p>
@@ -871,14 +871,14 @@
             </w:tabs>
             <w:rPr/>
           </w:pPr>
-          <w:hyperlink w:anchor="__RefHeading___Toc3000_616069264">
+          <w:hyperlink w:anchor="__RefHeading___Toc3013_3770744645">
             <w:r>
               <w:rPr>
                 <w:rStyle w:val="IndexLink"/>
               </w:rPr>
               <w:t>9. Scalable Women- and Youth-Led Models</w:t>
               <w:tab/>
-              <w:t>37</w:t>
+              <w:t>38</w:t>
             </w:r>
           </w:hyperlink>
         </w:p>
@@ -891,14 +891,14 @@
             </w:tabs>
             <w:rPr/>
           </w:pPr>
-          <w:hyperlink w:anchor="__RefHeading___Toc3002_616069264">
+          <w:hyperlink w:anchor="__RefHeading___Toc3015_3770744645">
             <w:r>
               <w:rPr>
                 <w:rStyle w:val="IndexLink"/>
               </w:rPr>
               <w:t>10. Recommended Capacity-Building Interventions</w:t>
               <w:tab/>
-              <w:t>39</w:t>
+              <w:t>40</w:t>
             </w:r>
           </w:hyperlink>
         </w:p>
@@ -911,14 +911,14 @@
             </w:tabs>
             <w:rPr/>
           </w:pPr>
-          <w:hyperlink w:anchor="__RefHeading___Toc3004_616069264">
+          <w:hyperlink w:anchor="__RefHeading___Toc3017_3770744645">
             <w:r>
               <w:rPr>
                 <w:rStyle w:val="IndexLink"/>
               </w:rPr>
               <w:t>10.1 A Tiered Readiness Pathway</w:t>
               <w:tab/>
-              <w:t>39</w:t>
+              <w:t>40</w:t>
             </w:r>
           </w:hyperlink>
         </w:p>
@@ -931,14 +931,14 @@
             </w:tabs>
             <w:rPr/>
           </w:pPr>
-          <w:hyperlink w:anchor="__RefHeading___Toc3006_616069264">
+          <w:hyperlink w:anchor="__RefHeading___Toc3019_3770744645">
             <w:r>
               <w:rPr>
                 <w:rStyle w:val="IndexLink"/>
               </w:rPr>
               <w:t>10.2 Gender-Transformative Approaches</w:t>
               <w:tab/>
-              <w:t>39</w:t>
+              <w:t>40</w:t>
             </w:r>
           </w:hyperlink>
         </w:p>
@@ -951,14 +951,14 @@
             </w:tabs>
             <w:rPr/>
           </w:pPr>
-          <w:hyperlink w:anchor="__RefHeading___Toc3008_616069264">
+          <w:hyperlink w:anchor="__RefHeading___Toc3021_3770744645">
             <w:r>
               <w:rPr>
                 <w:rStyle w:val="IndexLink"/>
               </w:rPr>
               <w:t>10.3 Youth-Focused Incubation</w:t>
               <w:tab/>
-              <w:t>40</w:t>
+              <w:t>41</w:t>
             </w:r>
           </w:hyperlink>
         </w:p>
@@ -971,14 +971,14 @@
             </w:tabs>
             <w:rPr/>
           </w:pPr>
-          <w:hyperlink w:anchor="__RefHeading___Toc3010_616069264">
+          <w:hyperlink w:anchor="__RefHeading___Toc3023_3770744645">
             <w:r>
               <w:rPr>
                 <w:rStyle w:val="IndexLink"/>
               </w:rPr>
               <w:t>10.4 Blended Support Packages</w:t>
               <w:tab/>
-              <w:t>40</w:t>
+              <w:t>41</w:t>
             </w:r>
           </w:hyperlink>
         </w:p>
@@ -991,14 +991,14 @@
             </w:tabs>
             <w:rPr/>
           </w:pPr>
-          <w:hyperlink w:anchor="__RefHeading___Toc3012_616069264">
+          <w:hyperlink w:anchor="__RefHeading___Toc3025_3770744645">
             <w:r>
               <w:rPr>
                 <w:rStyle w:val="IndexLink"/>
               </w:rPr>
               <w:t>10.5 BSO Strengthening</w:t>
               <w:tab/>
-              <w:t>40</w:t>
+              <w:t>41</w:t>
             </w:r>
           </w:hyperlink>
         </w:p>
@@ -1011,14 +1011,14 @@
             </w:tabs>
             <w:rPr/>
           </w:pPr>
-          <w:hyperlink w:anchor="__RefHeading___Toc3014_616069264">
+          <w:hyperlink w:anchor="__RefHeading___Toc3027_3770744645">
             <w:r>
               <w:rPr>
                 <w:rStyle w:val="IndexLink"/>
               </w:rPr>
               <w:t>10.6 Financial Institution Strengthening</w:t>
               <w:tab/>
-              <w:t>41</w:t>
+              <w:t>42</w:t>
             </w:r>
           </w:hyperlink>
         </w:p>
@@ -1031,14 +1031,14 @@
             </w:tabs>
             <w:rPr/>
           </w:pPr>
-          <w:hyperlink w:anchor="__RefHeading___Toc3016_616069264">
+          <w:hyperlink w:anchor="__RefHeading___Toc3029_3770744645">
             <w:r>
               <w:rPr>
                 <w:rStyle w:val="IndexLink"/>
               </w:rPr>
               <w:t>10.7 Enabling Environment and Market Linkage Actions</w:t>
               <w:tab/>
-              <w:t>42</w:t>
+              <w:t>43</w:t>
             </w:r>
           </w:hyperlink>
         </w:p>
@@ -1051,14 +1051,14 @@
             </w:tabs>
             <w:rPr/>
           </w:pPr>
-          <w:hyperlink w:anchor="__RefHeading___Toc3018_616069264">
+          <w:hyperlink w:anchor="__RefHeading___Toc3031_3770744645">
             <w:r>
               <w:rPr>
                 <w:rStyle w:val="IndexLink"/>
               </w:rPr>
               <w:t>10.8 Pathways to Financing</w:t>
               <w:tab/>
-              <w:t>42</w:t>
+              <w:t>43</w:t>
             </w:r>
           </w:hyperlink>
         </w:p>
@@ -1071,14 +1071,14 @@
             </w:tabs>
             <w:rPr/>
           </w:pPr>
-          <w:hyperlink w:anchor="__RefHeading___Toc3020_616069264">
+          <w:hyperlink w:anchor="__RefHeading___Toc3033_3770744645">
             <w:r>
               <w:rPr>
                 <w:rStyle w:val="IndexLink"/>
               </w:rPr>
               <w:t>10.9 Priorities and Next Steps</w:t>
               <w:tab/>
-              <w:t>42</w:t>
+              <w:t>43</w:t>
             </w:r>
           </w:hyperlink>
         </w:p>
@@ -1091,14 +1091,14 @@
             </w:tabs>
             <w:rPr/>
           </w:pPr>
-          <w:hyperlink w:anchor="__RefHeading___Toc3022_616069264">
+          <w:hyperlink w:anchor="__RefHeading___Toc3035_3770744645">
             <w:r>
               <w:rPr>
                 <w:rStyle w:val="IndexLink"/>
               </w:rPr>
               <w:t>Annex A: Evidence Map</w:t>
               <w:tab/>
-              <w:t>44</w:t>
+              <w:t>45</w:t>
             </w:r>
           </w:hyperlink>
         </w:p>
@@ -1111,14 +1111,14 @@
             </w:tabs>
             <w:rPr/>
           </w:pPr>
-          <w:hyperlink w:anchor="__RefHeading___Toc3024_616069264">
+          <w:hyperlink w:anchor="__RefHeading___Toc3037_3770744645">
             <w:r>
               <w:rPr>
                 <w:rStyle w:val="IndexLink"/>
               </w:rPr>
               <w:t>Annex B: Closing the Gender and Age Data Gap</w:t>
               <w:tab/>
-              <w:t>45</w:t>
+              <w:t>46</w:t>
             </w:r>
           </w:hyperlink>
         </w:p>
@@ -1131,14 +1131,14 @@
             </w:tabs>
             <w:rPr/>
           </w:pPr>
-          <w:hyperlink w:anchor="__RefHeading___Toc3026_616069264">
+          <w:hyperlink w:anchor="__RefHeading___Toc3039_3770744645">
             <w:r>
               <w:rPr>
                 <w:rStyle w:val="IndexLink"/>
               </w:rPr>
               <w:t>References</w:t>
               <w:tab/>
-              <w:t>46</w:t>
+              <w:t>47</w:t>
             </w:r>
           </w:hyperlink>
           <w:r>
@@ -3466,7 +3466,7 @@
                 <w:sz w:val="18"/>
                 <w:szCs w:val="18"/>
               </w:rPr>
-              <w:t>NIPDB</w:t>
+              <w:t>NEET</w:t>
             </w:r>
           </w:p>
         </w:tc>
@@ -3491,7 +3491,7 @@
                 <w:sz w:val="18"/>
                 <w:szCs w:val="18"/>
               </w:rPr>
-              <w:t>Namibia Investment Promotion and Development Board</w:t>
+              <w:t>Not in employment, education or training</w:t>
             </w:r>
           </w:p>
         </w:tc>
@@ -3519,7 +3519,7 @@
                 <w:sz w:val="18"/>
                 <w:szCs w:val="18"/>
               </w:rPr>
-              <w:t>NTB</w:t>
+              <w:t>NIPDB</w:t>
             </w:r>
           </w:p>
         </w:tc>
@@ -3544,7 +3544,7 @@
                 <w:sz w:val="18"/>
                 <w:szCs w:val="18"/>
               </w:rPr>
-              <w:t>Namibia Tourism Board</w:t>
+              <w:t>Namibia Investment Promotion and Development Board</w:t>
             </w:r>
           </w:p>
         </w:tc>
@@ -3572,7 +3572,7 @@
                 <w:sz w:val="18"/>
                 <w:szCs w:val="18"/>
               </w:rPr>
-              <w:t>OSISC</w:t>
+              <w:t>NTB</w:t>
             </w:r>
           </w:p>
         </w:tc>
@@ -3597,7 +3597,7 @@
                 <w:sz w:val="18"/>
                 <w:szCs w:val="18"/>
               </w:rPr>
-              <w:t>One Stop Investment Services Centre (ZIDA, Zimbabwe)</w:t>
+              <w:t>Namibia Tourism Board</w:t>
             </w:r>
           </w:p>
         </w:tc>
@@ -3625,7 +3625,7 @@
                 <w:sz w:val="18"/>
                 <w:szCs w:val="18"/>
               </w:rPr>
-              <w:t>R-NBT</w:t>
+              <w:t>OSISC</w:t>
             </w:r>
           </w:p>
         </w:tc>
@@ -3650,7 +3650,7 @@
                 <w:sz w:val="18"/>
                 <w:szCs w:val="18"/>
               </w:rPr>
-              <w:t>Regenerative nature-based tourism</w:t>
+              <w:t>One Stop Investment Services Centre (ZIDA, Zimbabwe)</w:t>
             </w:r>
           </w:p>
         </w:tc>
@@ -3678,7 +3678,7 @@
                 <w:sz w:val="18"/>
                 <w:szCs w:val="18"/>
               </w:rPr>
-              <w:t>SADC</w:t>
+              <w:t>R-NBT</w:t>
             </w:r>
           </w:p>
         </w:tc>
@@ -3703,7 +3703,7 @@
                 <w:sz w:val="18"/>
                 <w:szCs w:val="18"/>
               </w:rPr>
-              <w:t>Southern African Development Community</w:t>
+              <w:t>Regenerative nature-based tourism</w:t>
             </w:r>
           </w:p>
         </w:tc>
@@ -3731,7 +3731,7 @@
                 <w:sz w:val="18"/>
                 <w:szCs w:val="18"/>
               </w:rPr>
-              <w:t>SMEDCO</w:t>
+              <w:t>SADC</w:t>
             </w:r>
           </w:p>
         </w:tc>
@@ -3756,7 +3756,7 @@
                 <w:sz w:val="18"/>
                 <w:szCs w:val="18"/>
               </w:rPr>
-              <w:t>Small and Medium Enterprises Development Corporation (Zimbabwe)</w:t>
+              <w:t>Southern African Development Community</w:t>
             </w:r>
           </w:p>
         </w:tc>
@@ -3784,7 +3784,7 @@
                 <w:sz w:val="18"/>
                 <w:szCs w:val="18"/>
               </w:rPr>
-              <w:t>STR</w:t>
+              <w:t>SMEDCO</w:t>
             </w:r>
           </w:p>
         </w:tc>
@@ -3809,7 +3809,7 @@
                 <w:sz w:val="18"/>
                 <w:szCs w:val="18"/>
               </w:rPr>
-              <w:t>Simplified Trade Regime</w:t>
+              <w:t>Small and Medium Enterprises Development Corporation (Zimbabwe)</w:t>
             </w:r>
           </w:p>
         </w:tc>
@@ -3837,7 +3837,7 @@
                 <w:sz w:val="18"/>
                 <w:szCs w:val="18"/>
               </w:rPr>
-              <w:t>TA</w:t>
+              <w:t>STR</w:t>
             </w:r>
           </w:p>
         </w:tc>
@@ -3862,7 +3862,7 @@
                 <w:sz w:val="18"/>
                 <w:szCs w:val="18"/>
               </w:rPr>
-              <w:t>Technical assistance</w:t>
+              <w:t>Simplified Trade Regime</w:t>
             </w:r>
           </w:p>
         </w:tc>
@@ -3890,7 +3890,7 @@
                 <w:sz w:val="18"/>
                 <w:szCs w:val="18"/>
               </w:rPr>
-              <w:t>TBCZ</w:t>
+              <w:t>TA</w:t>
             </w:r>
           </w:p>
         </w:tc>
@@ -3915,7 +3915,7 @@
                 <w:sz w:val="18"/>
                 <w:szCs w:val="18"/>
               </w:rPr>
-              <w:t>Tourism Business Council of Zimbabwe</w:t>
+              <w:t>Technical assistance</w:t>
             </w:r>
           </w:p>
         </w:tc>
@@ -3943,7 +3943,7 @@
                 <w:sz w:val="18"/>
                 <w:szCs w:val="18"/>
               </w:rPr>
-              <w:t>TCZ</w:t>
+              <w:t>TBCZ</w:t>
             </w:r>
           </w:p>
         </w:tc>
@@ -3968,7 +3968,7 @@
                 <w:sz w:val="18"/>
                 <w:szCs w:val="18"/>
               </w:rPr>
-              <w:t>Tourism Council of Zambia</w:t>
+              <w:t>Tourism Business Council of Zimbabwe</w:t>
             </w:r>
           </w:p>
         </w:tc>
@@ -3996,7 +3996,7 @@
                 <w:sz w:val="18"/>
                 <w:szCs w:val="18"/>
               </w:rPr>
-              <w:t>VSLA</w:t>
+              <w:t>TCZ</w:t>
             </w:r>
           </w:p>
         </w:tc>
@@ -4021,7 +4021,7 @@
                 <w:sz w:val="18"/>
                 <w:szCs w:val="18"/>
               </w:rPr>
-              <w:t>Village savings and loan association</w:t>
+              <w:t>Tourism Council of Zambia</w:t>
             </w:r>
           </w:p>
         </w:tc>
@@ -4049,7 +4049,7 @@
                 <w:sz w:val="18"/>
                 <w:szCs w:val="18"/>
               </w:rPr>
-              <w:t>WIBA</w:t>
+              <w:t>VSLA</w:t>
             </w:r>
           </w:p>
         </w:tc>
@@ -4074,7 +4074,7 @@
                 <w:sz w:val="18"/>
                 <w:szCs w:val="18"/>
               </w:rPr>
-              <w:t>Women in Business Association (Botswana)</w:t>
+              <w:t>Village savings and loan association</w:t>
             </w:r>
           </w:p>
         </w:tc>
@@ -4102,7 +4102,7 @@
                 <w:sz w:val="18"/>
                 <w:szCs w:val="18"/>
               </w:rPr>
-              <w:t>YDF</w:t>
+              <w:t>WIBA</w:t>
             </w:r>
           </w:p>
         </w:tc>
@@ -4127,7 +4127,7 @@
                 <w:sz w:val="18"/>
                 <w:szCs w:val="18"/>
               </w:rPr>
-              <w:t>Youth Development Fund (Botswana)</w:t>
+              <w:t>Women in Business Association (Botswana)</w:t>
             </w:r>
           </w:p>
         </w:tc>
@@ -4155,7 +4155,7 @@
                 <w:sz w:val="18"/>
                 <w:szCs w:val="18"/>
               </w:rPr>
-              <w:t>ZCGS</w:t>
+              <w:t>YDF</w:t>
             </w:r>
           </w:p>
         </w:tc>
@@ -4180,7 +4180,7 @@
                 <w:sz w:val="18"/>
                 <w:szCs w:val="18"/>
               </w:rPr>
-              <w:t>Zambia Credit Guarantee Scheme</w:t>
+              <w:t>Youth Development Fund (Botswana)</w:t>
             </w:r>
           </w:p>
         </w:tc>
@@ -4208,7 +4208,7 @@
                 <w:sz w:val="18"/>
                 <w:szCs w:val="18"/>
               </w:rPr>
-              <w:t>ZCSMBA</w:t>
+              <w:t>ZCGS</w:t>
             </w:r>
           </w:p>
         </w:tc>
@@ -4233,7 +4233,7 @@
                 <w:sz w:val="18"/>
                 <w:szCs w:val="18"/>
               </w:rPr>
-              <w:t>Zambia Chamber of Small and Medium Business Associations</w:t>
+              <w:t>Zambia Credit Guarantee Scheme</w:t>
             </w:r>
           </w:p>
         </w:tc>
@@ -4261,7 +4261,7 @@
                 <w:sz w:val="18"/>
                 <w:szCs w:val="18"/>
               </w:rPr>
-              <w:t>ZDA</w:t>
+              <w:t>ZCSMBA</w:t>
             </w:r>
           </w:p>
         </w:tc>
@@ -4286,7 +4286,7 @@
                 <w:sz w:val="18"/>
                 <w:szCs w:val="18"/>
               </w:rPr>
-              <w:t>Zambia Development Agency</w:t>
+              <w:t>Zambia Chamber of Small and Medium Business Associations</w:t>
             </w:r>
           </w:p>
         </w:tc>
@@ -4314,7 +4314,7 @@
                 <w:sz w:val="18"/>
                 <w:szCs w:val="18"/>
               </w:rPr>
-              <w:t>ZEEX</w:t>
+              <w:t>ZDA</w:t>
             </w:r>
           </w:p>
         </w:tc>
@@ -4339,7 +4339,7 @@
                 <w:sz w:val="18"/>
                 <w:szCs w:val="18"/>
               </w:rPr>
-              <w:t>Zimbabwe Entrepreneurship Exchange (planned)</w:t>
+              <w:t>Zambia Development Agency</w:t>
             </w:r>
           </w:p>
         </w:tc>
@@ -4367,7 +4367,7 @@
                 <w:sz w:val="18"/>
                 <w:szCs w:val="18"/>
               </w:rPr>
-              <w:t>ZIDA</w:t>
+              <w:t>ZEEX</w:t>
             </w:r>
           </w:p>
         </w:tc>
@@ -4392,7 +4392,7 @@
                 <w:sz w:val="18"/>
                 <w:szCs w:val="18"/>
               </w:rPr>
-              <w:t>Zimbabwe Investment and Development Agency</w:t>
+              <w:t>Zimbabwe Entrepreneurship Exchange</w:t>
             </w:r>
           </w:p>
         </w:tc>
@@ -4420,7 +4420,7 @@
                 <w:sz w:val="18"/>
                 <w:szCs w:val="18"/>
               </w:rPr>
-              <w:t>ZIMRA</w:t>
+              <w:t>ZIDA</w:t>
             </w:r>
           </w:p>
         </w:tc>
@@ -4445,7 +4445,7 @@
                 <w:sz w:val="18"/>
                 <w:szCs w:val="18"/>
               </w:rPr>
-              <w:t>Zimbabwe Revenue Authority</w:t>
+              <w:t>Zimbabwe Investment and Development Agency</w:t>
             </w:r>
           </w:p>
         </w:tc>
@@ -4473,6 +4473,59 @@
                 <w:sz w:val="18"/>
                 <w:szCs w:val="18"/>
               </w:rPr>
+              <w:t>ZIMRA</w:t>
+            </w:r>
+          </w:p>
+        </w:tc>
+        <w:tc>
+          <w:tcPr>
+            <w:tcW w:w="7025" w:type="dxa"/>
+            <w:tcBorders>
+              <w:top w:val="single" w:sz="4" w:space="0" w:color="B7C4BB"/>
+              <w:left w:val="single" w:sz="4" w:space="0" w:color="B7C4BB"/>
+              <w:bottom w:val="single" w:sz="4" w:space="0" w:color="B7C4BB"/>
+              <w:right w:val="single" w:sz="4" w:space="0" w:color="B7C4BB"/>
+            </w:tcBorders>
+          </w:tcPr>
+          <w:p>
+            <w:pPr>
+              <w:pStyle w:val="Normal"/>
+              <w:spacing w:lineRule="exact" w:line="252" w:before="0" w:after="0"/>
+              <w:rPr/>
+            </w:pPr>
+            <w:r>
+              <w:rPr>
+                <w:sz w:val="18"/>
+                <w:szCs w:val="18"/>
+              </w:rPr>
+              <w:t>Zimbabwe Revenue Authority</w:t>
+            </w:r>
+          </w:p>
+        </w:tc>
+      </w:tr>
+      <w:tr>
+        <w:trPr/>
+        <w:tc>
+          <w:tcPr>
+            <w:tcW w:w="2000" w:type="dxa"/>
+            <w:tcBorders>
+              <w:top w:val="single" w:sz="4" w:space="0" w:color="B7C4BB"/>
+              <w:left w:val="single" w:sz="4" w:space="0" w:color="B7C4BB"/>
+              <w:bottom w:val="single" w:sz="4" w:space="0" w:color="B7C4BB"/>
+              <w:right w:val="single" w:sz="4" w:space="0" w:color="B7C4BB"/>
+            </w:tcBorders>
+          </w:tcPr>
+          <w:p>
+            <w:pPr>
+              <w:pStyle w:val="Normal"/>
+              <w:spacing w:lineRule="exact" w:line="252" w:before="0" w:after="0"/>
+              <w:rPr/>
+            </w:pPr>
+            <w:r>
+              <w:rPr>
+                <w:sz w:val="18"/>
+                <w:szCs w:val="18"/>
+              </w:rPr>
               <w:t>ZMW</w:t>
             </w:r>
           </w:p>
@@ -4512,7 +4565,7 @@
       <w:r>
         <w:br w:type="page"/>
       </w:r>
-      <w:bookmarkStart w:id="0" w:name="__RefHeading___Toc2930_616069264"/>
+      <w:bookmarkStart w:id="0" w:name="__RefHeading___Toc2943_3770744645"/>
       <w:bookmarkEnd w:id="0"/>
       <w:r>
         <w:rPr/>
@@ -4705,7 +4758,7 @@
       </w:r>
       <w:r>
         <w:rPr/>
-        <w:t xml:space="preserve"> In the World Bank's last Doing Business rankings (Doing Business 2020), Zambia (85th of 190) and Botswana (87th) were the easiest of the five KAZA states in which to do business, followed by Namibia (104th), Zimbabwe (140th) and Angola (177th). The weaknesses that matter most for R-NBT MSMEs are shared: all five states ranked 117th or lower for starting a business, four of the five ranked 138th or lower for trading across borders, and contract enforcement was slow and costly everywhere except Namibia. Zambia's 4th place for getting credit shows that the legal basis for movable-asset and receivables lending exists in at least one state. Sector rules add to this: citizen reservation in Botswana, Zambia and Zimbabwe protects MSME space in transport, crafts and retail but limits outside capital, and Zimbabwe expanded its reserved sectors in 2025. Since 2020, online business registration (Botswana, Angola), one-stop investment centres (Zimbabwe) and risk-based licensing (Zambia) have eased formalisation, but implementation is uneven and Namibia's online registration system was reported not to be working in 2025.</w:t>
+        <w:t xml:space="preserve"> In the World Bank's last Doing Business rankings (Doing Business 2020), Zambia (85th of 190) and Botswana (87th) were the easiest of the five KAZA states in which to do business, followed by Namibia (104th), Zimbabwe (140th) and Angola (177th). The weaknesses that matter most for R-NBT MSMEs are shared: all five states ranked 117th or lower for starting a business, four of the five ranked 138th or lower for trading across borders, and contract enforcement was slow and costly everywhere except Namibia. Zambia's 4th place for getting credit shows that the legal basis for movable-asset and receivables lending exists in at least one state. Sector rules add to this: citizen reservation in Botswana, Zambia and Zimbabwe protects MSME space in transport, crafts and retail but limits outside capital, and Zimbabwe widened its reserved sectors in 2025. Online company registration (Botswana, Angola) and one-stop investment centres (Zimbabwe) have eased formalisation since 2020, but implementation is uneven, and Namibia's online registration system was reported not to be working in 2025.</w:t>
       </w:r>
     </w:p>
     <w:p>
@@ -4723,7 +4776,7 @@
       </w:r>
       <w:r>
         <w:rPr/>
-        <w:t xml:space="preserve"> Evidence beyond the Macro Diagnostic confirms that anchor operators can and do buy locally when suppliers are ready. Wilderness Botswana reports that more than 80% of its procurement by value comes from Botswana-based suppliers, and its supplier development programme raised annual contract value with citizen suppliers from BWP 6.3 million to BWP 15 million. In Livingstone, hotels have contracted smallholder farmers, including a women's mushroom farm, to supply produce. Earlier research in the Okavango Delta and Livingstone shows how much value leaks out of the region when supply chains are not local. Cross-border supply is held back by limited adoption of the KAZA Univisa and by low use of the COMESA Simplified Trade Regime.</w:t>
+        <w:t xml:space="preserve"> Evidence beyond the Macro Diagnostic confirms that anchor operators can and do buy locally when suppliers are ready. Wilderness in Botswana reports that more than 80% of its procurement by value comes from Botswana-based suppliers. Its local supplier expo led to more than BWP 6.2 million of new contracts for citizen-owned businesses in its first year, and its suppliers can borrow from Stanbic Bank against their Wilderness contracts. In Livingstone, a hotel buys produce directly from smallholder farmers, and a women's mushroom farm sells most of its produce to hotels under long-term contracts. Research on the Okavango Delta shows how much value leaks out of the region when supply chains are not local. Cross-border supply is held back by limited adoption of the KAZA Univisa and by a simplified trade regime for small traders that covers only Zambia and Zimbabwe.</w:t>
       </w:r>
     </w:p>
     <w:p>
@@ -4741,7 +4794,7 @@
       </w:r>
       <w:r>
         <w:rPr/>
-        <w:t xml:space="preserve"> Each state has a lead public BSO (INAPEM in Angola, LEA in Botswana, NIPDB in Namibia, ZDA and CEEC in Zambia, SMEDCO in Zimbabwe), supported by chambers, tourism associations and conservation NGOs. Several new programmes could serve as entry points: NIPDB's High Potential Pool, the ZDA-CEEC agreement on financial and non-financial services, SMEDCO's MSME hubs and its planned entrepreneurship exchange with the Zimbabwe Stock Exchange, the national incubator network INAPEM is building, and the Wilderness-LEA supplier-development partnership. None yet offers a tourism supplier-development service at scale in the KAZA hubs.</w:t>
+        <w:t xml:space="preserve"> Each state has a lead public BSO (INAPEM in Angola, LEA in Botswana, NIPDB in Namibia, ZDA and CEEC in Zambia, SMEDCO in Zimbabwe), supported by chambers, tourism associations and conservation NGOs. Several programmes could serve as entry points: NIPDB's High Potential Pool and SME fund, the ZDA-CEEC agreement on financial and non-financial services, SMEDCO's infrastructure programme and its partnership with the Zimbabwe Stock Exchange, the national incubator network INAPEM is building, and the Wilderness-LEA partnership. None yet offers a tourism supplier-development service at scale in the KAZA hubs.</w:t>
       </w:r>
     </w:p>
     <w:p>
@@ -4759,7 +4812,7 @@
       </w:r>
       <w:r>
         <w:rPr/>
-        <w:t xml:space="preserve"> The primary evidence used for this draft does not disaggregate MSME data by gender or age. Secondary national surveys indicate that women own a large share of MSMEs (more than 60% in Zimbabwe) and are concentrated in micro, informal and lower-margin activities such as crafts and food, while young people face very high unemployment and enter tourism mainly through guiding, transport and services. The clearest women-led model with investment potential in the evidence is a Zambian women's forest-products cooperative that supplies Livingstone hotels and has unsolicited export interest. All gender and age findings are flagged as indicative and should be confirmed through a disaggregated MSME survey in the next phase.</w:t>
+        <w:t xml:space="preserve"> The primary evidence used for this draft does not disaggregate MSME data by gender or age. Secondary sources indicate that women own or lead more than 60% of MSMEs in Zimbabwe and Zambia and that most women-owned businesses are informal, while young people face very high rates of being out of work, education or training and enter tourism mainly through guiding, transport and services. The clearest women-led model with investment potential in the evidence is a Zambian women's forest-products cooperative that supplies Livingstone hotels and has unsolicited export interest. All gender and age findings are flagged as indicative and should be confirmed through a disaggregated MSME survey in the next phase.</w:t>
       </w:r>
     </w:p>
     <w:p>
@@ -4828,7 +4881,7 @@
         <w:spacing w:before="0" w:after="240"/>
         <w:rPr/>
       </w:pPr>
-      <w:bookmarkStart w:id="1" w:name="__RefHeading___Toc2932_616069264"/>
+      <w:bookmarkStart w:id="1" w:name="__RefHeading___Toc2945_3770744645"/>
       <w:bookmarkEnd w:id="1"/>
       <w:r>
         <w:rPr/>
@@ -4840,7 +4893,7 @@
         <w:pStyle w:val="Heading2"/>
         <w:rPr/>
       </w:pPr>
-      <w:bookmarkStart w:id="2" w:name="__RefHeading___Toc2934_616069264"/>
+      <w:bookmarkStart w:id="2" w:name="__RefHeading___Toc2947_3770744645"/>
       <w:bookmarkEnd w:id="2"/>
       <w:r>
         <w:rPr/>
@@ -4968,7 +5021,7 @@
         <w:pStyle w:val="Heading2"/>
         <w:rPr/>
       </w:pPr>
-      <w:bookmarkStart w:id="3" w:name="__RefHeading___Toc2936_616069264"/>
+      <w:bookmarkStart w:id="3" w:name="__RefHeading___Toc2949_3770744645"/>
       <w:bookmarkEnd w:id="3"/>
       <w:r>
         <w:rPr/>
@@ -5388,7 +5441,7 @@
                 <w:sz w:val="18"/>
                 <w:szCs w:val="18"/>
               </w:rPr>
-              <w:t>Secondary national, sector and company data (FinScope MSME surveys, World Bank and AFI studies, labour force data, operator impact reports, academic studies, agency and press reports)</w:t>
+              <w:t>Secondary national, sector and company data (FinScope MSME surveys, World Bank, AFI and UN Women studies, census labour data, operator reports, academic studies, agency and press reports)</w:t>
             </w:r>
           </w:p>
         </w:tc>
@@ -5438,7 +5491,7 @@
                 <w:sz w:val="18"/>
                 <w:szCs w:val="18"/>
               </w:rPr>
-              <w:t>Not specific to KAZA in most cases; operator figures are self-reported; figures to be checked against full source documents before publication</w:t>
+              <w:t>Not specific to KAZA in most cases; operator figures are self-reported; each figure is attributed to its source</w:t>
             </w:r>
           </w:p>
         </w:tc>
@@ -5470,7 +5523,7 @@
         <w:pStyle w:val="Heading2"/>
         <w:rPr/>
       </w:pPr>
-      <w:bookmarkStart w:id="4" w:name="__RefHeading___Toc2938_616069264"/>
+      <w:bookmarkStart w:id="4" w:name="__RefHeading___Toc2951_3770744645"/>
       <w:bookmarkEnd w:id="4"/>
       <w:r>
         <w:rPr/>
@@ -5485,7 +5538,7 @@
       </w:pPr>
       <w:r>
         <w:rPr/>
-        <w:t>Investment readiness is assessed across six dimensions. Each is rated Low, Medium or High for the typical MSME in a value chain or node:</w:t>
+        <w:t>Investment readiness is assessed across six dimensions, each rated Low, Medium or High for the typical MSME in a value chain or node:</w:t>
       </w:r>
     </w:p>
     <w:p>
@@ -6420,7 +6473,7 @@
         <w:pStyle w:val="Heading2"/>
         <w:rPr/>
       </w:pPr>
-      <w:bookmarkStart w:id="5" w:name="__RefHeading___Toc2940_616069264"/>
+      <w:bookmarkStart w:id="5" w:name="__RefHeading___Toc2953_3770744645"/>
       <w:bookmarkEnd w:id="5"/>
       <w:r>
         <w:rPr/>
@@ -6508,7 +6561,7 @@
       </w:r>
       <w:r>
         <w:rPr/>
-        <w:t xml:space="preserve"> Doing Business 2020 is the last edition of the series, which the World Bank discontinued in 2021 after data irregularities were found in earlier editions. Its successor, B-READY, did not yet cover all five KAZA states in its 2025 edition. Doing Business rankings are used here only to compare the five states with each other and to identify which regulatory procedures weigh most on MSMEs.</w:t>
+        <w:t xml:space="preserve"> Doing Business 2020 is the last edition of the series, which the World Bank discontinued in 2021 after data irregularities were found in earlier editions. Its successor, B-READY, covered 101 economies in its 2025 interim edition and will cover 164 by the end of 2026, but country results for all five KAZA states were not available for this draft. Doing Business rankings are used here only to compare the five states and to identify which regulatory procedures weigh most on MSMEs.</w:t>
       </w:r>
     </w:p>
     <w:p>
@@ -6541,7 +6594,7 @@
         <w:spacing w:before="0" w:after="240"/>
         <w:rPr/>
       </w:pPr>
-      <w:bookmarkStart w:id="6" w:name="__RefHeading___Toc2942_616069264"/>
+      <w:bookmarkStart w:id="6" w:name="__RefHeading___Toc2955_3770744645"/>
       <w:bookmarkEnd w:id="6"/>
       <w:r>
         <w:rPr/>
@@ -6553,7 +6606,7 @@
         <w:pStyle w:val="Heading2"/>
         <w:rPr/>
       </w:pPr>
-      <w:bookmarkStart w:id="7" w:name="__RefHeading___Toc2944_616069264"/>
+      <w:bookmarkStart w:id="7" w:name="__RefHeading___Toc2957_3770744645"/>
       <w:bookmarkEnd w:id="7"/>
       <w:r>
         <w:rPr/>
@@ -6815,7 +6868,7 @@
         <w:pStyle w:val="Heading2"/>
         <w:rPr/>
       </w:pPr>
-      <w:bookmarkStart w:id="8" w:name="__RefHeading___Toc2946_616069264"/>
+      <w:bookmarkStart w:id="8" w:name="__RefHeading___Toc2959_3770744645"/>
       <w:bookmarkEnd w:id="8"/>
       <w:r>
         <w:rPr/>
@@ -7401,7 +7454,7 @@
         <w:spacing w:before="0" w:after="240"/>
         <w:rPr/>
       </w:pPr>
-      <w:bookmarkStart w:id="9" w:name="__RefHeading___Toc2948_616069264"/>
+      <w:bookmarkStart w:id="9" w:name="__RefHeading___Toc2961_3770744645"/>
       <w:bookmarkEnd w:id="9"/>
       <w:r>
         <w:rPr/>
@@ -7413,7 +7466,7 @@
         <w:pStyle w:val="Heading2"/>
         <w:rPr/>
       </w:pPr>
-      <w:bookmarkStart w:id="10" w:name="__RefHeading___Toc2950_616069264"/>
+      <w:bookmarkStart w:id="10" w:name="__RefHeading___Toc2963_3770744645"/>
       <w:bookmarkEnd w:id="10"/>
       <w:r>
         <w:rPr/>
@@ -7541,7 +7594,7 @@
         <w:pStyle w:val="Heading2"/>
         <w:rPr/>
       </w:pPr>
-      <w:bookmarkStart w:id="11" w:name="__RefHeading___Toc2952_616069264"/>
+      <w:bookmarkStart w:id="11" w:name="__RefHeading___Toc2965_3770744645"/>
       <w:bookmarkEnd w:id="11"/>
       <w:r>
         <w:rPr/>
@@ -7722,7 +7775,7 @@
         <w:spacing w:before="0" w:after="240"/>
         <w:rPr/>
       </w:pPr>
-      <w:bookmarkStart w:id="12" w:name="__RefHeading___Toc2954_616069264"/>
+      <w:bookmarkStart w:id="12" w:name="__RefHeading___Toc2967_3770744645"/>
       <w:bookmarkEnd w:id="12"/>
       <w:r>
         <w:rPr/>
@@ -7734,7 +7787,7 @@
         <w:pStyle w:val="Heading2"/>
         <w:rPr/>
       </w:pPr>
-      <w:bookmarkStart w:id="13" w:name="__RefHeading___Toc2956_616069264"/>
+      <w:bookmarkStart w:id="13" w:name="__RefHeading___Toc2969_3770744645"/>
       <w:bookmarkEnd w:id="13"/>
       <w:r>
         <w:rPr/>
@@ -7808,11 +7861,11 @@
           <w:b/>
           <w:bCs/>
         </w:rPr>
-        <w:t>Low savings and thin buffers.</w:t>
-      </w:r>
-      <w:r>
-        <w:rPr/>
-        <w:t xml:space="preserve"> In Zimbabwe, 60% of MSME owners report that they do not save (FinScope MSME Zimbabwe 2022). Low-season cash shortfalls are therefore met by cutting activity, informal borrowing or drawing on household income.</w:t>
+        <w:t>Thin buffers.</w:t>
+      </w:r>
+      <w:r>
+        <w:rPr/>
+        <w:t xml:space="preserve"> Savings are falling in at least one state: the Reserve Bank of Zimbabwe reports that the share of Zimbabwean adults who save fell from about 47% in 2014 to 36% in 2022 (Chipika, citing FinScope). Low-season cash shortfalls are therefore met by cutting activity, informal borrowing or drawing on household income.</w:t>
       </w:r>
     </w:p>
     <w:p>
@@ -7862,7 +7915,7 @@
         <w:pStyle w:val="Heading2"/>
         <w:rPr/>
       </w:pPr>
-      <w:bookmarkStart w:id="14" w:name="__RefHeading___Toc2958_616069264"/>
+      <w:bookmarkStart w:id="14" w:name="__RefHeading___Toc2971_3770744645"/>
       <w:bookmarkEnd w:id="14"/>
       <w:r>
         <w:rPr/>
@@ -7877,7 +7930,7 @@
       </w:pPr>
       <w:r>
         <w:rPr/>
-        <w:t>The Macro Diagnostic does not report record-keeping practice directly. National surveys suggest it is weak: in Zimbabwe's 2012 FinScope MSME survey, 49% of MSME owners kept no financial records and only 8% kept up-to-date accounts. The Financial Landscape Analysis notes that limited records, informality and weak credit histories are a common barrier across all five states, and that Botswana's LEA supports tourism enterprises in record keeping. For R-NBT MSMEs the practical issues are:</w:t>
+        <w:t>The Macro Diagnostic does not report record-keeping practice directly. National surveys suggest it is weak. In Zimbabwe's 2012 FinScope MSME survey, 49% of MSME owners kept no financial records and only 8% kept up-to-date accounts (FinMark Trust), and the 2022 survey found that only 17% always keep records, while 37% do so sometimes (FinScope MSME Zimbabwe 2022). The Financial Landscape Analysis notes that limited records, informality and weak credit histories are a common barrier across all five states, and that Botswana's LEA supports tourism enterprises in record keeping. For R-NBT MSMEs the practical issues are:</w:t>
       </w:r>
     </w:p>
     <w:p>
@@ -7919,7 +7972,7 @@
       </w:pPr>
       <w:r>
         <w:rPr/>
-        <w:t>Mobile-money and card payments create a digital trail, but women-owned SMEs in Zambia received only 6% of sales through mobile money in one World Bank study, so the trail is still thin.</w:t>
+        <w:t>Mobile-money and card payments create a digital trail, but women-owned SMEs in Zambia received only 6% of their sales through mobile money in a World Bank survey (World Bank, 2021), so the trail is still thin.</w:t>
       </w:r>
     </w:p>
     <w:p>
@@ -7941,7 +7994,7 @@
         <w:pStyle w:val="Heading2"/>
         <w:rPr/>
       </w:pPr>
-      <w:bookmarkStart w:id="15" w:name="__RefHeading___Toc2960_616069264"/>
+      <w:bookmarkStart w:id="15" w:name="__RefHeading___Toc2973_3770744645"/>
       <w:bookmarkEnd w:id="15"/>
       <w:r>
         <w:rPr/>
@@ -7956,7 +8009,7 @@
       </w:pPr>
       <w:r>
         <w:rPr/>
-        <w:t>Informality is the norm in the priority chains. The FinScope MSME Zimbabwe 2022 survey reports that about 86% of MSMEs are informal. Namibia has an estimated 34,000 MSMEs, of which about 15,000 are formally registered (World Bank). Zambia has not conducted a national MSME survey since 2004, so the size of its informal segment cannot be estimated reliably (AFI). Section 7.1 shows that the cost and time of formalising are themselves part of the explanation: all five states ranked in the bottom half of the world for starting a business in Doing Business 2020.</w:t>
+        <w:t>Informality is the norm in the priority chains. In Zimbabwe, only about one in seven MSMEs is registered or licensed (FinScope MSME Zimbabwe 2022). In Namibia, the World Bank estimates that some 34,000 MSMEs operate, of which about 15,000 are formally registered (World Bank, 2024). In Botswana, micro-enterprises make up about 91% of the estimated 138,000 MSMEs (FinScope MSME Botswana 2024). Section 7.1 shows that the cost and time of formalising are themselves part of the explanation: all five states ranked in the bottom half of the world for starting a business in Doing Business 2020.</w:t>
       </w:r>
     </w:p>
     <w:p>
@@ -8070,7 +8123,7 @@
         <w:pStyle w:val="Heading2"/>
         <w:rPr/>
       </w:pPr>
-      <w:bookmarkStart w:id="16" w:name="__RefHeading___Toc2962_616069264"/>
+      <w:bookmarkStart w:id="16" w:name="__RefHeading___Toc2975_3770744645"/>
       <w:bookmarkEnd w:id="16"/>
       <w:r>
         <w:rPr/>
@@ -8085,7 +8138,7 @@
       </w:pPr>
       <w:r>
         <w:rPr/>
-        <w:t>The table below rates the typical MSME in each chain on the six readiness dimensions. Ratings are the author's assessment from the evidence above and should be validated.</w:t>
+        <w:t>The typical MSME in each chain is rated below on the six readiness dimensions. The ratings are the author's assessment from the evidence above and should be validated.</w:t>
       </w:r>
     </w:p>
     <w:p>
@@ -10035,7 +10088,7 @@
         <w:spacing w:before="0" w:after="240"/>
         <w:rPr/>
       </w:pPr>
-      <w:bookmarkStart w:id="17" w:name="__RefHeading___Toc2964_616069264"/>
+      <w:bookmarkStart w:id="17" w:name="__RefHeading___Toc2977_3770744645"/>
       <w:bookmarkEnd w:id="17"/>
       <w:r>
         <w:rPr/>
@@ -10047,7 +10100,7 @@
         <w:pStyle w:val="Heading2"/>
         <w:rPr/>
       </w:pPr>
-      <w:bookmarkStart w:id="18" w:name="__RefHeading___Toc2966_616069264"/>
+      <w:bookmarkStart w:id="18" w:name="__RefHeading___Toc2979_3770744645"/>
       <w:bookmarkEnd w:id="18"/>
       <w:r>
         <w:rPr/>
@@ -10070,7 +10123,7 @@
         <w:pStyle w:val="Heading2"/>
         <w:rPr/>
       </w:pPr>
-      <w:bookmarkStart w:id="19" w:name="__RefHeading___Toc2968_616069264"/>
+      <w:bookmarkStart w:id="19" w:name="__RefHeading___Toc2981_3770744645"/>
       <w:bookmarkEnd w:id="19"/>
       <w:r>
         <w:rPr/>
@@ -10102,11 +10155,11 @@
           <w:b/>
           <w:bCs/>
         </w:rPr>
-        <w:t>Women own a large share of MSMEs but are concentrated at the micro end.</w:t>
-      </w:r>
-      <w:r>
-        <w:rPr/>
-        <w:t xml:space="preserve"> Women own more than 60% of MSMEs in Zimbabwe (FinScope MSME 2022, as reported by the Reserve Bank of Zimbabwe). Regional FinScope surveys consistently find women concentrated in micro, informal enterprises.</w:t>
+        <w:t>Women own or lead most MSMEs in at least two states.</w:t>
+      </w:r>
+      <w:r>
+        <w:rPr/>
+        <w:t xml:space="preserve"> Women-owned MSMEs account for more than 60% of all MSMEs in Zimbabwe (Chipika, citing FinScope MSME 2022), and a Bank of Zambia official reports that more than 60% of Zambia's MSMEs are now women-led (AFI).</w:t>
       </w:r>
     </w:p>
     <w:p>
@@ -10123,11 +10176,11 @@
           <w:b/>
           <w:bCs/>
         </w:rPr>
-        <w:t>Women are not always less formal.</w:t>
-      </w:r>
-      <w:r>
-        <w:rPr/>
-        <w:t xml:space="preserve"> In Botswana, 56% of female business owners run formal businesses compared with 51% of male owners (FinScope MSME Botswana 2024). Formality alone does not explain the gender gap in finance.</w:t>
+        <w:t>Most women-owned businesses are informal.</w:t>
+      </w:r>
+      <w:r>
+        <w:rPr/>
+        <w:t xml:space="preserve"> In a 2025 UN Women survey of 582 women-owned MSMEs across ten provinces of Zimbabwe, 64% were unregistered and 68% were individually owned (UN Women, 2025).</w:t>
       </w:r>
     </w:p>
     <w:p>
@@ -10144,11 +10197,11 @@
           <w:b/>
           <w:bCs/>
         </w:rPr>
-        <w:t>Women borrow less from banks and more from groups.</w:t>
-      </w:r>
-      <w:r>
-        <w:rPr/>
-        <w:t xml:space="preserve"> In Zimbabwe, only 22% of women-led MSMEs with bank accounts had applied for a commercial loan, falling to 8% in rural areas (African Journal of Inclusive Societies). In Zambia, women SME owners most often cite high interest rates (36%) as a barrier and turn to friends, family, moneylenders and community groups (World Bank W-SME study). Savings groups are where most women's enterprise finance happens.</w:t>
+        <w:t>Women's enterprises face a large finance gap.</w:t>
+      </w:r>
+      <w:r>
+        <w:rPr/>
+        <w:t xml:space="preserve"> AFI's Zambia case study puts the MSME financing gap at about 17% of GDP, of which the share attributable to women-owned enterprises is about USD 657 million (AFI, 2024). Savings groups are where most women's enterprise finance happens. Policy responses are emerging, such as Zimbabwe's Collateral Registry System, launched in November 2022 to allow movable assets to be used as security (Chipika).</w:t>
       </w:r>
     </w:p>
     <w:p>
@@ -10201,7 +10254,7 @@
       </w:pPr>
       <w:r>
         <w:rPr/>
-        <w:t>Women are also prominent in small-scale cross-border trade, which links producers on either side of the Zambia-Zimbabwe border: in 2013 more than half of the traders using the COMESA Simplified Trade Regime were women (COMESA). This is relevant to food and craft supply along the Victoria Falls corridor.</w:t>
+        <w:t>Women are also prominent in small-scale cross-border trade, which links producers on either side of the Zambia-Zimbabwe border: by 2013, 5,926 of the roughly 10,970 traders using the COMESA Simplified Trade Regime were women (COMESA, 2016). This is relevant to food and craft supply along the Victoria Falls corridor.</w:t>
       </w:r>
     </w:p>
     <w:p>
@@ -10227,7 +10280,7 @@
         <w:pStyle w:val="Heading2"/>
         <w:rPr/>
       </w:pPr>
-      <w:bookmarkStart w:id="20" w:name="__RefHeading___Toc2970_616069264"/>
+      <w:bookmarkStart w:id="20" w:name="__RefHeading___Toc2983_3770744645"/>
       <w:bookmarkEnd w:id="20"/>
       <w:r>
         <w:rPr/>
@@ -10248,11 +10301,11 @@
           <w:b/>
           <w:bCs/>
         </w:rPr>
-        <w:t>Youth unemployment is high.</w:t>
-      </w:r>
-      <w:r>
-        <w:rPr/>
-        <w:t xml:space="preserve"> In Namibia, 41.9% of 15 to 24 year olds are not in employment, education or training (Labour Force Survey 2023). Youth unemployment is similarly a priority in all five states.</w:t>
+        <w:t>Many young people are out of work and education.</w:t>
+      </w:r>
+      <w:r>
+        <w:rPr/>
+        <w:t xml:space="preserve"> In Namibia, 41.9% of young people aged 15 to 34 are not in employment, education or training (Namibia Statistics Agency, 2023 census labour force report). Youth unemployment is similarly a priority in all five states.</w:t>
       </w:r>
     </w:p>
     <w:p>
@@ -10344,7 +10397,7 @@
         <w:pStyle w:val="Heading2"/>
         <w:rPr/>
       </w:pPr>
-      <w:bookmarkStart w:id="21" w:name="__RefHeading___Toc2972_616069264"/>
+      <w:bookmarkStart w:id="21" w:name="__RefHeading___Toc2985_3770744645"/>
       <w:bookmarkEnd w:id="21"/>
       <w:r>
         <w:rPr/>
@@ -10359,7 +10412,7 @@
       </w:pPr>
       <w:r>
         <w:rPr/>
-        <w:t>Node is the strongest predictor of readiness in the evidence. The table below summarises how readiness and finance needs vary by node.</w:t>
+        <w:t>Node is the strongest predictor of readiness in the evidence. Readiness and finance needs vary by node as follows.</w:t>
       </w:r>
     </w:p>
     <w:p>
@@ -11229,7 +11282,7 @@
         <w:spacing w:before="0" w:after="240"/>
         <w:rPr/>
       </w:pPr>
-      <w:bookmarkStart w:id="22" w:name="__RefHeading___Toc2974_616069264"/>
+      <w:bookmarkStart w:id="22" w:name="__RefHeading___Toc2987_3770744645"/>
       <w:bookmarkEnd w:id="22"/>
       <w:r>
         <w:rPr/>
@@ -11252,7 +11305,7 @@
         <w:pStyle w:val="Heading2"/>
         <w:rPr/>
       </w:pPr>
-      <w:bookmarkStart w:id="23" w:name="__RefHeading___Toc2976_616069264"/>
+      <w:bookmarkStart w:id="23" w:name="__RefHeading___Toc2989_3770744645"/>
       <w:bookmarkEnd w:id="23"/>
       <w:r>
         <w:rPr/>
@@ -11456,7 +11509,7 @@
       </w:pPr>
       <w:r>
         <w:rPr/>
-        <w:t>The priority gaps differ by chain. The table below links the main gaps in each priority chain to the interventions recommended in Chapter 10 and to the partners best placed to deliver them.</w:t>
+        <w:t>The priority gaps differ by chain. The main gaps in each priority chain are linked below to the interventions recommended in Chapter 10 and to the partners best placed to deliver them.</w:t>
       </w:r>
     </w:p>
     <w:p>
@@ -12461,7 +12514,7 @@
                 <w:sz w:val="18"/>
                 <w:szCs w:val="18"/>
               </w:rPr>
-              <w:t>BTO, NTB, ZTA (Zimbabwe), NACSO, CAMPFIRE Association</w:t>
+              <w:t>BTO, NTB, Zimbabwe Tourism Authority, NACSO, CAMPFIRE Association</w:t>
             </w:r>
           </w:p>
         </w:tc>
@@ -12482,7 +12535,7 @@
         <w:pStyle w:val="Heading2"/>
         <w:rPr/>
       </w:pPr>
-      <w:bookmarkStart w:id="24" w:name="__RefHeading___Toc2978_616069264"/>
+      <w:bookmarkStart w:id="24" w:name="__RefHeading___Toc2991_3770744645"/>
       <w:bookmarkEnd w:id="24"/>
       <w:r>
         <w:rPr/>
@@ -12560,7 +12613,7 @@
       </w:r>
       <w:r>
         <w:rPr/>
-        <w:t xml:space="preserve"> Services are concentrated in capitals; outreach to Kasane, Maun, Katima Mulilo, Rundu, Livingstone, Hwange and Cuando Cubango is thin. LEA's planned new offices, for example, are not in the KAZA hubs, and INAPEM's decentralised incubation has started in Huíla rather than in Cuando Cubango (Section 7.3).</w:t>
+        <w:t xml:space="preserve"> Services are concentrated in capitals; outreach to Kasane, Maun, Katima Mulilo, Rundu, Livingstone, Hwange and Cuando Cubango is thin. INAPEM's first decentralised incubation programme, for example, is in Huíla province rather than Cuando Cubango (Section 7.3).</w:t>
       </w:r>
     </w:p>
     <w:p>
@@ -12581,7 +12634,7 @@
       </w:r>
       <w:r>
         <w:rPr/>
-        <w:t xml:space="preserve"> Several lead BSOs are being restructured or refunded: the long-pending LEA-CEDA merger in Botswana, the reset of CEEC funding in Zambia, and BIPA's delayed online registration system in Namibia. This makes it harder for BSOs to commit to multi-year supplier-development programmes.</w:t>
+        <w:t xml:space="preserve"> Some lead agencies are being restructured or are rebuilding systems. Botswana has long-standing plans to rationalise parastatals with overlapping mandates, which unions have questioned (Business Weekly, 2026), and Namibia's BIPA is still procuring a new online registration system (Section 7.1). This makes it harder for BSOs to commit to multi-year supplier-development programmes.</w:t>
       </w:r>
     </w:p>
     <w:p>
@@ -12652,7 +12705,7 @@
         <w:pStyle w:val="Heading2"/>
         <w:rPr/>
       </w:pPr>
-      <w:bookmarkStart w:id="25" w:name="__RefHeading___Toc2980_616069264"/>
+      <w:bookmarkStart w:id="25" w:name="__RefHeading___Toc2993_3770744645"/>
       <w:bookmarkEnd w:id="25"/>
       <w:r>
         <w:rPr/>
@@ -12719,7 +12772,7 @@
       </w:r>
       <w:r>
         <w:rPr/>
-        <w:t xml:space="preserve"> using purchase orders, receivables, movable-asset registries, mobile-money data and savings-group records in credit assessment. Zambia's 4th-place ranking for getting credit in Doing Business 2020 shows that the legal tools exist there; the gap is their use for small borrowers. In Angola, which ranked 185th, lenders have few such tools and need contractual workarounds such as payment routing through the anchor buyer.</w:t>
+        <w:t xml:space="preserve"> using purchase orders, receivables, movable-asset registries, mobile-money data and savings-group records in credit assessment. Zambia's 4th-place ranking for getting credit in Doing Business 2020 shows that the legal tools exist there; Zimbabwe launched a collateral registry for movable assets in 2022, and Botswana's CIPA is developing a National Collateral Registry for SME credit. The gap is lenders' use of these tools for small borrowers. In Angola, which ranked 185th for getting credit, lenders have few such tools and need contractual workarounds such as payment routing through the anchor buyer.</w:t>
       </w:r>
     </w:p>
     <w:p>
@@ -13623,7 +13676,7 @@
         <w:spacing w:before="0" w:after="240"/>
         <w:rPr/>
       </w:pPr>
-      <w:bookmarkStart w:id="26" w:name="__RefHeading___Toc2982_616069264"/>
+      <w:bookmarkStart w:id="26" w:name="__RefHeading___Toc2995_3770744645"/>
       <w:bookmarkEnd w:id="26"/>
       <w:r>
         <w:rPr/>
@@ -13646,7 +13699,7 @@
         <w:pStyle w:val="Heading2"/>
         <w:rPr/>
       </w:pPr>
-      <w:bookmarkStart w:id="27" w:name="__RefHeading___Toc2984_616069264"/>
+      <w:bookmarkStart w:id="27" w:name="__RefHeading___Toc2997_3770744645"/>
       <w:bookmarkEnd w:id="27"/>
       <w:r>
         <w:rPr/>
@@ -15625,7 +15678,7 @@
       </w:pPr>
       <w:r>
         <w:rPr/>
-        <w:t>Source: World Bank, Doing Business 2020 economy profiles and rankings. Topic ranks were transcribed from the published profiles and should be checked against the original documents before publication; n.a. means the rank could not be confirmed.</w:t>
+        <w:t>Source: World Bank, Doing Business 2020 report and economy profiles. Topic ranks were transcribed from the published profiles; the overall ranks and scores are confirmed in the World Bank's published rankings.</w:t>
       </w:r>
     </w:p>
     <w:p>
@@ -15657,7 +15710,7 @@
       </w:r>
       <w:r>
         <w:rPr/>
-        <w:t xml:space="preserve"> All five states ranked 117th or lower for starting a business. Registering a company took about 8.5 days in Zambia, 27 days and 9 procedures in Zimbabwe, 36 days and 8 procedures in Angola, and 54 days and 10 procedures in Namibia; Namibia's Auditor-General reported an average of 66 days around the same period. In Botswana, company registration could be completed online in a day, but tax registration took about 30 days. For a micro-enterprise earning most of its income in a five-month season, a registration process that takes one to two months has a real opportunity cost. This supports treating formalisation as a milestone tied to a contract (Section 4.3) and offering hands-on help with procedures.</w:t>
+        <w:t xml:space="preserve"> All five states ranked 117th or lower for starting a business. Registering a company took about 8.5 days in Zambia, 27 days and 9 procedures in Zimbabwe, 36 days and 8 procedures in Angola, and 54 days and 10 procedures in Namibia. In Botswana in 2020, company registration could be completed online in a day, but tax registration took about 30 days; later US government reports put tax registration at about a week (US Department of State, 2020 and 2026). For a micro-enterprise earning most of its income in a five-month season, a registration process that takes one to two months has a real opportunity cost. This supports treating formalisation as a milestone tied to a contract (Section 4.3) and offering hands-on help with procedures.</w:t>
       </w:r>
     </w:p>
     <w:p>
@@ -15699,7 +15752,7 @@
       </w:r>
       <w:r>
         <w:rPr/>
-        <w:t xml:space="preserve"> Enforcing a commercial contract through the courts took about 660 days in Botswana (137th) and 410 days at a cost of 83% of the claim in Zimbabwe (169th); Angola ranked 186th and Zambia 130th. Only Namibia (64th) ranked in the top half. Contract-backed supplier finance in KAZA therefore cannot rely on court enforcement. It needs tripartite agreements in which the anchor buyer pays the lender directly, short payment cycles and repeat relationships that make default costly.</w:t>
+        <w:t xml:space="preserve"> Enforcing a commercial contract through the courts took about 660 days in Botswana (137th) and 410 days at a cost of 83% of the claim in Zimbabwe (169th); Angola ranked 186th and Zambia 130th. Only Namibia (64th) ranked in the top half. Contract-backed supplier finance in KAZA therefore cannot rely on court enforcement. It needs arrangements in which the anchor buyer pays the lender directly, as in the Wilderness-Stanbic facility, where suppliers cede their right to receive payment from Wilderness to the bank (Mmegi, 2025).</w:t>
       </w:r>
     </w:p>
     <w:p>
@@ -15780,7 +15833,7 @@
       </w:r>
       <w:r>
         <w:rPr/>
-        <w:t xml:space="preserve"> (177th) had the weakest business environment of the five, with bottom-ten rankings for getting credit and enforcing contracts and no functioning insolvency practice (score of zero). Government has tried to simplify entry: the Balcão Único do Empreendedor (BUE), created in 2012 as a one-stop shop for micro, small and medium enterprises, was followed in 2019 by an online company-registration service designed to form companies in about two days, and the government has planned to integrate tax, social security and trade registration into the platform. INAPEM certification is a prerequisite for access to public credit lines and tax benefits and is required by commercial banks for loan applications. Sector rules cap foreign shareholding at 49% in road passenger transport and 50% in road freight (MD p. 26). For Cuando Cubango, the binding constraints are a thin enterprise base, distance from Luanda-based services, and the fact that guiding and logistics for Angolan sites accrue in Namibia (MD p. 118-119).</w:t>
+        <w:t xml:space="preserve"> (177th) had the weakest business environment of the five, with bottom-ten rankings for getting credit and enforcing contracts. Government has tried to simplify entry: Presidential Decree 40/12 created the Balcão Único do Empreendedor (BUE) in 2012 to simplify the formation and licensing of micro and small enterprises and bring informal activity into the formal economy, and by 2021 a new platform at the Guiché Único da Empresa allowed a company to be created online or in person in about an hour when documents were in order (Ver Angola, 2021). INAPEM certification gives access to tax benefits, and banks ask for the certificate when a company applies for finance (AllAfrica, 2026). Sector rules cap foreign shareholding at 49% in road passenger transport and 50% in road freight (MD p. 26). For Cuando Cubango, the binding constraints are a thin enterprise base, distance from Luanda-based services, and the fact that guiding and logistics for Angolan sites accrue in Namibia (MD p. 118-119).</w:t>
       </w:r>
     </w:p>
     <w:p>
@@ -15798,7 +15851,7 @@
       </w:r>
       <w:r>
         <w:rPr/>
-        <w:t xml:space="preserve"> (87th) combined good rankings for construction permits (44th), trading across borders (55th) and paying taxes (59th) with weak rankings for starting a business (159th), getting electricity (139th) and enforcing contracts (137th). Since 2019 the Companies and Intellectual Property Authority (CIPA) has run an online business registration system, which the 2026 budget debate credits with faster turnaround times. Botswana was included in the World Bank's Business Ready (B-READY) 2025 report, which, as reported to Parliament, recognised strong legal frameworks and CIPA's digital front door but flagged insolvency, tax compliance and dispute resolution as areas needing attention. Sector rules are the most protective of citizen MSMEs in the region: fresh-produce and general-dealer licences, guesthouses and touristic transfer companies are reserved for citizens (MD p. 31-34), about 35 service sectors are restricted to citizens according to the US Commercial Service, and the Economic Inclusion Act 2021, in force since April 2022, promotes localisation and sub-contracting to citizen-owned enterprises. These rules create protected demand for citizen suppliers but close processing, distribution and transport to outside equity.</w:t>
+        <w:t xml:space="preserve"> (87th) combined good rankings for construction permits (44th), trading across borders (55th) and paying taxes (59th) with weak rankings for starting a business (159th), getting electricity (139th) and enforcing contracts (137th). The Companies and Intellectual Property Authority (CIPA) runs an online business registration system, which the Ministry of Trade and Entrepreneurship credits with faster turnaround times. Its 2026/27 budget speech also reported that the World Bank's B-READY 2025 report recognised Botswana's strong legal frameworks and CIPA's digital front door, but flagged insolvency, tax compliance, dispute resolution and market competition as areas needing attention; it announced a home-grown company registration system and a National Collateral Registry to improve SME access to credit (Ministry of Trade and Entrepreneurship, 2026). Sector rules are the most protective of citizen MSMEs in the region: fresh-produce and general-dealer licences, guesthouses and touristic transfer companies are reserved for citizens (MD p. 31-34), Botswana law reserves 35 service sectors for citizens (US International Trade Administration), and the Economic Inclusion Act 2021, in force since April 2022, provides for the participation of targeted citizens in the economy, including through procurement and licensing. These rules create protected demand for citizen suppliers but close processing, distribution and transport to outside equity.</w:t>
       </w:r>
     </w:p>
     <w:p>
@@ -15816,7 +15869,7 @@
       </w:r>
       <w:r>
         <w:rPr/>
-        <w:t xml:space="preserve"> (104th) ranked well for getting electricity (76th) and enforcing contracts (64th), the best of the five states, but poorly for starting a business (165th) and registering property (173rd). Formalisation remains the weak point: the Business and Intellectual Property Authority (BIPA) is procuring a new integrated online registration system, but its existing online system was reported not to be working in 2025, and BIPA has announced large-scale de-registration of companies that fail to file beneficial-ownership information. Namibia was a new entrant in the B-READY 2025 sample. In tourism, Namibia has a mature conservancy JV framework but low MSME value capture (MD p. 37, 40), and the introduction of visa-on-arrival fees for visitors from 31 countries in April 2025 has affected demand (Section 7.2).</w:t>
+        <w:t xml:space="preserve"> (104th) ranked well for getting electricity (76th) and enforcing contracts (64th), the best of the five states, but poorly for starting a business (165th) and registering property (173rd). Formalisation remains the weak point. In June 2024 the Business and Intellectual Property Authority (BIPA) said it was procuring an integrated online registration system expected within 18 to 24 months (The Brief, 2024); in May 2025 the responsible minister said the existing online system was not working (The Namibian, 2025); and in August 2025 BIPA announced that it would de-register about 1,000 non-compliant companies a month (The Brief, 2025). Namibia was among the new economies covered by the B-READY 2025 report (Ecofin, 2026). In tourism, Namibia has a mature conservancy JV framework but low MSME value capture (MD p. 37, 40), and the end of visa-free travel for 31 countries in April 2025 has affected demand from Europe (Section 7.2).</w:t>
       </w:r>
     </w:p>
     <w:p>
@@ -15834,7 +15887,7 @@
       </w:r>
       <w:r>
         <w:rPr/>
-        <w:t xml:space="preserve"> (85th) had the best overall ranking and strong scores for getting credit (4th) and paying taxes (17th), but weak ones for trading across borders (155th), registering property (149th) and enforcing contracts (130th). Licensing is the main recurring burden: a World Bank review found that more than a quarter of Zambian firms cite licensing as a major constraint, nearly double the regional average. The Business Regulatory Review Agency (BRRA) adopted risk-based guidelines in 2023 to focus licensing and inspections on higher-risk activities, and after a 2025 benchmarking visit to Mauritius it has said it will explore a single omnibus licence for tourism. Road service licences require at least 25% Zambian membership and all-Zambian directors unless the applicant holds a ZDA licence (MD p. 44), which favours local transport MSMEs.</w:t>
+        <w:t xml:space="preserve"> (85th) had the best overall ranking and strong scores for getting credit (4th) and paying taxes (17th), but weak ones for trading across borders (155th), registering property (149th) and enforcing contracts (130th). Licensing is the main recurring burden: more than a quarter of Zambian firms cite business licensing and permits as a major obstacle, nearly double the regional average, and Zambia is moving to risk-based regulation with World Bank support (World Bank, 2024). After a 2025 benchmarking mission to Mauritius, the Business Regulatory Review Agency (BRRA) began talks with the Ministry of Tourism and the Zambia Tourism Agency on adopting omnibus licensing, in which one licence covers several activities, for the accommodation sub-sector (Zambia Monitor, 2025). Road service licences require at least 25% Zambian membership and all-Zambian directors unless the applicant holds a ZDA licence (MD p. 44), which favours local transport MSMEs.</w:t>
       </w:r>
     </w:p>
     <w:p>
@@ -15852,7 +15905,7 @@
       </w:r>
       <w:r>
         <w:rPr/>
-        <w:t xml:space="preserve"> (140th) was among the World Bank's top 20 improvers in Doing Business 2020, rising 15 places after five reforms, including an improved online name search and lower municipal licence fees for new businesses, a deeds-registry tracking system and a new reorganisation procedure for insolvent firms. It still ranked low for starting a business (167th), getting electricity (167th), paying taxes (146th) and enforcing contracts (169th). The Zimbabwe Investment and Development Agency (ZIDA) runs a One Stop Investment Services Centre covering company registration, tax registration and clearance and licensing, and signed an agreement with ZIMRA in January 2024 to integrate electronic services. Ownership rules have tightened: in 2018 the indigenisation law was narrowed to reserved sectors that included passenger transport and the marketing and distribution of local arts and crafts, and Statutory Instrument 215 of 2025 expanded the reserved list to 14 sectors and requires foreign-owned businesses in them to transfer a controlling 75% stake to citizens within three years. This protects MSME space in transport and crafts but deters foreign joint-venture capital in those chains.</w:t>
+        <w:t xml:space="preserve"> (140th) rose 15 places in Doing Business 2020 and was among the World Bank's top 20 improvers, with reforms in five areas; improvements in starting a business, including lower business licensing fees in Harare, were the main driver (World Bank, 2019; The Herald). It still ranked low for starting a business (167th), getting electricity (167th), paying taxes (146th) and enforcing contracts (169th). The Zimbabwe Investment and Development Agency (ZIDA) runs a One Stop Investment Services Centre, and in January 2024 ZIDA and ZIMRA signed a memorandum of understanding to integrate their electronic and investor services (ZIMRA, 2024). Ownership rules have tightened. In 2018 the indigenisation law was narrowed to a list of sectors reserved for citizens that included passenger transport and the provision, marketing and distribution of local arts and crafts (Veritas, 2018). Statutory Instrument 215 of 2025 then set new rules for foreign participation in reserved sectors; press reports describe 14 reserved sectors and a requirement for foreign-owned businesses in them to transfer a 75% controlling stake to citizens within three years, although reports differ on the details (ZimLII; Daily News, 2025; Business Times, 2026). This protects MSME space in transport and crafts but deters foreign joint-venture capital in those chains.</w:t>
       </w:r>
     </w:p>
     <w:p>
@@ -15873,7 +15926,7 @@
       </w:pPr>
       <w:r>
         <w:rPr/>
-        <w:t>Regulation also shapes which MSMEs can exist in each chain and who can invest in them. The table below combines the Macro Diagnostic's findings with the later rules described above.</w:t>
+        <w:t>Regulation also shapes which MSMEs can exist in each chain and who can invest in them. The Macro Diagnostic's findings and the later rules described above combine as follows.</w:t>
       </w:r>
     </w:p>
     <w:p>
@@ -16063,7 +16116,7 @@
                 <w:sz w:val="18"/>
                 <w:szCs w:val="18"/>
               </w:rPr>
-              <w:t>Fresh-produce and general-dealer retail licences reserved for citizens; small-scale food and beverage manufacturing closed to foreign shareholding (MD p. 31). Foreign equity banned in touristic transfer companies (MD p. 32, 34). Guesthouses citizen-reserved (MD p. 34). Economic Inclusion Act 2021 promotes localisation and sub-contracting to citizen-owned enterprises</w:t>
+              <w:t>Fresh-produce and general-dealer retail licences reserved for citizens; small-scale food and beverage manufacturing closed to foreign shareholding (MD p. 31). Foreign equity banned in touristic transfer companies (MD p. 32, 34). Guesthouses citizen-reserved (MD p. 34). Economic Inclusion Act 2021 promotes participation of targeted citizens</w:t>
             </w:r>
           </w:p>
         </w:tc>
@@ -16143,7 +16196,7 @@
                 <w:sz w:val="18"/>
                 <w:szCs w:val="18"/>
               </w:rPr>
-              <w:t>Road service licences require at least 25% Zambian membership and all-Zambian directors unless the applicant holds a ZDA licence (MD p. 44). Multiple licences per activity; risk-based licensing and a tourism omnibus licence under consideration</w:t>
+              <w:t>Road service licences require at least 25% Zambian membership and all-Zambian directors unless the applicant holds a ZDA licence (MD p. 44). Licensing burden high; omnibus licensing for accommodation under discussion</w:t>
             </w:r>
           </w:p>
         </w:tc>
@@ -16223,7 +16276,7 @@
                 <w:sz w:val="18"/>
                 <w:szCs w:val="18"/>
               </w:rPr>
-              <w:t>Foreign shareholding capped at 49% in road passenger transport and 50% in road freight (MD p. 26). INAPEM certification needed for public credit lines and bank loans</w:t>
+              <w:t>Foreign shareholding capped at 49% in road passenger transport and 50% in road freight (MD p. 26). INAPEM certification requested by banks for loans</w:t>
             </w:r>
           </w:p>
         </w:tc>
@@ -16303,7 +16356,7 @@
                 <w:sz w:val="18"/>
                 <w:szCs w:val="18"/>
               </w:rPr>
-              <w:t>Withholding tax of 30% on payments to suppliers without tax clearance (MD p. 74; operator-reported). Reserved sectors for citizens include passenger transport and local arts and crafts marketing; SI 215 of 2025 expanded the list and requires 75% local ownership within three years</w:t>
+              <w:t>Withholding tax of 30% on payments to suppliers without tax clearance (MD p. 74; operator-reported). Reserved sectors for citizens include passenger transport and local arts and crafts; SI 215 of 2025 tightened rules on foreign participation</w:t>
             </w:r>
           </w:p>
         </w:tc>
@@ -16383,7 +16436,7 @@
                 <w:sz w:val="18"/>
                 <w:szCs w:val="18"/>
               </w:rPr>
-              <w:t>Conservancy JV framework; visa-on-arrival fees for 31 countries since April 2025 shifting some demand to Kasane/Chobe (MD p. 117-118); slow company registration</w:t>
+              <w:t>Conservancy JV framework; end of visa-free travel for 31 countries in April 2025, with demand shifting (MD p. 117-118); slow company registration</w:t>
             </w:r>
           </w:p>
         </w:tc>
@@ -16463,7 +16516,7 @@
                 <w:sz w:val="18"/>
                 <w:szCs w:val="18"/>
               </w:rPr>
-              <w:t>KAZA Univisa issued only by Zambia and Zimbabwe; COMESA Simplified Trade Regime covers Zambia and Zimbabwe only; cross-border supply chains less evidenced than visitor flows (MD p. 117-118)</w:t>
+              <w:t>KAZA Univisa operates for Zambia and Zimbabwe only; COMESA Simplified Trade Regime covers Zambia and Zimbabwe only; cross-border supply chains less evidenced than visitor flows (MD p. 117-118)</w:t>
             </w:r>
           </w:p>
         </w:tc>
@@ -16533,7 +16586,7 @@
       </w:r>
       <w:r>
         <w:rPr/>
-        <w:t>, a single visa for Zambia and Zimbabwe valid for up to 30 days, which also covers day trips into Botswana through Kazungula, is in operation; at the 2024 KAZA summit in Livingstone the five Partner States pledged to broaden its use and Botswana announced its adoption, but no source yet confirms that Botswana or Namibia issue it. Multi-country itineraries, which favour guiding, transfer and activity MSMEs along the Victoria Falls-Chobe corridor, therefore remain more costly to sell than they need to be.</w:t>
+        <w:t xml:space="preserve"> is used in Zambia and Zimbabwe and covers day trips into Botswana through Kazungula. At the KAZA heads of state summit in Livingstone in 2024, the five Partner States agreed in principle to broaden its use, and Botswana's Vice President said Botswana would fully adopt it, but no implementation date was given (TimesLIVE, 2024). Multi-country itineraries, which favour guiding, transfer and activity MSMEs along the Victoria Falls-Chobe corridor, therefore remain more costly to sell than they need to be.</w:t>
       </w:r>
     </w:p>
     <w:p>
@@ -16555,7 +16608,7 @@
       </w:r>
       <w:r>
         <w:rPr/>
-        <w:t xml:space="preserve"> (STR) allows traders to move consignments below a value threshold (USD 2,000 per consignment under the COMESA rule, although ZIMRA has published a USD 1,000 limit) across borders with simplified documents and duty-free treatment for goods on a common list. It applies between Zambia and Zimbabwe, both COMESA members, but not to Botswana, Namibia or Angola, for which SADC has been developing its own simplified regime. Uptake has been low. Simplified regimes and the one-stop border post at Kazungula could allow women traders and small producers to supply lodges across borders, but this depends on awareness, border-staff practice and a common SADC threshold.</w:t>
+        <w:t xml:space="preserve"> (STR) allows traders to move small consignments across borders with simplified documents. The COMESA threshold is USD 2,000 per consignment, adopted in 2014 and recommended to be maintained in a 2025 review (COMESA, 2025), but Zimbabwe has applied a lower limit because of exchange-control rules (ZIMRA). The STR applies between Zambia and Zimbabwe, both COMESA members, but not to Botswana, Namibia or Angola. Uptake has been low. A simplified regime that also covered the other KAZA states, together with awareness and border-staff practice at the Kazungula one-stop border post, could help women traders and small producers supply lodges across borders.</w:t>
       </w:r>
     </w:p>
     <w:p>
@@ -16573,7 +16626,7 @@
       </w:r>
       <w:r>
         <w:rPr/>
-        <w:t xml:space="preserve"> Regulation in KAZA is not the main reason MSMEs are not investment-ready, but it raises the cost of every step on the readiness pathway: registration takes weeks, tax clearance is costly in Zimbabwe, contracts cannot be relied on in court, and cross-border sourcing is hard. Programmes should therefore (i) help MSMEs through registration and tax clearance when a contract requires it, using one-stop centres where they work; (ii) design supplier finance around anchor-buyer payment routing rather than court enforcement; (iii) use Zambia's movable-collateral framework as a model for the others; and (iv) work with the KAZA Secretariat on Univisa adoption and a simplified regime for small cross-border suppliers.</w:t>
+        <w:t xml:space="preserve"> Regulation in KAZA is not the main reason MSMEs are not investment-ready, but it raises the cost of every step on the readiness pathway: registration takes weeks, tax clearance is costly in Zimbabwe, contracts cannot be relied on in court, and cross-border sourcing is hard. Programmes should therefore (i) help MSMEs through registration and tax clearance when a contract requires it, using one-stop centres where they work; (ii) design supplier finance around anchor-buyer payment routing rather than court enforcement; (iii) use Zambia's movable-collateral framework, Zimbabwe's collateral registry and Botswana's planned National Collateral Registry for small-supplier lending; and (iv) work with the KAZA Secretariat on Univisa adoption and a simplified regime for small cross-border suppliers.</w:t>
       </w:r>
     </w:p>
     <w:p>
@@ -16581,7 +16634,7 @@
         <w:pStyle w:val="Heading2"/>
         <w:rPr/>
       </w:pPr>
-      <w:bookmarkStart w:id="28" w:name="__RefHeading___Toc2986_616069264"/>
+      <w:bookmarkStart w:id="28" w:name="__RefHeading___Toc2999_3770744645"/>
       <w:bookmarkEnd w:id="28"/>
       <w:r>
         <w:rPr/>
@@ -16617,7 +16670,7 @@
       </w:pPr>
       <w:r>
         <w:rPr/>
-        <w:t>Visitor demand has largely recovered from the pandemic, but it is volatile and policy-sensitive. Namibia recorded about 1.3 million international arrivals in 2025, around 7% fewer than in 2024, after it introduced visa-on-arrival fees of N$1,600 for visitors from 31 countries in April 2025; the industry federation has been cautious in attributing the fall to the visa change, and hotel occupancy in August 2025 matched 2024 levels. Zimbabwe received 751,483 international arrivals in the first half of 2024, up 27% on the previous year, with tourism receipts estimated at USD 493 million for 2024. Botswana recorded between about 390,000 and 420,000 international arrivals a quarter in the second to fourth quarters of 2024 (Statistics Botswana). For MSMEs, the lesson is that demand is large enough to support local supply chains but can shift between neighbouring destinations quickly, as the Macro Diagnostic observes for Namibia and Kasane/Chobe (MD p. 117-118). Suppliers with several buyers, or buyers in more than one destination, are more resilient.</w:t>
+        <w:t>Visitor demand has largely recovered from the pandemic, but it is volatile and policy-sensitive. Namibia received 1,345,168 international visitors in 2025, 6.9% fewer than the 1,444,174 recorded in 2024, while tourist arrivals alone fell by 3.2% (The Namibian, 2026). European tourist arrivals fell by 21%, a drop the tourism ministry linked both to the April 2025 change in visa policy and to safety concerns (The Namibian, 2026). Visitors from non-African countries now pay N$1,600 for a visa on arrival, which the tourism federation FENATA describes as one of the highest fees in the region, and operators reported delays and inconsistent implementation in the first months (Tourism Update, 2025). In Zimbabwe, international arrivals rose by 27% to 751,483 in the first half of 2024, and tourism receipts, including domestic spending, reached an estimated USD 493 million in that half-year (Equity Axis, 2025, citing UN Tourism). Botswana recorded between 391,264 and 421,744 international tourist arrivals a quarter in the second to fourth quarters of 2024, about three-quarters of them from SADC countries (Statistics Botswana, 2026). For MSMEs, the lesson is that demand is large enough to support local supply chains but can shift between neighbouring destinations quickly, as the Macro Diagnostic observes for Namibia and Kasane/Chobe (MD p. 117-118). Suppliers with several buyers, or buyers in more than one destination, are more resilient.</w:t>
       </w:r>
     </w:p>
     <w:p>
@@ -16645,7 +16698,7 @@
       </w:r>
       <w:r>
         <w:rPr/>
-        <w:t xml:space="preserve"> is the best-documented case of anchor-led local procurement in KAZA. Its 2025 impact report states that more than 80% of its procurement by value came from Botswana-based suppliers, about BWP 292 million in the 2024-25 financial year, and its 2026 report puts the share at more than 86% when aviation, which must source parts internationally, is excluded. Local procurement is not the same as MSME procurement, however. Through a supplier development programme launched with a Local Supplier Expo in 2024, which attracted more than 110 citizen-owned enterprises, 68 businesses joined, 37 were supplying and 18 were under development, and annual contract value through the programme rose from BWP 6.3 million to BWP 15 million. That is roughly 5% of the company's local purchases, which shows both that small citizen suppliers can be brought into a large operator's supply chain and how much room remains. The programme is now linked to finance through the 2025 Wilderness-Stanbic contract-backed facility and to BDS through the 2026 Wilderness-LEA memorandum of understanding (Financial Landscape Analysis).</w:t>
+        <w:t xml:space="preserve"> is the best-documented case of anchor-led local procurement in KAZA. It reports buying about BWP 292 million a year from Botswana-registered businesses, more than 80% of its procurement by value (Daily News, 2025), and its 2026 impact report puts the share at more than 86% when aviation, which must source parts internationally, is excluded (ATTA, 2026). Local procurement is not the same as MSME procurement, however. Wilderness's first Local Supplier Expo in Maun in 2024 hosted 110 local vendors and led to more than BWP 6.2 million of new contracts for citizen-owned businesses, a figure that had passed BWP 8 million by mid-2025 (Daily News, 2025), and 68 businesses have joined its supplier development programme (Mmegi, 2026). New contracts of this size are equivalent to about 3% of the company's annual local purchases, which shows both that small citizen suppliers can be brought into a large operator's supply chain and how much room remains. The programme is linked to finance through a 2025 memorandum with Stanbic Bank Botswana, under which Stanbic lends to SMMEs holding Wilderness supply contracts without traditional collateral and is repaid from contract payments that the suppliers cede to the bank (Mmegi, 2025), and to BDS through a 2026 memorandum with LEA that launched a Citizen Economic Empowerment Programme (Mmegi, 2026).</w:t>
       </w:r>
     </w:p>
     <w:p>
@@ -16663,7 +16716,7 @@
       </w:r>
       <w:r>
         <w:rPr/>
-        <w:t xml:space="preserve"> buys food, beverages, construction materials and other products from Namibian suppliers and supports small enterprises near its lodges. Its curio shops and online store carry goods by local artisans and women's associations, and at one recently opened lodge it reports that 82% of the items on display were locally crafted and selected by its procurement team. This is a useful counterpoint to the finding that about 80% of lodge décor in the Kavango and Zambezi regions is imported (MD p. 70): where an operator builds local sourcing into design and procurement from the start, local suppliers can meet lodge specifications.</w:t>
+        <w:t xml:space="preserve"> supports Namibian-owned suppliers and wholesalers and diversifies its supplier base by supporting small enterprises near its lodges (Gondwana Collection). At its Etosha King Nehale lodge, more than 80% of the items in the curio shop are locally crafted (Gondwana Collection). This is a useful counterpoint to the finding that about 80% of lodge décor in the Kavango and Zambezi regions is imported (MD p. 70): where an operator builds local sourcing into design and procurement from the start, local suppliers can meet lodge specifications.</w:t>
       </w:r>
     </w:p>
     <w:p>
@@ -16681,7 +16734,7 @@
       </w:r>
       <w:r>
         <w:rPr/>
-        <w:t xml:space="preserve"> have brought smallholder farmers into their supply chains. The operator of the Royal Livingstone and AVANI Victoria Falls hotels reports that local smallholders who once sold at roadside stands now sell most of their produce to hotels under long-term contracts, and that the hotels invested in the Maramba Women's Mushroom Farm. A University of Pretoria study of tourism-agriculture linkages in Livingstone found that local procurement is the dominant channel and includes smallholders, but that supply, demand and marketing constraints limit how deeply smallholders are integrated. These findings mirror the Macro Diagnostic's evidence from Hwange (MD p. 75).</w:t>
+        <w:t xml:space="preserve"> have brought smallholder farmers into their supply chains. The Royal Livingstone hotel runs a fortnightly smallholder farmers' market at which it buys crops directly from local smallholders, who previously relied on roadside sales and middlemen, and it helped save the Maramba Women's Mushroom Farm, whose members now sell most of their produce to local hotels and resorts under long-term contracts (Anantara, operator-reported). A University of Pretoria doctoral study of tourism-agriculture linkages in Livingstone found that local procurement is the dominant channel and includes smallholders, but that supply, demand and marketing constraints limit how deeply smallholders are integrated (Nsanzya, University of Pretoria). These findings mirror the Macro Diagnostic's evidence from Hwange (MD p. 75).</w:t>
       </w:r>
     </w:p>
     <w:p>
@@ -16702,7 +16755,7 @@
       </w:pPr>
       <w:r>
         <w:rPr/>
-        <w:t>Earlier research shows what is at stake. Studies of the Okavango Delta described an enclave tourism economy in which foreign ownership led to revenue being repatriated and in which weak links with domestic agriculture limited tourism's effect on rural poverty (Mbaiwa, 2005). In 2016 Botswana's tourism ministry told Parliament that 30-40% of the revenue from holidays booked through foreign operators remained in the source countries. ODI's value-chain studies of tourism destinations found that the share of destination revenue reaching poor households ranged from about 5% to more than 25%, and used value-chain analysis to find where interventions in supply chains, crafts and excursions could raise it. The priority chains identified in this assessment are therefore also the main levers for local value capture.</w:t>
+        <w:t>Earlier research shows what is at stake. A study of the Okavango Delta found that foreign ownership of tourism facilities led to revenue being repatriated, that expatriates dominated management, and that weak links with the domestic economy, particularly agriculture, limited tourism's contribution to rural development (Mbaiwa, 2005). The problem persists: Botswana's tourism ministry has said it is reviewing the Tourism Act to require tourists to pay in full in Botswana, in local currency, because of revenue repatriation, and is finalising a Tourism Leakages Study (Daily News). ODI's value-chain studies of tourism destinations found that the share of destination revenue reaching poor households ranged from about 5% to more than 25% depending on context (Ashley and Mitchell, 2007). The priority chains identified in this assessment are the main levers for raising that share in KAZA.</w:t>
       </w:r>
     </w:p>
     <w:p>
@@ -16825,7 +16878,7 @@
         <w:pStyle w:val="Heading2"/>
         <w:rPr/>
       </w:pPr>
-      <w:bookmarkStart w:id="29" w:name="__RefHeading___Toc2988_616069264"/>
+      <w:bookmarkStart w:id="29" w:name="__RefHeading___Toc3001_3770744645"/>
       <w:bookmarkEnd w:id="29"/>
       <w:r>
         <w:rPr/>
@@ -16868,7 +16921,7 @@
       </w:r>
       <w:r>
         <w:rPr/>
-        <w:t xml:space="preserve"> (Instituto Nacional de Apoio às Micro, Pequenas e Médias Empresas) is the lead public BSO. It certifies MSMEs, which gives access to tax benefits and public credit lines and is required by banks for loan applications; in Benguela province alone it certified more than 3,500 micro, small and medium enterprises in 2025. It also provides training and business-plan support and is building a national network of incubators with Spanish cooperation support (FIIAPP) running to 2028; its first decentralised incubation programme, Tuendi, is in Huíla province. The EU-funded Envolver project (2019-2024), implemented with Portugal's IAPMEI, qualified 2,384 MSMEs and trained 574 financial-institution staff and 376 mentors, and its successor, Envolver+, runs to 2028. Other BSOs include the one-stop </w:t>
+        <w:t xml:space="preserve"> (Instituto Nacional de Apoio às Micro, Pequenas e Médias Empresas) is the lead public BSO. It certifies MSMEs, which gives access to tax benefits and is requested by banks for loan applications; in Benguela province alone it certified 3,595 enterprises in 2025, of which 3,137 were micro, 321 small and 137 medium (AllAfrica, 2026). It also provides training and business-plan support. The EU-funded Envolver project (2019-2024) qualified 2,384 MSMEs and trained 574 financial-institution staff and 376 mentors, and its successor, Envolver+, an EU twinning project led by Portugal's IAPMEI with Spain and Germany, is helping INAPEM to create and manage a national network of certified incubators between September 2025 and June 2028 with a budget of EUR 2.5 million (Ver Angola, 2025; FIIAPP). INAPEM's first decentralised incubation programme, Tuendi, started in Huíla province (Forbes África Lusófona, 2025). Other BSOs include the one-stop </w:t>
       </w:r>
       <w:r>
         <w:rPr>
@@ -16879,7 +16932,7 @@
       </w:r>
       <w:r>
         <w:rPr/>
-        <w:t xml:space="preserve"> for registration, </w:t>
+        <w:t xml:space="preserve"> and Guiché Único da Empresa for registration, </w:t>
       </w:r>
       <w:r>
         <w:rPr>
@@ -16912,7 +16965,7 @@
       </w:r>
       <w:r>
         <w:rPr/>
-        <w:t>, the conservation area authority and NGOs such as The HALO Trust and the National Geographic Okavango Wilderness Project are more present than enterprise BSOs. No tourism-specific BDS was identified in the KAZA area.</w:t>
+        <w:t>, the conservation area authority and NGOs such as The HALO Trust and the National Geographic Okavango Wilderness Project are more present than enterprise BSOs (Financial Landscape Analysis). No tourism-specific BDS was identified in the KAZA area.</w:t>
       </w:r>
     </w:p>
     <w:p>
@@ -16944,7 +16997,7 @@
       </w:r>
       <w:r>
         <w:rPr/>
-        <w:t xml:space="preserve"> is the lead BSO for citizen MSMEs, providing business development, mentoring, incubation and supplier-readiness support, including record-keeping support to tourism enterprises. Its 2026 memorandum of understanding with Wilderness to bring citizen businesses into lodge supply chains is the most direct tourism supplier-development partnership in KAZA. LEA's capacity has been reduced by restructuring, its planned new offices are outside the KAZA hubs, and its merger with </w:t>
+        <w:t xml:space="preserve"> is the lead BSO for citizen MSMEs, providing business development, mentoring and supplier-readiness support, including record-keeping support to tourism enterprises (Financial Landscape Analysis). Its 2026 memorandum of understanding with Wilderness, which launched a Citizen Economic Empowerment Programme to bring more citizen-owned businesses into the company's supply chain, is the most direct tourism supplier-development partnership in KAZA (Mmegi, 2026). </w:t>
       </w:r>
       <w:r>
         <w:rPr>
@@ -16955,73 +17008,193 @@
       </w:r>
       <w:r>
         <w:rPr/>
-        <w:t xml:space="preserve"> has been pending since at least 2023; in the meantime the two agencies have agreed that desk officers can operate from each other's offices where one lacks a local presence. </w:t>
+        <w:t xml:space="preserve"> provides citizen enterprise finance with post-loan mentoring. The </w:t>
       </w:r>
       <w:r>
         <w:rPr>
           <w:b/>
           <w:bCs/>
         </w:rPr>
-        <w:t>CEDA</w:t>
-      </w:r>
-      <w:r>
-        <w:rPr/>
-        <w:t xml:space="preserve"> offers post-loan mentoring alongside finance. The </w:t>
+        <w:t>Botswana Tourism Organisation (BTO)</w:t>
+      </w:r>
+      <w:r>
+        <w:rPr/>
+        <w:t xml:space="preserve"> supports grading, product development and citizen tourism enterprise. </w:t>
       </w:r>
       <w:r>
         <w:rPr>
           <w:b/>
           <w:bCs/>
         </w:rPr>
-        <w:t>Botswana Tourism Organisation (BTO)</w:t>
-      </w:r>
-      <w:r>
-        <w:rPr/>
-        <w:t xml:space="preserve"> supports grading, product development and citizen tourism enterprise. </w:t>
+        <w:t>HATAB</w:t>
+      </w:r>
+      <w:r>
+        <w:rPr/>
+        <w:t xml:space="preserve"> represents the hospitality industry and has a partnership with Stanbic Bank Botswana to advance tourism, </w:t>
       </w:r>
       <w:r>
         <w:rPr>
           <w:b/>
           <w:bCs/>
         </w:rPr>
-        <w:t>HATAB</w:t>
-      </w:r>
-      <w:r>
-        <w:rPr/>
-        <w:t xml:space="preserve"> represents the hospitality industry and has a partnership with Stanbic Bank Botswana to advance tourism, </w:t>
+        <w:t>WIBA</w:t>
+      </w:r>
+      <w:r>
+        <w:rPr/>
+        <w:t xml:space="preserve"> supports women entrepreneurs, and the </w:t>
       </w:r>
       <w:r>
         <w:rPr>
           <w:b/>
           <w:bCs/>
         </w:rPr>
-        <w:t>WIBA</w:t>
-      </w:r>
-      <w:r>
-        <w:rPr/>
-        <w:t xml:space="preserve"> supports women entrepreneurs, and the </w:t>
+        <w:t>Botswana Guides Association</w:t>
+      </w:r>
+      <w:r>
+        <w:rPr/>
+        <w:t xml:space="preserve"> and </w:t>
       </w:r>
       <w:r>
         <w:rPr>
           <w:b/>
           <w:bCs/>
         </w:rPr>
-        <w:t>Botswana Guides Association</w:t>
-      </w:r>
-      <w:r>
-        <w:rPr/>
-        <w:t xml:space="preserve"> and </w:t>
+        <w:t>BOCOBONET</w:t>
+      </w:r>
+      <w:r>
+        <w:rPr/>
+        <w:t xml:space="preserve"> represent guides and community trusts (Financial Landscape Analysis). Private anchor programmes, notably Wilderness's supplier development programme and Local Supplier Expo, now act as BSOs in their own right (Section 7.2).</w:t>
+      </w:r>
+    </w:p>
+    <w:p>
+      <w:pPr>
+        <w:pStyle w:val="Heading3"/>
+        <w:rPr/>
+      </w:pPr>
+      <w:r>
+        <w:rPr/>
+        <w:t>Namibia</w:t>
+      </w:r>
+    </w:p>
+    <w:p>
+      <w:pPr>
+        <w:pStyle w:val="Normal"/>
+        <w:jc w:val="both"/>
+        <w:rPr/>
+      </w:pPr>
+      <w:r>
+        <w:rPr/>
+        <w:t xml:space="preserve">The </w:t>
       </w:r>
       <w:r>
         <w:rPr>
           <w:b/>
           <w:bCs/>
         </w:rPr>
-        <w:t>BOCOBONET</w:t>
-      </w:r>
-      <w:r>
-        <w:rPr/>
-        <w:t xml:space="preserve"> represent guides and community trusts. Private anchor programmes, notably Wilderness's supplier development programme, now act as BSOs in their own right.</w:t>
+        <w:t>Namibia Investment Promotion and Development Board (NIPDB)</w:t>
+      </w:r>
+      <w:r>
+        <w:rPr/>
+        <w:t xml:space="preserve"> is the national coordinator of MSME development across sectors (NIPDB). Its K2G High Potential Pool supports export-ready micro and small businesses with at least 51% Namibian ownership for 36 months; NIPDB does not lend or give grants itself, but partner banks pledged N$300,000 to the pool in 2023 (NIPDB). With the National Planning Commission and GIZ, NIPDB also runs an N$18 million SME fund financed by the German development ministry, which offers grants of N$50,000 to N$100,000 with pitch coaching and business advice and gives priority to youth-owned (aged 18 to 34) and women-owned businesses, social enterprises and cooperatives (The Namibian). </w:t>
+      </w:r>
+      <w:r>
+        <w:rPr>
+          <w:b/>
+          <w:bCs/>
+        </w:rPr>
+        <w:t>BIPA</w:t>
+      </w:r>
+      <w:r>
+        <w:rPr/>
+        <w:t xml:space="preserve"> handles registration (Section 7.1). The </w:t>
+      </w:r>
+      <w:r>
+        <w:rPr>
+          <w:b/>
+          <w:bCs/>
+        </w:rPr>
+        <w:t>Namibia Chamber of Commerce and Industry</w:t>
+      </w:r>
+      <w:r>
+        <w:rPr/>
+        <w:t xml:space="preserve"> has branches in the Zambezi and Kavango regions, and the </w:t>
+      </w:r>
+      <w:r>
+        <w:rPr>
+          <w:b/>
+          <w:bCs/>
+        </w:rPr>
+        <w:t>Namibia Tourism Board</w:t>
+      </w:r>
+      <w:r>
+        <w:rPr/>
+        <w:t xml:space="preserve">, </w:t>
+      </w:r>
+      <w:r>
+        <w:rPr>
+          <w:b/>
+          <w:bCs/>
+        </w:rPr>
+        <w:t>FENATA</w:t>
+      </w:r>
+      <w:r>
+        <w:rPr/>
+        <w:t xml:space="preserve">, </w:t>
+      </w:r>
+      <w:r>
+        <w:rPr>
+          <w:b/>
+          <w:bCs/>
+        </w:rPr>
+        <w:t>HAN</w:t>
+      </w:r>
+      <w:r>
+        <w:rPr/>
+        <w:t xml:space="preserve"> and the Tour and Safari Association represent and register tourism businesses. For community enterprise, </w:t>
+      </w:r>
+      <w:r>
+        <w:rPr>
+          <w:b/>
+          <w:bCs/>
+        </w:rPr>
+        <w:t>NACSO</w:t>
+      </w:r>
+      <w:r>
+        <w:rPr/>
+        <w:t xml:space="preserve">, </w:t>
+      </w:r>
+      <w:r>
+        <w:rPr>
+          <w:b/>
+          <w:bCs/>
+        </w:rPr>
+        <w:t>IRDNC</w:t>
+      </w:r>
+      <w:r>
+        <w:rPr/>
+        <w:t xml:space="preserve"> and the </w:t>
+      </w:r>
+      <w:r>
+        <w:rPr>
+          <w:b/>
+          <w:bCs/>
+        </w:rPr>
+        <w:t>Namibia Nature Foundation</w:t>
+      </w:r>
+      <w:r>
+        <w:rPr/>
+        <w:t xml:space="preserve"> have long supported conservancies in the Zambezi and Kavango regions, and the </w:t>
+      </w:r>
+      <w:r>
+        <w:rPr>
+          <w:b/>
+          <w:bCs/>
+        </w:rPr>
+        <w:t>Development Bank of Namibia</w:t>
+      </w:r>
+      <w:r>
+        <w:rPr/>
+        <w:t xml:space="preserve"> combines tourism finance with advisory support (Financial Landscape Analysis). NIPDB's programmes are national and not tourism-specific, so a KAZA supplier-development service would need to be built with the conservancy support organisations and lodge operators.</w:t>
       </w:r>
     </w:p>
     <w:p>
@@ -17031,7 +17204,7 @@
       </w:pPr>
       <w:r>
         <w:rPr/>
-        <w:t>Namibia</w:t>
+        <w:t>Zambia</w:t>
       </w:r>
     </w:p>
     <w:p>
@@ -17049,317 +17222,186 @@
           <w:b/>
           <w:bCs/>
         </w:rPr>
-        <w:t>Namibia Investment Promotion and Development Board (NIPDB)</w:t>
-      </w:r>
-      <w:r>
-        <w:rPr/>
-        <w:t xml:space="preserve"> is the national coordinator of MSME development across sectors. Its High Potential Pool, sponsored by Nedbank, gives about 60 selected MSMEs a 36-month package of support, and it administers an SME support fund with the National Planning Commission and GIZ, financed by the German government, for enterprises with at least 51% Namibian ownership. </w:t>
+        <w:t>Zambia Development Agency (ZDA)</w:t>
+      </w:r>
+      <w:r>
+        <w:rPr/>
+        <w:t xml:space="preserve"> promotes MSME development and investment, and the </w:t>
       </w:r>
       <w:r>
         <w:rPr>
           <w:b/>
           <w:bCs/>
         </w:rPr>
-        <w:t>BIPA</w:t>
-      </w:r>
-      <w:r>
-        <w:rPr/>
-        <w:t xml:space="preserve"> handles registration. The </w:t>
+        <w:t>Citizens Economic Empowerment Commission (CEEC)</w:t>
+      </w:r>
+      <w:r>
+        <w:rPr/>
+        <w:t xml:space="preserve"> provides concessional finance. The two have signed an agreement to provide SMEs with both financial and non-financial business development services, enrol high-potential businesses in entrepreneurship programmes and link funded SMEs and cooperatives to supermarkets and regional markets such as COMESA (Zambia Monitor). The </w:t>
       </w:r>
       <w:r>
         <w:rPr>
           <w:b/>
           <w:bCs/>
         </w:rPr>
-        <w:t>Namibia Chamber of Commerce and Industry</w:t>
-      </w:r>
-      <w:r>
-        <w:rPr/>
-        <w:t xml:space="preserve"> has branches in the Zambezi and Kavango regions, and the </w:t>
+        <w:t>Ministry of Small and Medium Enterprise Development</w:t>
+      </w:r>
+      <w:r>
+        <w:rPr/>
+        <w:t xml:space="preserve"> sets MSME policy, the </w:t>
       </w:r>
       <w:r>
         <w:rPr>
           <w:b/>
           <w:bCs/>
         </w:rPr>
-        <w:t>Namibia Tourism Board</w:t>
-      </w:r>
-      <w:r>
-        <w:rPr/>
-        <w:t xml:space="preserve">, </w:t>
+        <w:t>BRRA</w:t>
+      </w:r>
+      <w:r>
+        <w:rPr/>
+        <w:t xml:space="preserve"> leads licensing reform, and the </w:t>
       </w:r>
       <w:r>
         <w:rPr>
           <w:b/>
           <w:bCs/>
         </w:rPr>
-        <w:t>FENATA</w:t>
-      </w:r>
-      <w:r>
-        <w:rPr/>
-        <w:t xml:space="preserve">, </w:t>
+        <w:t>Zambia Chamber of Small and Medium Business Associations</w:t>
+      </w:r>
+      <w:r>
+        <w:rPr/>
+        <w:t xml:space="preserve"> represents MSMEs. In tourism, the </w:t>
       </w:r>
       <w:r>
         <w:rPr>
           <w:b/>
           <w:bCs/>
         </w:rPr>
-        <w:t>HAN</w:t>
-      </w:r>
-      <w:r>
-        <w:rPr/>
-        <w:t xml:space="preserve"> and the Tour and Safari Association represent and register tourism businesses. For community enterprise, </w:t>
+        <w:t>Tourism Council of Zambia</w:t>
+      </w:r>
+      <w:r>
+        <w:rPr/>
+        <w:t xml:space="preserve"> and the </w:t>
       </w:r>
       <w:r>
         <w:rPr>
           <w:b/>
           <w:bCs/>
         </w:rPr>
-        <w:t>NACSO</w:t>
-      </w:r>
-      <w:r>
-        <w:rPr/>
-        <w:t xml:space="preserve">, </w:t>
+        <w:t>Livingstone Tourism Association</w:t>
+      </w:r>
+      <w:r>
+        <w:rPr/>
+        <w:t xml:space="preserve"> represent operators, and the </w:t>
       </w:r>
       <w:r>
         <w:rPr>
           <w:b/>
           <w:bCs/>
         </w:rPr>
-        <w:t>IRDNC</w:t>
-      </w:r>
-      <w:r>
-        <w:rPr/>
-        <w:t xml:space="preserve"> and the </w:t>
+        <w:t>Hotel and Tourism Training Institute</w:t>
+      </w:r>
+      <w:r>
+        <w:rPr/>
+        <w:t xml:space="preserve"> and Livingstone's tourism university provide skills (Financial Landscape Analysis). Youth-focused BDS is emerging: in June 2025, UNDP and the Ministry of Youth, Sport and Arts launched a programme, implemented by BongoHive, to support 200 youth-led MSMEs in Livingstone, Kitwe and Lusaka, with grants for the five best performers in a regional pitch competition (UNDP Zambia, 2025). </w:t>
       </w:r>
       <w:r>
         <w:rPr>
           <w:b/>
           <w:bCs/>
         </w:rPr>
-        <w:t>Namibia Nature Foundation</w:t>
-      </w:r>
-      <w:r>
-        <w:rPr/>
-        <w:t xml:space="preserve"> have long supported conservancies in the Zambezi and Kavango regions, and the </w:t>
+        <w:t>Peace Parks Foundation</w:t>
+      </w:r>
+      <w:r>
+        <w:rPr/>
+        <w:t xml:space="preserve"> supports community enterprise around Simalaha and Sioma Ngwezi.</w:t>
+      </w:r>
+    </w:p>
+    <w:p>
+      <w:pPr>
+        <w:pStyle w:val="Heading3"/>
+        <w:rPr/>
+      </w:pPr>
+      <w:r>
+        <w:rPr/>
+        <w:t>Zimbabwe</w:t>
+      </w:r>
+    </w:p>
+    <w:p>
+      <w:pPr>
+        <w:pStyle w:val="Normal"/>
+        <w:jc w:val="both"/>
+        <w:rPr/>
+      </w:pPr>
+      <w:r>
+        <w:rPr/>
+        <w:t xml:space="preserve">The </w:t>
       </w:r>
       <w:r>
         <w:rPr>
           <w:b/>
           <w:bCs/>
         </w:rPr>
-        <w:t>Development Bank of Namibia</w:t>
-      </w:r>
-      <w:r>
-        <w:rPr/>
-        <w:t xml:space="preserve"> combines tourism finance with advisory support. Private operators such as Gondwana run their own local procurement. NIPDB's programmes are national and not tourism-specific, so a KAZA supplier-development service would need to be built with the conservancy support organisations and lodge operators.</w:t>
-      </w:r>
-    </w:p>
-    <w:p>
-      <w:pPr>
-        <w:pStyle w:val="Heading3"/>
-        <w:rPr/>
-      </w:pPr>
-      <w:r>
-        <w:rPr/>
-        <w:t>Zambia</w:t>
-      </w:r>
-    </w:p>
-    <w:p>
-      <w:pPr>
-        <w:pStyle w:val="Normal"/>
-        <w:jc w:val="both"/>
-        <w:rPr/>
-      </w:pPr>
-      <w:r>
-        <w:rPr/>
-        <w:t xml:space="preserve">The </w:t>
+        <w:t>Small and Medium Enterprises Development Corporation (SMEDCO)</w:t>
+      </w:r>
+      <w:r>
+        <w:rPr/>
+        <w:t xml:space="preserve">, a state development finance institution, combines lending with capacity building for MSMEs and cooperatives. It is rolling out a USD 15 million programme to build commercial and industrial facilities for small businesses in key economic centres (Business Times), and it has signed a memorandum of understanding with the Zimbabwe Stock Exchange to help SMEs prepare for the new Zimbabwe Entrepreneurship Exchange (ZEEX), including support for formalisation, governance and investment readiness (Newsday, 2026). </w:t>
       </w:r>
       <w:r>
         <w:rPr>
           <w:b/>
           <w:bCs/>
         </w:rPr>
-        <w:t>Zambia Development Agency (ZDA)</w:t>
-      </w:r>
-      <w:r>
-        <w:rPr/>
-        <w:t xml:space="preserve"> promotes MSME development and investment, and the </w:t>
+        <w:t>ZIDA</w:t>
+      </w:r>
+      <w:r>
+        <w:rPr/>
+        <w:t xml:space="preserve">'s one-stop centre handles investor registration, tax and licensing services (Section 7.1). </w:t>
       </w:r>
       <w:r>
         <w:rPr>
           <w:b/>
           <w:bCs/>
         </w:rPr>
-        <w:t>Citizens Economic Empowerment Commission (CEEC)</w:t>
-      </w:r>
-      <w:r>
-        <w:rPr/>
-        <w:t xml:space="preserve"> provides concessional finance. The two have agreed to combine CEEC's finance with ZDA's non-financial BDS, enrol high-potential businesses in entrepreneurship programmes and link funded SMEs and cooperatives to supermarkets and regional markets such as COMESA. CEEC funding is being reset under a new framework, and pending applications were halted while it is introduced. The </w:t>
+        <w:t>ZimTrade</w:t>
+      </w:r>
+      <w:r>
+        <w:rPr/>
+        <w:t xml:space="preserve"> supports market linkages and exports, and the </w:t>
       </w:r>
       <w:r>
         <w:rPr>
           <w:b/>
           <w:bCs/>
         </w:rPr>
-        <w:t>Ministry of Small and Medium Enterprise Development</w:t>
-      </w:r>
-      <w:r>
-        <w:rPr/>
-        <w:t xml:space="preserve"> sets MSME policy, the </w:t>
+        <w:t>Zimbabwe Tourism Authority</w:t>
+      </w:r>
+      <w:r>
+        <w:rPr/>
+        <w:t xml:space="preserve"> registers and grades tourism businesses. The </w:t>
       </w:r>
       <w:r>
         <w:rPr>
           <w:b/>
           <w:bCs/>
         </w:rPr>
-        <w:t>BRRA</w:t>
-      </w:r>
-      <w:r>
-        <w:rPr/>
-        <w:t xml:space="preserve"> leads licensing reform, and the </w:t>
+        <w:t>Tourism Business Council of Zimbabwe</w:t>
+      </w:r>
+      <w:r>
+        <w:rPr/>
+        <w:t xml:space="preserve">, the Hospitality Association of Zimbabwe and guiding and safari associations represent operators, and the </w:t>
       </w:r>
       <w:r>
         <w:rPr>
           <w:b/>
           <w:bCs/>
         </w:rPr>
-        <w:t>Zambia Chamber of Small and Medium Business Associations</w:t>
-      </w:r>
-      <w:r>
-        <w:rPr/>
-        <w:t xml:space="preserve"> represents MSMEs. In tourism, the </w:t>
-      </w:r>
-      <w:r>
-        <w:rPr>
-          <w:b/>
-          <w:bCs/>
-        </w:rPr>
-        <w:t>Tourism Council of Zambia</w:t>
-      </w:r>
-      <w:r>
-        <w:rPr/>
-        <w:t xml:space="preserve"> and the </w:t>
-      </w:r>
-      <w:r>
-        <w:rPr>
-          <w:b/>
-          <w:bCs/>
-        </w:rPr>
-        <w:t>Livingstone Tourism Association</w:t>
-      </w:r>
-      <w:r>
-        <w:rPr/>
-        <w:t xml:space="preserve"> represent operators, and the </w:t>
-      </w:r>
-      <w:r>
-        <w:rPr>
-          <w:b/>
-          <w:bCs/>
-        </w:rPr>
-        <w:t>Hotel and Tourism Training Institute</w:t>
-      </w:r>
-      <w:r>
-        <w:rPr/>
-        <w:t xml:space="preserve"> and Livingstone's tourism university provide skills. Youth-focused BDS is emerging: in June 2025, UNDP and the Ministry of Youth launched a programme to train 200 youth-led MSMEs in Livingstone, Kitwe and Lusaka. </w:t>
-      </w:r>
-      <w:r>
-        <w:rPr>
-          <w:b/>
-          <w:bCs/>
-        </w:rPr>
-        <w:t>Peace Parks Foundation</w:t>
-      </w:r>
-      <w:r>
-        <w:rPr/>
-        <w:t xml:space="preserve"> supports community enterprise around Simalaha and Sioma Ngwezi.</w:t>
-      </w:r>
-    </w:p>
-    <w:p>
-      <w:pPr>
-        <w:pStyle w:val="Heading3"/>
-        <w:rPr/>
-      </w:pPr>
-      <w:r>
-        <w:rPr/>
-        <w:t>Zimbabwe</w:t>
-      </w:r>
-    </w:p>
-    <w:p>
-      <w:pPr>
-        <w:pStyle w:val="Normal"/>
-        <w:jc w:val="both"/>
-        <w:rPr/>
-      </w:pPr>
-      <w:r>
-        <w:rPr/>
-        <w:t xml:space="preserve">The </w:t>
-      </w:r>
-      <w:r>
-        <w:rPr>
-          <w:b/>
-          <w:bCs/>
-        </w:rPr>
-        <w:t>Small and Medium Enterprises Development Corporation (SMEDCO)</w:t>
-      </w:r>
-      <w:r>
-        <w:rPr/>
-        <w:t xml:space="preserve">, under the Ministry of Women Affairs, Community, Small and Medium Enterprises Development, combines lending with capacity building for MSMEs and cooperatives. It is investing USD 15 million in modern MSME hubs and provincial business centres, with the first hub due in late 2026, and has signed an agreement with the Zimbabwe Stock Exchange to develop a Zimbabwe Entrepreneurship Exchange (ZEEX) that would support formalisation, governance and investment readiness. </w:t>
-      </w:r>
-      <w:r>
-        <w:rPr>
-          <w:b/>
-          <w:bCs/>
-        </w:rPr>
-        <w:t>ZIDA</w:t>
-      </w:r>
-      <w:r>
-        <w:rPr/>
-        <w:t xml:space="preserve">'s one-stop centre handles registration, tax clearance and licensing. </w:t>
-      </w:r>
-      <w:r>
-        <w:rPr>
-          <w:b/>
-          <w:bCs/>
-        </w:rPr>
-        <w:t>ZimTrade</w:t>
-      </w:r>
-      <w:r>
-        <w:rPr/>
-        <w:t xml:space="preserve"> supports market linkages and exports, and the </w:t>
-      </w:r>
-      <w:r>
-        <w:rPr>
-          <w:b/>
-          <w:bCs/>
-        </w:rPr>
-        <w:t>Zimbabwe Tourism Authority</w:t>
-      </w:r>
-      <w:r>
-        <w:rPr/>
-        <w:t xml:space="preserve"> registers and grades tourism businesses. The </w:t>
-      </w:r>
-      <w:r>
-        <w:rPr>
-          <w:b/>
-          <w:bCs/>
-        </w:rPr>
-        <w:t>Tourism Business Council of Zimbabwe</w:t>
-      </w:r>
-      <w:r>
-        <w:rPr/>
-        <w:t xml:space="preserve">, the Hospitality Association of Zimbabwe and guiding and safari associations represent operators, and the </w:t>
-      </w:r>
-      <w:r>
-        <w:rPr>
-          <w:b/>
-          <w:bCs/>
-        </w:rPr>
         <w:t>CAMPFIRE Association</w:t>
       </w:r>
       <w:r>
         <w:rPr/>
-        <w:t xml:space="preserve"> represents communities in CAMPFIRE districts such as Hwange and Binga. Earlier destination programmes offered marketing training and mentoring to SMEs in Victoria Falls. Women- and youth-focused finance comes from the Zimbabwe Women's Microfinance Bank and EmpowerBank.</w:t>
+        <w:t xml:space="preserve"> represents communities in CAMPFIRE districts such as Hwange and Binga. Women- and youth-focused finance comes from the Zimbabwe Women's Microfinance Bank and EmpowerBank (Financial Landscape Analysis).</w:t>
       </w:r>
     </w:p>
     <w:p>
@@ -17691,7 +17733,7 @@
                 <w:sz w:val="18"/>
                 <w:szCs w:val="18"/>
               </w:rPr>
-              <w:t>Low (provincial delegation; no tourism BDS)</w:t>
+              <w:t>Low (no tourism BDS identified)</w:t>
             </w:r>
           </w:p>
         </w:tc>
@@ -17821,7 +17863,7 @@
                 <w:sz w:val="18"/>
                 <w:szCs w:val="18"/>
               </w:rPr>
-              <w:t>Medium (Maun, Kasane); capacity reduced</w:t>
+              <w:t>Medium (Maun, Kasane)</w:t>
             </w:r>
           </w:p>
         </w:tc>
@@ -18186,7 +18228,7 @@
                 <w:sz w:val="18"/>
                 <w:szCs w:val="18"/>
               </w:rPr>
-              <w:t>Lending and capacity building, MSME hubs, one-stop registration, export linkages</w:t>
+              <w:t>Lending and capacity building, MSME infrastructure, one-stop registration, export linkages</w:t>
             </w:r>
           </w:p>
         </w:tc>
@@ -18267,7 +18309,7 @@
       </w:r>
       <w:r>
         <w:rPr/>
-        <w:t xml:space="preserve"> The main BSOs serve Tiers 0 to 2 with generic services. None offers a tourism supplier-development service at scale in the KAZA hubs, and only the Wilderness-LEA partnership in Botswana links BDS to a specific anchor's procurement. The most promising entry points are programmes that already combine BDS with finance or market access: the ZDA-CEEC agreement, SMEDCO's hubs and ZEEX, NIPDB's High Potential Pool and SME fund, INAPEM's incubator network and the anchor supplier programmes. Strengthening these, rather than creating new BSOs, is the approach recommended in Section 10.5.</w:t>
+        <w:t xml:space="preserve"> The main BSOs serve Tiers 0 to 2 with generic services. None offers a tourism supplier-development service at scale in the KAZA hubs, and only the Wilderness-LEA partnership in Botswana links BDS to a specific anchor's procurement. The most promising entry points are programmes that already combine BDS with finance or market access: the ZDA-CEEC agreement, SMEDCO's programmes and its partnership with the stock exchange, NIPDB's High Potential Pool and SME fund, INAPEM's incubator network and the anchor supplier programmes. Strengthening these, rather than creating new BSOs, is the approach recommended in Section 10.5.</w:t>
       </w:r>
     </w:p>
     <w:p>
@@ -18275,7 +18317,7 @@
         <w:pStyle w:val="Heading2"/>
         <w:rPr/>
       </w:pPr>
-      <w:bookmarkStart w:id="30" w:name="__RefHeading___Toc2990_616069264"/>
+      <w:bookmarkStart w:id="30" w:name="__RefHeading___Toc3003_3770744645"/>
       <w:bookmarkEnd w:id="30"/>
       <w:r>
         <w:rPr/>
@@ -18293,7 +18335,7 @@
       </w:pPr>
       <w:r>
         <w:rPr/>
-        <w:t>Citizen-empowerment policies in Botswana and Zambia provide concessional finance (CEDA, YDF, CEEC) that suits Tier 1 and 2 MSMEs if adapted to seasonality. Both are under fiscal pressure: Botswana's diamond-revenue slump has constrained public financiers' liquidity, and CEEC funding is being reset (Financial Landscape Analysis; Section 7.3).</w:t>
+        <w:t>Citizen-empowerment policies in Botswana and Zambia provide concessional finance (CEDA, YDF, CEEC) that suits Tier 1 and 2 MSMEs if adapted to seasonality. In Botswana, the diamond-revenue slump has constrained public financiers' liquidity (Financial Landscape Analysis).</w:t>
       </w:r>
     </w:p>
     <w:p>
@@ -18361,7 +18403,7 @@
         <w:spacing w:before="0" w:after="240"/>
         <w:rPr/>
       </w:pPr>
-      <w:bookmarkStart w:id="31" w:name="__RefHeading___Toc2992_616069264"/>
+      <w:bookmarkStart w:id="31" w:name="__RefHeading___Toc3005_3770744645"/>
       <w:bookmarkEnd w:id="31"/>
       <w:r>
         <w:rPr/>
@@ -18373,7 +18415,7 @@
         <w:pStyle w:val="Heading2"/>
         <w:rPr/>
       </w:pPr>
-      <w:bookmarkStart w:id="32" w:name="__RefHeading___Toc2994_616069264"/>
+      <w:bookmarkStart w:id="32" w:name="__RefHeading___Toc3007_3770744645"/>
       <w:bookmarkEnd w:id="32"/>
       <w:r>
         <w:rPr/>
@@ -19338,7 +19380,7 @@
         <w:pStyle w:val="Heading2"/>
         <w:rPr/>
       </w:pPr>
-      <w:bookmarkStart w:id="33" w:name="__RefHeading___Toc2996_616069264"/>
+      <w:bookmarkStart w:id="33" w:name="__RefHeading___Toc3009_3770744645"/>
       <w:bookmarkEnd w:id="33"/>
       <w:r>
         <w:rPr/>
@@ -20368,7 +20410,7 @@
         <w:pStyle w:val="Heading2"/>
         <w:rPr/>
       </w:pPr>
-      <w:bookmarkStart w:id="34" w:name="__RefHeading___Toc2998_616069264"/>
+      <w:bookmarkStart w:id="34" w:name="__RefHeading___Toc3011_3770744645"/>
       <w:bookmarkEnd w:id="34"/>
       <w:r>
         <w:rPr/>
@@ -20642,7 +20684,7 @@
                 <w:sz w:val="18"/>
                 <w:szCs w:val="18"/>
               </w:rPr>
-              <w:t>Replication of the Wilderness-Stanbic model; standard tripartite contract templates with direct payment to the lender; anchor commitment</w:t>
+              <w:t>Replication of the Wilderness-Stanbic model; standard tripartite contract templates with payment ceded to the lender; anchor commitment</w:t>
             </w:r>
           </w:p>
         </w:tc>
@@ -21222,7 +21264,7 @@
                 <w:sz w:val="18"/>
                 <w:szCs w:val="18"/>
               </w:rPr>
-              <w:t>BDC, CEDA Venture Capital, impact investors; planned ZEEX in Zimbabwe</w:t>
+              <w:t>BDC, CEDA Venture Capital, impact investors; ZEEX in Zimbabwe</w:t>
             </w:r>
           </w:p>
         </w:tc>
@@ -21297,7 +21339,7 @@
         <w:spacing w:before="0" w:after="240"/>
         <w:rPr/>
       </w:pPr>
-      <w:bookmarkStart w:id="35" w:name="__RefHeading___Toc3000_616069264"/>
+      <w:bookmarkStart w:id="35" w:name="__RefHeading___Toc3013_3770744645"/>
       <w:bookmarkEnd w:id="35"/>
       <w:r>
         <w:rPr/>
@@ -21312,7 +21354,7 @@
       </w:pPr>
       <w:r>
         <w:rPr/>
-        <w:t>The evidence contains few enterprise cases, and most rest on single interviews. The models below show investment potential and are relevant to women or youth. The model type column classifies each case by organisational form, value chain and value chain node (Section 2.2). Where the evidence does not state who leads the enterprise, the table says so.</w:t>
+        <w:t>The evidence contains few enterprise cases, and most rest on single interviews. The models below show investment potential and are relevant to women or youth. Each is classified by model type, meaning its organisational form, value chain and value chain node (Section 2.2). Where the evidence does not state who leads the enterprise, this is noted.</w:t>
       </w:r>
     </w:p>
     <w:p>
@@ -22237,7 +22279,7 @@
                 <w:sz w:val="18"/>
                 <w:szCs w:val="18"/>
               </w:rPr>
-              <w:t>Named clearest near-term opportunity; aggregation would give volume and bargaining power (MD p. 68, 75). In Livingstone, hotels buy most of their smallholder suppliers' produce under long-term contracts and invested in the Maramba Women's Mushroom Farm (operator-reported)</w:t>
+              <w:t>Named clearest near-term opportunity; aggregation would give volume and bargaining power (MD p. 68, 75). In Livingstone, a hotel buys directly from smallholders, and a women's mushroom farm sells most of its produce to hotels under long-term contracts (operator-reported)</w:t>
             </w:r>
           </w:p>
         </w:tc>
@@ -22367,7 +22409,7 @@
                 <w:sz w:val="18"/>
                 <w:szCs w:val="18"/>
               </w:rPr>
-              <w:t>Wilderness programme: 68 businesses enrolled, 37 supplying; annual contract value up from BWP 6.3 million to BWP 15 million; linked to Stanbic contract finance and LEA support</w:t>
+              <w:t>Wilderness programme: 68 businesses enrolled; more than BWP 6.2 million of new contracts for citizen-owned businesses after the 2024 expo, passing BWP 8 million by mid-2025; linked to Stanbic contract finance and LEA support</w:t>
             </w:r>
           </w:p>
         </w:tc>
@@ -22583,7 +22625,7 @@
         <w:spacing w:before="0" w:after="240"/>
         <w:rPr/>
       </w:pPr>
-      <w:bookmarkStart w:id="36" w:name="__RefHeading___Toc3002_616069264"/>
+      <w:bookmarkStart w:id="36" w:name="__RefHeading___Toc3015_3770744645"/>
       <w:bookmarkEnd w:id="36"/>
       <w:r>
         <w:rPr/>
@@ -22595,7 +22637,7 @@
         <w:pStyle w:val="Heading2"/>
         <w:rPr/>
       </w:pPr>
-      <w:bookmarkStart w:id="37" w:name="__RefHeading___Toc3004_616069264"/>
+      <w:bookmarkStart w:id="37" w:name="__RefHeading___Toc3017_3770744645"/>
       <w:bookmarkEnd w:id="37"/>
       <w:r>
         <w:rPr/>
@@ -23216,7 +23258,7 @@
         <w:pStyle w:val="Heading2"/>
         <w:rPr/>
       </w:pPr>
-      <w:bookmarkStart w:id="38" w:name="__RefHeading___Toc3006_616069264"/>
+      <w:bookmarkStart w:id="38" w:name="__RefHeading___Toc3019_3770744645"/>
       <w:bookmarkEnd w:id="38"/>
       <w:r>
         <w:rPr/>
@@ -23396,7 +23438,7 @@
         <w:pStyle w:val="Heading2"/>
         <w:rPr/>
       </w:pPr>
-      <w:bookmarkStart w:id="39" w:name="__RefHeading___Toc3008_616069264"/>
+      <w:bookmarkStart w:id="39" w:name="__RefHeading___Toc3021_3770744645"/>
       <w:bookmarkEnd w:id="39"/>
       <w:r>
         <w:rPr/>
@@ -23421,7 +23463,7 @@
       </w:r>
       <w:r>
         <w:rPr/>
-        <w:t xml:space="preserve"> in two or three priority hubs (for example Kasane, Livingstone-Victoria Falls and Katima Mulilo), run with BSOs and training institutions and, where possible, hosted in existing facilities such as SMEDCO's planned hubs or INAPEM's incubator network.</w:t>
+        <w:t xml:space="preserve"> in two or three priority hubs (for example Kasane, Livingstone-Victoria Falls and Katima Mulilo), run with BSOs and training institutions and, where possible, linked to existing initiatives such as SMEDCO's facilities or INAPEM's incubator network.</w:t>
       </w:r>
     </w:p>
     <w:p>
@@ -23526,7 +23568,7 @@
       </w:r>
       <w:r>
         <w:rPr/>
-        <w:t>, such as UNDP's youth-led MSME programme in Livingstone, to avoid duplication.</w:t>
+        <w:t>, such as the UNDP youth-led MSME programme in Livingstone and the youth priority in Namibia's SME fund, to avoid duplication.</w:t>
       </w:r>
     </w:p>
     <w:p>
@@ -23534,7 +23576,7 @@
         <w:pStyle w:val="Heading2"/>
         <w:rPr/>
       </w:pPr>
-      <w:bookmarkStart w:id="40" w:name="__RefHeading___Toc3010_616069264"/>
+      <w:bookmarkStart w:id="40" w:name="__RefHeading___Toc3023_3770744645"/>
       <w:bookmarkEnd w:id="40"/>
       <w:r>
         <w:rPr/>
@@ -23794,7 +23836,7 @@
                 <w:sz w:val="18"/>
                 <w:szCs w:val="18"/>
               </w:rPr>
-              <w:t>Supplier development TA; contract-backed working capital with direct payment to the lender; partial guarantee; anchor payment-term commitment</w:t>
+              <w:t>Supplier development TA; contract-backed working capital with payment ceded to the lender; partial guarantee; anchor payment-term commitment</w:t>
             </w:r>
           </w:p>
         </w:tc>
@@ -24050,7 +24092,7 @@
         <w:pStyle w:val="Heading2"/>
         <w:rPr/>
       </w:pPr>
-      <w:bookmarkStart w:id="41" w:name="__RefHeading___Toc3012_616069264"/>
+      <w:bookmarkStart w:id="41" w:name="__RefHeading___Toc3025_3770744645"/>
       <w:bookmarkEnd w:id="41"/>
       <w:r>
         <w:rPr/>
@@ -24226,7 +24268,7 @@
       </w:pPr>
       <w:r>
         <w:rPr/>
-        <w:t>The programme should work through existing BSOs rather than create new ones. The table below proposes a lead BSO and a first strengthening focus in each country, based on Section 7.3.</w:t>
+        <w:t>The programme should work through existing BSOs rather than create new ones. A lead BSO and a first strengthening focus are proposed for each country, based on Section 7.3.</w:t>
       </w:r>
     </w:p>
     <w:p>
@@ -24601,7 +24643,7 @@
                 <w:sz w:val="18"/>
                 <w:szCs w:val="18"/>
               </w:rPr>
-              <w:t>Wilderness-LEA MoU; LEA-CEDA collaboration framework</w:t>
+              <w:t>Wilderness-LEA MoU; Wilderness-Stanbic facility</w:t>
             </w:r>
           </w:p>
         </w:tc>
@@ -24786,7 +24828,7 @@
                 <w:sz w:val="18"/>
                 <w:szCs w:val="18"/>
               </w:rPr>
-              <w:t>Tourism supplier development in Livingstone; seasonal terms in CEEC products under the new framework; youth incubation</w:t>
+              <w:t>Tourism supplier development in Livingstone; seasonal terms in CEEC products; youth incubation</w:t>
             </w:r>
           </w:p>
         </w:tc>
@@ -24916,7 +24958,7 @@
                 <w:sz w:val="18"/>
                 <w:szCs w:val="18"/>
               </w:rPr>
-              <w:t>SMEDCO hubs and ZEEX</w:t>
+              <w:t>SMEDCO programmes and ZSE partnership</w:t>
             </w:r>
           </w:p>
         </w:tc>
@@ -24937,7 +24979,7 @@
         <w:pStyle w:val="Heading2"/>
         <w:rPr/>
       </w:pPr>
-      <w:bookmarkStart w:id="42" w:name="__RefHeading___Toc3014_616069264"/>
+      <w:bookmarkStart w:id="42" w:name="__RefHeading___Toc3027_3770744645"/>
       <w:bookmarkEnd w:id="42"/>
       <w:r>
         <w:rPr/>
@@ -25008,7 +25050,7 @@
       </w:r>
       <w:r>
         <w:rPr/>
-        <w:t xml:space="preserve"> (MSME supplier, anchor buyer and lender) with direct payment to the lender, to reduce reliance on slow court enforcement.</w:t>
+        <w:t xml:space="preserve"> (MSME supplier, anchor buyer and lender) in which payment is ceded to the lender, following the Wilderness-Stanbic example, to reduce reliance on slow court enforcement.</w:t>
       </w:r>
     </w:p>
     <w:p>
@@ -25087,7 +25129,7 @@
         <w:pStyle w:val="Heading2"/>
         <w:rPr/>
       </w:pPr>
-      <w:bookmarkStart w:id="43" w:name="__RefHeading___Toc3016_616069264"/>
+      <w:bookmarkStart w:id="43" w:name="__RefHeading___Toc3029_3770744645"/>
       <w:bookmarkEnd w:id="43"/>
       <w:r>
         <w:rPr/>
@@ -25123,7 +25165,7 @@
       </w:r>
       <w:r>
         <w:rPr/>
-        <w:t xml:space="preserve"> Fund BSO advisers to take MSMEs through registration and tax clearance when a contract requires it, using CIPA's online system in Botswana, ZIDA's one-stop centre in Zimbabwe and the BUE in Angola.</w:t>
+        <w:t xml:space="preserve"> Fund BSO advisers to take MSMEs through registration and tax clearance when a contract requires it, using CIPA's online system in Botswana, ZIDA's one-stop centre in Zimbabwe and the BUE and Guiché Único in Angola.</w:t>
       </w:r>
     </w:p>
     <w:p>
@@ -25144,7 +25186,7 @@
       </w:r>
       <w:r>
         <w:rPr/>
-        <w:t xml:space="preserve"> Use national validation workshops to raise specific issues with regulators: a simplified tax-clearance route for micro-suppliers in Zimbabwe, a tourism omnibus licence in Zambia (already under consideration by the BRRA), faster registration in Namibia, and seasonal terms in public finance schemes.</w:t>
+        <w:t xml:space="preserve"> Use national validation workshops to raise specific issues with regulators: a simplified tax-clearance route for micro-suppliers in Zimbabwe, omnibus licensing for tourism in Zambia (already under discussion between the BRRA, the Ministry of Tourism and the Zambia Tourism Agency), faster registration in Namibia, and seasonal terms in public finance schemes.</w:t>
       </w:r>
     </w:p>
     <w:p>
@@ -25186,7 +25228,7 @@
       </w:r>
       <w:r>
         <w:rPr/>
-        <w:t xml:space="preserve"> Support the KAZA Secretariat on Univisa adoption by Botswana and Namibia, and pilot a simplified procedure for small consignments from MSME suppliers across the Kazungula and Victoria Falls borders.</w:t>
+        <w:t xml:space="preserve"> Support the KAZA Secretariat in implementing the 2024 commitment to broaden the Univisa, and pilot a simplified procedure for small consignments from MSME suppliers across the Kazungula and Victoria Falls borders.</w:t>
       </w:r>
     </w:p>
     <w:p>
@@ -25207,7 +25249,7 @@
       </w:r>
       <w:r>
         <w:rPr/>
-        <w:t xml:space="preserve"> Replace the Doing Business 2020 benchmarks with B-READY data as the World Bank extends coverage to all five states, and add KAZA-hub measures of registration and licensing time to the destination baselines.</w:t>
+        <w:t xml:space="preserve"> Replace the Doing Business 2020 benchmarks with B-READY data as the World Bank extends coverage to 164 economies by the end of 2026, and add KAZA-hub measures of registration and licensing time to the destination baselines.</w:t>
       </w:r>
     </w:p>
     <w:p>
@@ -25215,7 +25257,7 @@
         <w:pStyle w:val="Heading2"/>
         <w:rPr/>
       </w:pPr>
-      <w:bookmarkStart w:id="44" w:name="__RefHeading___Toc3018_616069264"/>
+      <w:bookmarkStart w:id="44" w:name="__RefHeading___Toc3031_3770744645"/>
       <w:bookmarkEnd w:id="44"/>
       <w:r>
         <w:rPr/>
@@ -25322,7 +25364,7 @@
         <w:pStyle w:val="Heading2"/>
         <w:rPr/>
       </w:pPr>
-      <w:bookmarkStart w:id="45" w:name="__RefHeading___Toc3020_616069264"/>
+      <w:bookmarkStart w:id="45" w:name="__RefHeading___Toc3033_3770744645"/>
       <w:bookmarkEnd w:id="45"/>
       <w:r>
         <w:rPr/>
@@ -25464,11 +25506,22 @@
         <w:spacing w:before="0" w:after="240"/>
         <w:rPr/>
       </w:pPr>
-      <w:bookmarkStart w:id="46" w:name="__RefHeading___Toc3022_616069264"/>
+      <w:bookmarkStart w:id="46" w:name="__RefHeading___Toc3035_3770744645"/>
       <w:bookmarkEnd w:id="46"/>
       <w:r>
         <w:rPr/>
         <w:t>Annex A: Evidence Map</w:t>
+      </w:r>
+    </w:p>
+    <w:p>
+      <w:pPr>
+        <w:pStyle w:val="Normal"/>
+        <w:jc w:val="both"/>
+        <w:rPr/>
+      </w:pPr>
+      <w:r>
+        <w:rPr/>
+        <w:t>The Macro Diagnostic sections used in this assessment are listed below by topic.</w:t>
       </w:r>
     </w:p>
     <w:p>
@@ -26588,7 +26641,7 @@
         <w:spacing w:before="0" w:after="240"/>
         <w:rPr/>
       </w:pPr>
-      <w:bookmarkStart w:id="47" w:name="__RefHeading___Toc3024_616069264"/>
+      <w:bookmarkStart w:id="47" w:name="__RefHeading___Toc3037_3770744645"/>
       <w:bookmarkEnd w:id="47"/>
       <w:r>
         <w:rPr/>
@@ -27228,7 +27281,7 @@
         <w:spacing w:before="0" w:after="240"/>
         <w:rPr/>
       </w:pPr>
-      <w:bookmarkStart w:id="48" w:name="__RefHeading___Toc3026_616069264"/>
+      <w:bookmarkStart w:id="48" w:name="__RefHeading___Toc3039_3770744645"/>
       <w:bookmarkEnd w:id="48"/>
       <w:r>
         <w:rPr/>
@@ -27249,7 +27302,7 @@
           <w:sz w:val="20"/>
           <w:szCs w:val="20"/>
         </w:rPr>
-        <w:t>Web sources were accessed in October 2026. Secondary figures were taken from published summaries, agency and company reports and press coverage, and should be checked against the full source documents before publication.</w:t>
+        <w:t>Each web source below was checked in October 2026 to confirm that it exists at the address given and contains the information attributed to it. Figures reported by companies, agencies and the press are attributed to those sources in the text. Unpublished project documents are marked as such.</w:t>
       </w:r>
     </w:p>
     <w:p>
@@ -27264,7 +27317,7 @@
           <w:sz w:val="20"/>
           <w:szCs w:val="20"/>
         </w:rPr>
-        <w:t>African Journal of Inclusive Societies (n.d.). Financial Inclusion in Zimbabwe: Re-imagining Prospects for Inclusive Stakeholder Involvement and National Development. https://www.si-ajis.org/articles/financial-inclusion-in-zimbabwe-re-imagining-prospects-for-inclusive-stakeholder-involvement-and-national-development/</w:t>
+        <w:t>AllAfrica (2026). Angola: Over 3,000 Micro and Small Companies Certified in 2025 in Benguela (ANGOP). https://allafrica.com/stories/202602030395.html</w:t>
       </w:r>
     </w:p>
     <w:p>
@@ -27279,7 +27332,7 @@
           <w:sz w:val="20"/>
           <w:szCs w:val="20"/>
         </w:rPr>
-        <w:t>AllAfrica (2026). Angola: Over 3,000 micro and small companies certified in 2025 in Benguela. https://allafrica.com/stories/202602030395.html</w:t>
+        <w:t>Alliance for Financial Inclusion (2024). Zambia: Increasing Women's Financial Inclusion and Closing the Women's SME Credit Gap through Enabling Financial Policy and Regulation. https://www.afi-global.org/wp-content/uploads/2024/10/Zambia-Increasing-Womens-Financial-Inclusion-and-Closing-the-Womens-SME-Credit-Gap-Through-Enabling-Financial-Policy-and-Regulation.pdf</w:t>
       </w:r>
     </w:p>
     <w:p>
@@ -27294,7 +27347,7 @@
           <w:sz w:val="20"/>
           <w:szCs w:val="20"/>
         </w:rPr>
-        <w:t>Alliance for Financial Inclusion (2024). Zambia: Increasing Women's Financial Inclusion and Closing the Women's SME Credit Gap through Enabling Financial Policy and Regulation. https://www.afi-global.org/wp-content/uploads/2024/10/Zambia-Increasing-Womens-Financial-Inclusion-and-Closing-the-Womens-SME-Credit-Gap-Through-Enabling-Financial-Policy-and-Regulation.pdf</w:t>
+        <w:t>Alliance for Financial Inclusion (n.d.). Women are leading Zambia's MSME sector: here's how it happened. https://afi-global.org/opinion/women-are-leading-zambias-msme-sector-heres-how-it-happened/</w:t>
       </w:r>
     </w:p>
     <w:p>
@@ -27309,7 +27362,7 @@
           <w:sz w:val="20"/>
           <w:szCs w:val="20"/>
         </w:rPr>
-        <w:t>Alliance for Financial Inclusion (n.d.). Regional Joint Learning Program on Women-led MSMEs: opening remarks by Deputy Governor Dr J. T. Chipika. https://afi-global.org/speeches/regional-joint-learning-program-on-developing-and-implementing-financial-inclusion-policies-and-regulations-for-women-led-msmes-opening-remarks-by-deputy-governor-dr-j-t-chipika/</w:t>
+        <w:t>Anantara Hotels (n.d.). Changing the World, One Jar of Peanut Butter at a Time (Royal Livingstone smallholder sourcing). https://www.anantara.com/en/blog/zambia-csr-project</w:t>
       </w:r>
     </w:p>
     <w:p>
@@ -27324,7 +27377,7 @@
           <w:sz w:val="20"/>
           <w:szCs w:val="20"/>
         </w:rPr>
-        <w:t>Anantara Hotels (n.d.). Changing the World, One Jar of Peanut Butter at a Time (Royal Livingstone and AVANI Victoria Falls community sourcing). https://www.anantara.com/en/blog/zambia-csr-project</w:t>
+        <w:t>Ashley, C. and Mitchell, J. (2007). Assessing how tourism revenues reach the poor. ODI Briefing Paper. https://odi.org/en/publications/assessing-how-tourism-revenues-reach-the-poor/</w:t>
       </w:r>
     </w:p>
     <w:p>
@@ -27339,7 +27392,7 @@
           <w:sz w:val="20"/>
           <w:szCs w:val="20"/>
         </w:rPr>
-        <w:t>Ashley, C. and Mitchell, J. (ODI) (2007). Assessing how tourism revenues reach the poor. ODI Briefing Paper. https://odi.org/en/publications/assessing-how-tourism-revenues-reach-the-poor/</w:t>
+        <w:t>ATTA (2026). Wilderness Botswana Impact Report Highlights Four Decades of Conservation Tourism Value. https://atta.travel/resource/wilderness-botswana-impact-report-highlights-four-decades-of-conservation-tourism-value.html</w:t>
       </w:r>
     </w:p>
     <w:p>
@@ -27354,7 +27407,7 @@
           <w:sz w:val="20"/>
           <w:szCs w:val="20"/>
         </w:rPr>
-        <w:t>Botswana Daily News (BOPA) (2016). Tourism revenue leakages (report on parliamentary answer). https://dailynews.gov.bw/news-detail/27287</w:t>
+        <w:t>Business Times (2026). Unpacking SI 215 of 2025: Foreign participation in reserved sectors. https://businesstimes.co.zw/unpacking-si-215-of-2025-foreign-participation-in-reserved-sectors/</w:t>
       </w:r>
     </w:p>
     <w:p>
@@ -27369,7 +27422,7 @@
           <w:sz w:val="20"/>
           <w:szCs w:val="20"/>
         </w:rPr>
-        <w:t>Botswana Daily News (BOPA) (n.d.). Report of parliamentary answer on the LEA-CEDA collaboration framework and pending merger. https://dailynews.gov.bw</w:t>
+        <w:t>Business Times (n.d.). SMEDCO rolls out US$15m to unlock SME growth. https://businesstimes.co.zw/smedco-rolls-out-us15m-to-unlock-sme-growth/</w:t>
       </w:r>
     </w:p>
     <w:p>
@@ -27384,7 +27437,7 @@
           <w:sz w:val="20"/>
           <w:szCs w:val="20"/>
         </w:rPr>
-        <w:t>Business Times Zimbabwe (2026). SMEDCO rolls out US$15m to unlock SME growth. https://businesstimes.co.zw/smedco-rolls-out-us15m-to-unlock-sme-growth/</w:t>
+        <w:t>Business Weekly (2026). BLLAHWU raises red flags over planned merger of parastatals. https://businessweekly.co.bw/news/bllahwu-raises-red-flags-over-planned-merger-of-parastatals</w:t>
       </w:r>
     </w:p>
     <w:p>
@@ -27399,7 +27452,7 @@
           <w:sz w:val="20"/>
           <w:szCs w:val="20"/>
         </w:rPr>
-        <w:t>Business Weekly (2026). Wilderness Botswana channels billions into local economy through conservation tourism. https://businessweekly.co.bw/news/wilderness-botswana-channels-billions-into-local-economy-through-conservation-tourism</w:t>
+        <w:t>Chipika, J. T. (n.d.). Opening remarks by the Deputy Governor, Reserve Bank of Zimbabwe, at the Regional Joint Learning Program on Developing and Implementing Financial Inclusion Policies and Regulations for Women-led MSMEs. Alliance for Financial Inclusion. https://afi-global.org/speeches/regional-joint-learning-program-on-developing-and-implementing-financial-inclusion-policies-and-regulations-for-women-led-msmes-opening-remarks-by-deputy-governor-dr-j-t-chipika/</w:t>
       </w:r>
     </w:p>
     <w:p>
@@ -27414,7 +27467,7 @@
           <w:sz w:val="20"/>
           <w:szCs w:val="20"/>
         </w:rPr>
-        <w:t>COMESA (2016). Presentation on the COMESA Simplified Trade Regime (L. Othieno), UNCTAD. https://unctad.org/meetings/en/Presentation/ditc-ted-10.05.16-oceans-comesa-lawrence othieno.pdf</w:t>
+        <w:t>COMESA (2016). Presentation on the COMESA Simplified Trade Regime (L. Othieno), UNCTAD meeting, 10 May 2016. https://unctad.org/meetings/en/Presentation/ditc-ted-10.05.16-oceans-comesa-lawrence%20othieno.pdf</w:t>
       </w:r>
     </w:p>
     <w:p>
@@ -27429,7 +27482,7 @@
           <w:sz w:val="20"/>
           <w:szCs w:val="20"/>
         </w:rPr>
-        <w:t>COMESA (2025). Current threshold for the Simplified Trade Regime. https://www.comesa.int/wp-content/uploads/2025/09/CURRENT-THRESHOLD-FOR-THE-SIMPLIFIED-TRADE-REGIME-STR1.pdf</w:t>
+        <w:t>COMESA (2025). Current threshold for the Simplified Trade Regime (STR). https://www.comesa.int/wp-content/uploads/2025/09/CURRENT-THRESHOLD-FOR-THE-SIMPLIFIED-TRADE-REGIME-STR1.pdf</w:t>
       </w:r>
     </w:p>
     <w:p>
@@ -27444,7 +27497,7 @@
           <w:sz w:val="20"/>
           <w:szCs w:val="20"/>
         </w:rPr>
-        <w:t>Ecofin Agency (2026). Rwanda Tops Africa in World Bank's Business Ready 2025 Ranking. https://www.ecofinagency.com/news/0801-51811-rwanda-tops-africa-in-world-bank-s-business-ready-2025-ranking</w:t>
+        <w:t>Daily News (Botswana) (2025). Report on the second Okavango Wilderness Safaris Local Suppliers' Expo, Maun (edition of 30 June 2025). https://dailynews.gov.bw/common_up/dailynews/dailynews_pdf/30-06-2025_16-22-03_1751293323_dailynews_pdf.pdf</w:t>
       </w:r>
     </w:p>
     <w:p>
@@ -27459,7 +27512,7 @@
           <w:sz w:val="20"/>
           <w:szCs w:val="20"/>
         </w:rPr>
-        <w:t>Equity Axis (2025). Zimbabwe welcomes over 750,000 tourists in H1 2024, tourism receipts edge half a billion. https://equityaxis.net/post/18316/2025/3/zimbabwe-welcomes-over-750-000-tourists-in-h1-2024-tourism-receipts-edges-half-a-billion</w:t>
+        <w:t>Daily News (Botswana) (n.d.). Review of Tourism Act to minimise revenue leakages. https://dailynews.gov.bw/news-detail/83542</w:t>
       </w:r>
     </w:p>
     <w:p>
@@ -27474,7 +27527,7 @@
           <w:sz w:val="20"/>
           <w:szCs w:val="20"/>
         </w:rPr>
-        <w:t>European Union (2026). Regenerative Nature Based Tourism Development: action document. https://www.eeas.europa.eu/sites/default/files/2026/documents/Regenerative%20Nature%20Based%20Tourism%20Development_0.pdf</w:t>
+        <w:t>Daily News (South Africa) (2025). New Zimbabwean laws reserve 14 key sectors for local ownership. https://dailynews.co.za/news/2025-12-16-new-zimbabwean-laws-reserve-14-key-sectors-for-local-ownership/</w:t>
       </w:r>
     </w:p>
     <w:p>
@@ -27489,7 +27542,7 @@
           <w:sz w:val="20"/>
           <w:szCs w:val="20"/>
         </w:rPr>
-        <w:t>FIIAPP (2025). Support for MSMEs and the establishment and operationalisation of the national network of incubators in Angola. https://www.fiap.gob.es/en/proyectos_fiiapp/support-for-msmes-micro-small-and-medium-sized-enterprises-and-the-establishment-and-operationalization-of-the-national-network-of-incubators-in-angola/</w:t>
+        <w:t>Ecofin Agency (2026). Rwanda Tops Africa in World Bank's Business Ready 2025 Ranking. https://www.ecofinagency.com/news/0801-51811-rwanda-tops-africa-in-world-bank-s-business-ready-2025-ranking</w:t>
       </w:r>
     </w:p>
     <w:p>
@@ -27504,7 +27557,7 @@
           <w:sz w:val="20"/>
           <w:szCs w:val="20"/>
         </w:rPr>
-        <w:t>FinMark Trust (2022). FinScope MSME Survey Zimbabwe 2022: Topline Findings. https://finmark.org.za/Publications/FinScope_MSME_Survey_Zimbabwe2022_findings.pdf</w:t>
+        <w:t>Equity Axis (2025). Zimbabwe welcomes over 750,000 tourists in H1 2024, tourism receipts edge half a billion. https://equityaxis.net/post/18316/2025/3/zimbabwe-welcomes-over-750-000-tourists-in-h1-2024-tourism-receipts-edges-half-a-billion</w:t>
       </w:r>
     </w:p>
     <w:p>
@@ -27519,7 +27572,7 @@
           <w:sz w:val="20"/>
           <w:szCs w:val="20"/>
         </w:rPr>
-        <w:t>FinMark Trust (2025). FinScope MSME Survey Botswana 2024: Pocket Guide. https://finmark.org.za/Publications/2024_Pocket_Guide_FinScope_Botswana_MSME.pdf</w:t>
+        <w:t>European Union (2026). Regenerative Nature Based Tourism Development: action document. https://www.eeas.europa.eu/sites/default/files/2026/documents/Regenerative%20Nature%20Based%20Tourism%20Development_0.pdf</w:t>
       </w:r>
     </w:p>
     <w:p>
@@ -27534,7 +27587,7 @@
           <w:sz w:val="20"/>
           <w:szCs w:val="20"/>
         </w:rPr>
-        <w:t>Forbes África Lusófona (2025). INAPEM aposta no fomento de mais talentos no sector das tecnologias em Angola (Tuendi programme). https://forbesafricalusofona.com/?p=157887</w:t>
+        <w:t>FIIAPP (2025). Support for MSMEs and the establishment and operationalisation of the national network of incubators in Angola (ENVOLVER+). https://www.fiap.gob.es/en/proyectos_fiiapp/support-for-msmes-micro-small-and-medium-sized-enterprises-and-the-establishment-and-operationalization-of-the-national-network-of-incubators-in-angola/</w:t>
       </w:r>
     </w:p>
     <w:p>
@@ -27549,7 +27602,7 @@
           <w:sz w:val="20"/>
           <w:szCs w:val="20"/>
         </w:rPr>
-        <w:t>GIZ (2026). Regenerative Tourism: Investing in Nature and Local Economies across KAZA. https://www.giz.de/en/regions/africa/sadc-botswana/news/regenerative-tourism-investing-nature-and-local-economies-across-kaza</w:t>
+        <w:t>FinMark Trust (2013). FinScope MSME Survey Zimbabwe 2012 (brochure). https://finmark.org.za/system/documents/files/000/000/448/original/FinScope_Zimbabwe_Broch13FNL.pdf</w:t>
       </w:r>
     </w:p>
     <w:p>
@@ -27564,7 +27617,7 @@
           <w:sz w:val="20"/>
           <w:szCs w:val="20"/>
         </w:rPr>
-        <w:t>Gondwana Collection Namibia (n.d.). Our partners; and Etosha King Nehale: unique through the love of detail. https://gondwana-collection.com/en/about-us/our-partners</w:t>
+        <w:t>FinMark Trust (2022). FinScope MSME Survey Zimbabwe 2022: Topline Findings. https://finmark.org.za/Publications/FinScope_MSME_Survey_Zimbabwe2022_findings.pdf</w:t>
       </w:r>
     </w:p>
     <w:p>
@@ -27579,7 +27632,7 @@
           <w:sz w:val="20"/>
           <w:szCs w:val="20"/>
         </w:rPr>
-        <w:t>Government of Angola (2012). Decreto Presidencial n.º 40/12, de 13 de Março (Balcão Único do Empreendedor). https://lex.ao/docs/presidente-da-republica/2012/decreto-presidencial-n-o-40-12-de-13-de-marco/</w:t>
+        <w:t>FinMark Trust (2025). FinScope MSME Survey Botswana 2024: Pocket Guide. https://finmark.org.za/Publications/2024_Pocket_Guide_FinScope_Botswana_MSME.pdf</w:t>
       </w:r>
     </w:p>
     <w:p>
@@ -27594,7 +27647,7 @@
           <w:sz w:val="20"/>
           <w:szCs w:val="20"/>
         </w:rPr>
-        <w:t>Government of Botswana (2021). Economic Inclusion Act (Act No. 26 of 2021). https://botswanalaws.com/consolidated-statutes/principle-legislation/economic-inclusion-act</w:t>
+        <w:t>Forbes África Lusófona (2025). INAPEM aposta no fomento de mais talentos no sector das tecnologias em Angola. https://forbesafricalusofona.com/inapem-aposta-no-fomento-de-mais-talentos-no-sector-das-tecnologias-em-angola/</w:t>
       </w:r>
     </w:p>
     <w:p>
@@ -27609,7 +27662,7 @@
           <w:sz w:val="20"/>
           <w:szCs w:val="20"/>
         </w:rPr>
-        <w:t>Herald, The (2019). Zim among World Bank top performers. https://www.heraldonline.co.zw/zim-among-world-bank-top-performers-2/</w:t>
+        <w:t>GIZ (2026). Regenerative Tourism: Investing in Nature and Local Economies across KAZA. https://www.giz.de/en/regions/africa/sadc-botswana/news/regenerative-tourism-investing-nature-and-local-economies-across-kaza</w:t>
       </w:r>
     </w:p>
     <w:p>
@@ -27624,7 +27677,7 @@
           <w:sz w:val="20"/>
           <w:szCs w:val="20"/>
         </w:rPr>
-        <w:t>ITWeb Africa (2019). Botswana pushes ahead with online business registration system. https://itweb.africa/content/KPNG878KVQav4mwD</w:t>
+        <w:t>Gondwana Collection Namibia (n.d.). Etosha King Nehale: Where Architecture Preserves a Kingdom. https://gondwana-collection.com/blog/etosha-king-nehale-where-architecture-preserves-a-kingdom</w:t>
       </w:r>
     </w:p>
     <w:p>
@@ -27639,7 +27692,7 @@
           <w:sz w:val="20"/>
           <w:szCs w:val="20"/>
         </w:rPr>
-        <w:t>KAZA Financial Landscape Analysis: Access to Finance for R-NBT MSMEs in the KAZA TFCA (Final Draft for Validation, October 2026).</w:t>
+        <w:t>Gondwana Collection Namibia (n.d.). Partners to Gondwana. https://gondwana-collection.com/en/about-us/our-partners</w:t>
       </w:r>
     </w:p>
     <w:p>
@@ -27654,7 +27707,7 @@
           <w:sz w:val="20"/>
           <w:szCs w:val="20"/>
         </w:rPr>
-        <w:t>Mbaiwa, J. E. (2005). Enclave tourism and its socio-economic impacts in the Okavango Delta, Botswana. Tourism Management 26(2), 157-172.</w:t>
+        <w:t>Government of Angola (2012). Decreto Presidencial n.º 40/12, de 13 de Março (Balcão Único do Empreendedor). https://lex.ao/docs/presidente-da-republica/2012/decreto-presidencial-n-o-40-12-de-13-de-marco/</w:t>
       </w:r>
     </w:p>
     <w:p>
@@ -27669,7 +27722,7 @@
           <w:sz w:val="20"/>
           <w:szCs w:val="20"/>
         </w:rPr>
-        <w:t>Ministry of Trade and Entrepreneurship, Botswana (2026). Committee of Supply Speech, 16 February 2026. https://www.parliament.gov.bw/documents/Committee-of-Supply-Speech--16-02-2026--Ministry-of-Trade---Entrepreneurship-Version-6--final_07_19_44_27_07_2026.pdf</w:t>
+        <w:t>Government of Botswana (2021). Economic Inclusion Act (Act No. 26 of 2021). https://botswanalaws.com/consolidated-statutes/principle-legislation/economic-inclusion-act</w:t>
       </w:r>
     </w:p>
     <w:p>
@@ -27684,7 +27737,7 @@
           <w:sz w:val="20"/>
           <w:szCs w:val="20"/>
         </w:rPr>
-        <w:t>Mmegi (2026). Wilderness, LEA herald new era for citizen participation in tourism. https://www.mmegi.bw/ampArticle/123339</w:t>
+        <w:t>Government of Zimbabwe (2025). Indigenisation and Economic Empowerment (Foreign Participation in Reserved Sectors) Regulations, 2025 (SI 215 of 2025). ZimLII. https://zimlii.org/akn/zw/act/si/2025/215/eng@2025-12-11</w:t>
       </w:r>
     </w:p>
     <w:p>
@@ -27699,7 +27752,7 @@
           <w:sz w:val="20"/>
           <w:szCs w:val="20"/>
         </w:rPr>
-        <w:t>MSME Africa Online (n.d.). NIPDB urges local MSMEs to tap into N$18 million SME support fund. https://msmeafricaonline.com/nipdb-urges-local-msmes-to-tap-into-18-million-sme-support-fund/</w:t>
+        <w:t>Herald, The (2019). Zim among World Bank top performers. https://www.heraldonline.co.zw/zim-among-world-bank-top-performers-2/</w:t>
       </w:r>
     </w:p>
     <w:p>
@@ -27714,7 +27767,7 @@
           <w:sz w:val="20"/>
           <w:szCs w:val="20"/>
         </w:rPr>
-        <w:t>Namibian, The (2024). Namibia's 2023 Labour Force Survey highlights unemployment challenges and income disparities. https://www.namibian.com.na/namibias-2023-labour-force-survey-highlights-unemployment-challenges-and-income-disparities/</w:t>
+        <w:t>KAZA Financial Landscape Analysis: Access to Finance for R-NBT MSMEs in the KAZA TFCA (Final Draft for Validation, October 2026). Unpublished.</w:t>
       </w:r>
     </w:p>
     <w:p>
@@ -27729,7 +27782,7 @@
           <w:sz w:val="20"/>
           <w:szCs w:val="20"/>
         </w:rPr>
-        <w:t>Namibian, The (2025). Oshana leads with most registered businesses (status of BIPA online system). https://www.namibian.com.na/oshana-leads-with-most-registered-businesses/</w:t>
+        <w:t>Mbaiwa, J. E. (2005). Enclave tourism and its socio-economic impacts in the Okavango Delta, Botswana. Tourism Management 26(2), 157-172. https://ubrisa.ub.bw/handle/10311/429</w:t>
       </w:r>
     </w:p>
     <w:p>
@@ -27744,7 +27797,7 @@
           <w:sz w:val="20"/>
           <w:szCs w:val="20"/>
         </w:rPr>
-        <w:t>Namibian, The (2026). Namibia receives 1.3m tourists in 2025. https://www.namibian.com.na/namibia-receives-1-3m-tourists-in-2025/</w:t>
+        <w:t>Ministry of Trade and Entrepreneurship, Botswana (2026). Committee of Supply Speech, Organisation 0700, 2026/27. https://www.parliament.gov.bw/documents/Committee-of-Supply-Speech--16-02-2026--Ministry-of-Trade---Entrepreneurship-Version-6--final_07_19_44_27_07_2026.pdf</w:t>
       </w:r>
     </w:p>
     <w:p>
@@ -27759,7 +27812,7 @@
           <w:sz w:val="20"/>
           <w:szCs w:val="20"/>
         </w:rPr>
-        <w:t>Newsday (2026). ZSE, SMEDCO join forces to bridge SME funding gap. https://www.newsday.co.zw/amp/business/article/200057516/zse-smedco-join-forces-to-bridge-sme-funding-gap</w:t>
+        <w:t>Mmegi (2025). Stanbic, Wilderness offer lifeline for SMMEs in tourism. https://www.mmegi.bw/business/stanbic-wilderness-offer-lifeline-for-smmes-in-tourism/news</w:t>
       </w:r>
     </w:p>
     <w:p>
@@ -27774,7 +27827,7 @@
           <w:sz w:val="20"/>
           <w:szCs w:val="20"/>
         </w:rPr>
-        <w:t>NIPDB (2025). Annual Report 2024/25; and Celebrating World MSME Day 2025: a Namibian perspective. https://www.nipdb.com/annual-report</w:t>
+        <w:t>Mmegi (2026). Wilderness, LEA herald new era for citizen participation in tourism. https://www.mmegi.bw/business/wilderness-lea-herald-new-era-for-citizen-participation-in-tourism/news</w:t>
       </w:r>
     </w:p>
     <w:p>
@@ -27789,7 +27842,7 @@
           <w:sz w:val="20"/>
           <w:szCs w:val="20"/>
         </w:rPr>
-        <w:t>Pretoria News (2025). Zimbabwe blocks foreigners from taxi, bakery and salon businesses, reserves sectors for locals (SI 215 of 2025). https://pretorianews.co.za/news/politics/2025-12-15-zimbabwe-blocks-foreigners-from-taxi-bakery-and-salon-businesses-reserves-sectors-for-locals/</w:t>
+        <w:t>Namibia Statistics Agency (2025). 2023 Labour Force Report: presentation for the launch. https://nsa.org.na/wp-content/uploads/2025/01/2023-Labour-Force-Report-Presentation-for-the-Launch-Jan-2025-_OS.pdf</w:t>
       </w:r>
     </w:p>
     <w:p>
@@ -27804,7 +27857,7 @@
           <w:sz w:val="20"/>
           <w:szCs w:val="20"/>
         </w:rPr>
-        <w:t>Reserve Bank of Zimbabwe (2022). Zimbabwe FinScope MSME Survey Report 2022. https://www.rbz.co.zw/documents/BLSS/2022/Zimbabwe_FinScope_MSME_Survey_Report_2022.pdf</w:t>
+        <w:t>Namibian, The (2025). Oshana leads with most registered businesses. https://www.namibian.com.na/oshana-leads-with-most-registered-businesses/</w:t>
       </w:r>
     </w:p>
     <w:p>
@@ -27819,7 +27872,7 @@
           <w:sz w:val="20"/>
           <w:szCs w:val="20"/>
         </w:rPr>
-        <w:t>SIGMA International (2026). KAZA Regenerative Nature-Based Tourism Macro Diagnostic: Findings Report (Draft). Prepared for GIZ, September 2026. Used via an extract on priority value chains.</w:t>
+        <w:t>Namibian, The (2026). Namibia receives 1.3m tourists in 2025. https://www.namibian.com.na/namibia-receives-1-3m-tourists-in-2025/</w:t>
       </w:r>
     </w:p>
     <w:p>
@@ -27834,7 +27887,7 @@
           <w:sz w:val="20"/>
           <w:szCs w:val="20"/>
         </w:rPr>
-        <w:t>Statistics Botswana (2025). Tourism International Visitor Arrivals Stats Brief, 2024 Quarters 2-4. https://www.statsbots.org.bw/sites/default/files/publications/Tourism%20International%20Visitor%20Arrivals%20Stats%20Brief%202024%20Quarter%202-4.pdf</w:t>
+        <w:t>Namibian, The (2026). Visa regime change bites tourism. https://www.namibian.com.na/visa-regime-change-bites-tourism/</w:t>
       </w:r>
     </w:p>
     <w:p>
@@ -27849,7 +27902,7 @@
           <w:sz w:val="20"/>
           <w:szCs w:val="20"/>
         </w:rPr>
-        <w:t>The Brief (2023). NIPDB target to empower 3,000 MSMEs. https://thebrief.com.na/2023/08/nipdb-target-to-empower-3-000-msmes</w:t>
+        <w:t>Namibian, The (n.d.). NIPDB urges MSMEs to apply for N$18m fund. https://www.namibian.com.na/nipdb-urges-msmes-to-apply-for-n18m-fund/</w:t>
       </w:r>
     </w:p>
     <w:p>
@@ -27864,7 +27917,7 @@
           <w:sz w:val="20"/>
           <w:szCs w:val="20"/>
         </w:rPr>
-        <w:t>The Brief (2024). Annual duty waiver programme will not be extended: BIPA. https://thebrief.com.na/2024/06/annual-duty-waiver-programme-will-not-be-extended-bipa</w:t>
+        <w:t>Newsday (2026). ZSE, SMEDCO join forces to bridge SME funding gap. https://www.newsday.co.zw/business/article/200057516/zse-smedco-join-forces-to-bridge-sme-funding-gap</w:t>
       </w:r>
     </w:p>
     <w:p>
@@ -27879,7 +27932,7 @@
           <w:sz w:val="20"/>
           <w:szCs w:val="20"/>
         </w:rPr>
-        <w:t>The Brief (2025). Namibia's tourism revival trips on its own red tape. https://thebrief.com.na/2025/10/namibias-tourism-revival-trips-on-its-own-red-tape/</w:t>
+        <w:t>NIPDB (n.d.). K2G High Potential Pool. https://msme.nipdb.com/k2g-hpp/</w:t>
       </w:r>
     </w:p>
     <w:p>
@@ -27894,7 +27947,7 @@
           <w:sz w:val="20"/>
           <w:szCs w:val="20"/>
         </w:rPr>
-        <w:t>Tourism Update (2025). Teething problems plague Namibia's new visa regime. https://www.tourismupdate.com/article/teething-problems-plague-namibias-new-visa-regime</w:t>
+        <w:t>NIPDB (n.d.). Micro, Small and Medium Enterprises Development. https://www.nipdb.com/partnerships/msme</w:t>
       </w:r>
     </w:p>
     <w:p>
@@ -27909,7 +27962,7 @@
           <w:sz w:val="20"/>
           <w:szCs w:val="20"/>
         </w:rPr>
-        <w:t>UNDP Zambia (2025). Youth-Led MSME Empowerment Programme launched to boost entrepreneurial capacity and regional market access. https://www.undp.org/node/527721</w:t>
+        <w:t>Nsanzya, B. M. K. (n.d.). Evaluating Tourism-Agriculture Linkages for Inclusive Growth in Zambia. PhD thesis, University of Pretoria. https://repository.up.ac.za/server/api/core/bitstreams/97195534-6092-4f4a-ad1e-4383f140ff9a/content</w:t>
       </w:r>
     </w:p>
     <w:p>
@@ -27924,7 +27977,7 @@
           <w:sz w:val="20"/>
           <w:szCs w:val="20"/>
         </w:rPr>
-        <w:t>University of Pretoria (n.d.). Evaluating tourism-agriculture linkages for inclusive growth in Zambia. https://repository.up.ac.za/handle/2263/86012</w:t>
+        <w:t>Reserve Bank of Zimbabwe (2022). Zimbabwe FinScope MSME Survey Report 2022. https://www.rbz.co.zw/documents/BLSS/2022/Zimbabwe_FinScope_MSME_Survey_Report_2022.pdf</w:t>
       </w:r>
     </w:p>
     <w:p>
@@ -27939,7 +27992,7 @@
           <w:sz w:val="20"/>
           <w:szCs w:val="20"/>
         </w:rPr>
-        <w:t>US Department of State (2020). 2020 Investment Climate Statements: Botswana; Namibia. https://www.state.gov/reports/2020-investment-climate-statements/botswana/</w:t>
+        <w:t>SIGMA International (2026). KAZA Regenerative Nature-Based Tourism Macro Diagnostic: Findings Report (Draft). Prepared for GIZ, September 2026. Unpublished; used via an extract on priority value chains.</w:t>
       </w:r>
     </w:p>
     <w:p>
@@ -27954,7 +28007,7 @@
           <w:sz w:val="20"/>
           <w:szCs w:val="20"/>
         </w:rPr>
-        <w:t>US International Trade Administration (n.d.). Botswana Country Commercial Guide: market challenges. https://trade.gov/country-commercial-guides/botswana-market-challenges</w:t>
+        <w:t>Statistics Botswana (2026). Tourism International Visitor Arrivals Stats Brief, 2024 Quarters 2-4. https://www.statsbots.org.bw/sites/default/files/publications/Tourism%20International%20Visitor%20Arrivals%20Stats%20Brief%202024%20Quarter%202-4.pdf</w:t>
       </w:r>
     </w:p>
     <w:p>
@@ -27969,7 +28022,7 @@
           <w:sz w:val="20"/>
           <w:szCs w:val="20"/>
         </w:rPr>
-        <w:t>Ver Angola (2019). Governo lança Guiché Único de Empresas online para criar sociedades em dois dias. https://www.verangola.net/va/pt/032019/Economia/14762/</w:t>
+        <w:t>The Brief (2024). Annual duty waiver programme will not be extended: BIPA. https://thebrief.com.na/2024/06/annual-duty-waiver-programme-will-not-be-extended-bipa/</w:t>
       </w:r>
     </w:p>
     <w:p>
@@ -27984,7 +28037,7 @@
           <w:sz w:val="20"/>
           <w:szCs w:val="20"/>
         </w:rPr>
-        <w:t>Ver Angola (2025). Projecto Envolver lançado em Angola para fortalecer empreendedorismo. https://www.verangola.net/va/pt/102025/Sociedade/46493/</w:t>
+        <w:t>The Brief (2025). BIPA to deregister 1,000 companies every month. https://thebrief.com.na/2025/08/bipa-to-deregister-1000-companies-every-month/</w:t>
       </w:r>
     </w:p>
     <w:p>
@@ -27999,7 +28052,7 @@
           <w:sz w:val="20"/>
           <w:szCs w:val="20"/>
         </w:rPr>
-        <w:t>Veritas Zimbabwe (2018). Bill Watch 5-2018: Indigenisation Act amendments now law. https://www.veritaszim.net/node/2356</w:t>
+        <w:t>TimesLIVE (2024). Southern African countries plan to expand special tourist visa. https://www.timeslive.co.za/news/africa/2024-06-03-southern-african-countries-plan-to-expand-special-tourist-visa/</w:t>
       </w:r>
     </w:p>
     <w:p>
@@ -28014,7 +28067,7 @@
           <w:sz w:val="20"/>
           <w:szCs w:val="20"/>
         </w:rPr>
-        <w:t>Visa Atlas (2026). KAZA Univisa. https://visaatlas.org/visas/zambia/kaza-univisa</w:t>
+        <w:t>Tourism Update (2025). Teething problems plague Namibia's new visa regime. https://www.tourismupdate.com/article/teething-problems-plague-namibias-new-visa-regime</w:t>
       </w:r>
     </w:p>
     <w:p>
@@ -28029,7 +28082,7 @@
           <w:sz w:val="20"/>
           <w:szCs w:val="20"/>
         </w:rPr>
-        <w:t>World Bank (2013). FinScope MSME Survey Zimbabwe 2012. https://documents1.worldbank.org/curated/en/780081468137402417/pdf/945050WP0Box385442B0P12644800PUBLIC00ACS.pdf</w:t>
+        <w:t>UN Women (2025). The Impact of Austerity Measures on Women-Owned Businesses in Zimbabwe. https://africa.unwomen.org/en/digital-library/publications/2025/03/the-impact-of-austerity-measures-on-women-owned-businesses-in-zimbabwe</w:t>
       </w:r>
     </w:p>
     <w:p>
@@ -28044,7 +28097,7 @@
           <w:sz w:val="20"/>
           <w:szCs w:val="20"/>
         </w:rPr>
-        <w:t>World Bank (2019). Doing Business 2020: Comparing Business Regulation in 190 Economies; and economy profiles for Angola, Botswana, Namibia, Zambia and Zimbabwe. https://archive.doingbusiness.org/en/reports/global-reports/doing-business-2020</w:t>
+        <w:t>UNDP Zambia (2025). UNDP Youth-Led MSME Empowerment Programme Launched to Boost Entrepreneurial Capacity and Regional Market Access. https://www.undp.org/zambia/press-releases/undp-youth-led-msme-empowerment-programme-launched-boost-entrepreneurial-capacity-and-regional-market-access</w:t>
       </w:r>
     </w:p>
     <w:p>
@@ -28059,7 +28112,7 @@
           <w:sz w:val="20"/>
           <w:szCs w:val="20"/>
         </w:rPr>
-        <w:t>World Bank (2019). Doing Business 2020: two Sub-Saharan African countries among most improved in ease of doing business (press release, 24 October 2019). https://www.worldbank.org/en/news/press-release/2019/10/24/doing-business-2020-two-sub-saharan-african-countries-among-most-improved-in-ease-of-doing-business</w:t>
+        <w:t>US Department of State (2020). 2020 Investment Climate Statements: Botswana. https://www.state.gov/reports/2020-investment-climate-statements/botswana/</w:t>
       </w:r>
     </w:p>
     <w:p>
@@ -28074,7 +28127,7 @@
           <w:sz w:val="20"/>
           <w:szCs w:val="20"/>
         </w:rPr>
-        <w:t>World Bank (2021). Access to Finance and Capacity Building of Women-led Small and Medium Enterprises in Zambia (W-SME Survey Report). https://documents1.worldbank.org/curated/en/576591618321561334/pdf/Access-to-Finance-and-Capacity-Building-of-Women-led-Small-and-Medium-Enterprises-in-Zambia.pdf</w:t>
+        <w:t>US Department of State (2026). 2026 Investment Climate Statements: Botswana. https://www.state.gov/reports/2026-investment-climate-statements/botswana</w:t>
       </w:r>
     </w:p>
     <w:p>
@@ -28089,7 +28142,7 @@
           <w:sz w:val="20"/>
           <w:szCs w:val="20"/>
         </w:rPr>
-        <w:t>World Bank (2024). Risk and reform: Zambia's strategic approach to modern governance (Nasikiliza blog). https://blogs.worldbank.org/en/nasikiliza/risk-and-reform-zambias-strategic-approach-to-modern-governance-afe-0524</w:t>
+        <w:t>US International Trade Administration (n.d.). Botswana Country Commercial Guide: Market Challenges. https://www.trade.gov/country-commercial-guides/botswana-market-challenges</w:t>
       </w:r>
     </w:p>
     <w:p>
@@ -28104,7 +28157,7 @@
           <w:sz w:val="20"/>
           <w:szCs w:val="20"/>
         </w:rPr>
-        <w:t>World Bank (2024). Skills Development in Namibia: Policy Note. https://documents1.worldbank.org/curated/en/099081224051035127/pdf/P171994-2b4ffc58-d328-4002-a65a-8df0a178573e.pdf</w:t>
+        <w:t>Ver Angola (2021). Nova plataforma permite criar empresa em uma hora. https://www.verangola.net/va/pt/052021/Economia/25439/Nova-plataforma-permite-criar-empresa-em-uma-hora.htm</w:t>
       </w:r>
     </w:p>
     <w:p>
@@ -28119,7 +28172,7 @@
           <w:sz w:val="20"/>
           <w:szCs w:val="20"/>
         </w:rPr>
-        <w:t>World Bank (2025). Business Ready 2025. https://documents.worldbank.org/en/publication/documents-reports/documentdetail/099122925140531373</w:t>
+        <w:t>Ver Angola (2025). Envolver Project launched in Angola to strengthen entrepreneurship. https://www.verangola.net/va/en/102025/Society/46493/Envolver-Project-launched-in-Angola-to-strengthen-entrepreneurship.htm</w:t>
       </w:r>
     </w:p>
     <w:p>
@@ -28134,7 +28187,7 @@
           <w:sz w:val="20"/>
           <w:szCs w:val="20"/>
         </w:rPr>
-        <w:t>Zambia Monitor (2025). BRRA to explore omnibus licensing for tourism. https://www.zambiamonitor.com/?p=70314</w:t>
+        <w:t>Veritas Zimbabwe (2018). Bill Watch 5-2018: Indigenisation Act Amendments Now Law. https://www.veritaszim.net/node/2355</w:t>
       </w:r>
     </w:p>
     <w:p>
@@ -28149,7 +28202,7 @@
           <w:sz w:val="20"/>
           <w:szCs w:val="20"/>
         </w:rPr>
-        <w:t>Zambia Monitor (n.d.). Govt halts pending applications for empowerment schemes; fresh requests to reopen under new framework. https://www.zambiamonitor.com/govt-halts-pending-applications-for-empowerment-schemes-fresh-requests-to-reopen-under-new-framework-in-jan/</w:t>
+        <w:t>World Bank (2013). FinScope MSME Survey Zimbabwe 2012. https://documents1.worldbank.org/curated/en/780081468137402417/pdf/945050WP0Box385442B0P12644800PUBLIC00ACS.pdf</w:t>
       </w:r>
     </w:p>
     <w:p>
@@ -28164,7 +28217,7 @@
           <w:sz w:val="20"/>
           <w:szCs w:val="20"/>
         </w:rPr>
-        <w:t>Zambia Monitor (n.d.). ZDA and CEEC sign agreement to strengthen SME support. https://zambiamonitor.com/?p=52339</w:t>
+        <w:t>World Bank (2019). Doing Business 2020: Comparing Business Regulation in 190 Economies. https://documents1.worldbank.org/curated/en/688761571934946384/pdf/Doing-Business-2020-Comparing-Business-Regulation-in-190-Economies.pdf</w:t>
       </w:r>
     </w:p>
     <w:p>
@@ -28179,7 +28232,127 @@
           <w:sz w:val="20"/>
           <w:szCs w:val="20"/>
         </w:rPr>
-        <w:t>ZIMRA (2024). ZIMRA signs MOU with ZIDA. https://zimra.co.zw/news/20-story?start=45</w:t>
+        <w:t>World Bank (2019). Doing Business 2020: Economy Profile of Zimbabwe (economy profiles for Angola, Botswana, Namibia and Zambia are published in the same series). https://documents1.worldbank.org/curated/en/177921575381849841/pdf/Doing-Business-2020-Comparing-Business-Regulation-in-190-Economies-Economy-Profile-of-Zimbabwe.pdf</w:t>
+      </w:r>
+    </w:p>
+    <w:p>
+      <w:pPr>
+        <w:pStyle w:val="Normal"/>
+        <w:spacing w:before="0" w:after="100"/>
+        <w:ind w:hanging="567" w:left="567"/>
+        <w:rPr/>
+      </w:pPr>
+      <w:r>
+        <w:rPr>
+          <w:sz w:val="20"/>
+          <w:szCs w:val="20"/>
+        </w:rPr>
+        <w:t>World Bank (2019). Doing Business 2020: Two Sub-Saharan African Countries among Most Improved in Ease of Doing Business (press release, 24 October 2019). https://www.worldbank.org/en/news/press-release/2019/10/24/doing-business-2020-two-sub-saharan-african-countries-among-most-improved-in-ease-of-doing-business</w:t>
+      </w:r>
+    </w:p>
+    <w:p>
+      <w:pPr>
+        <w:pStyle w:val="Normal"/>
+        <w:spacing w:before="0" w:after="100"/>
+        <w:ind w:hanging="567" w:left="567"/>
+        <w:rPr/>
+      </w:pPr>
+      <w:r>
+        <w:rPr>
+          <w:sz w:val="20"/>
+          <w:szCs w:val="20"/>
+        </w:rPr>
+        <w:t>World Bank (2021). Access to Finance and Capacity Building of Women-led Small and Medium Enterprises in Zambia (W-SME Survey Report). https://documents1.worldbank.org/curated/en/576591618321561334/pdf/Access-to-Finance-and-Capacity-Building-of-Women-led-Small-and-Medium-Enterprises-in-Zambia.pdf</w:t>
+      </w:r>
+    </w:p>
+    <w:p>
+      <w:pPr>
+        <w:pStyle w:val="Normal"/>
+        <w:spacing w:before="0" w:after="100"/>
+        <w:ind w:hanging="567" w:left="567"/>
+        <w:rPr/>
+      </w:pPr>
+      <w:r>
+        <w:rPr>
+          <w:sz w:val="20"/>
+          <w:szCs w:val="20"/>
+        </w:rPr>
+        <w:t>World Bank (2024). Risk and reform: Zambia's strategic approach to modern governance (Nasikiliza blog). https://blogs.worldbank.org/en/nasikiliza/risk-and-reform-zambias-strategic-approach-to-modern-governance-afe-0524</w:t>
+      </w:r>
+    </w:p>
+    <w:p>
+      <w:pPr>
+        <w:pStyle w:val="Normal"/>
+        <w:spacing w:before="0" w:after="100"/>
+        <w:ind w:hanging="567" w:left="567"/>
+        <w:rPr/>
+      </w:pPr>
+      <w:r>
+        <w:rPr>
+          <w:sz w:val="20"/>
+          <w:szCs w:val="20"/>
+        </w:rPr>
+        <w:t>World Bank (2024). Skills Development in Namibia: Policy Note. https://documents.worldbank.org/en/publication/documents-reports/documentdetail/099081224051035127</w:t>
+      </w:r>
+    </w:p>
+    <w:p>
+      <w:pPr>
+        <w:pStyle w:val="Normal"/>
+        <w:spacing w:before="0" w:after="100"/>
+        <w:ind w:hanging="567" w:left="567"/>
+        <w:rPr/>
+      </w:pPr>
+      <w:r>
+        <w:rPr>
+          <w:sz w:val="20"/>
+          <w:szCs w:val="20"/>
+        </w:rPr>
+        <w:t>World Bank (2025). Business Ready 2025. https://documents.worldbank.org/en/publication/documents-reports/documentdetail/099122925140531373</w:t>
+      </w:r>
+    </w:p>
+    <w:p>
+      <w:pPr>
+        <w:pStyle w:val="Normal"/>
+        <w:spacing w:before="0" w:after="100"/>
+        <w:ind w:hanging="567" w:left="567"/>
+        <w:rPr/>
+      </w:pPr>
+      <w:r>
+        <w:rPr>
+          <w:sz w:val="20"/>
+          <w:szCs w:val="20"/>
+        </w:rPr>
+        <w:t>Zambia Monitor (2025). Mauritius reforms offer blueprint for Zambia, says business review agency. https://www.zambiamonitor.com/mauritius-reforms-offer-blueprint-for-zambia-says-business-review-agency/</w:t>
+      </w:r>
+    </w:p>
+    <w:p>
+      <w:pPr>
+        <w:pStyle w:val="Normal"/>
+        <w:spacing w:before="0" w:after="100"/>
+        <w:ind w:hanging="567" w:left="567"/>
+        <w:rPr/>
+      </w:pPr>
+      <w:r>
+        <w:rPr>
+          <w:sz w:val="20"/>
+          <w:szCs w:val="20"/>
+        </w:rPr>
+        <w:t>Zambia Monitor (n.d.). ZDA, CEEC partner to boost SME growth, market access. https://www.zambiamonitor.com/zda-ceec-partner-to-boost-sme-growth-market-access/</w:t>
+      </w:r>
+    </w:p>
+    <w:p>
+      <w:pPr>
+        <w:pStyle w:val="Normal"/>
+        <w:spacing w:before="0" w:after="100"/>
+        <w:ind w:hanging="567" w:left="567"/>
+        <w:rPr/>
+      </w:pPr>
+      <w:r>
+        <w:rPr>
+          <w:sz w:val="20"/>
+          <w:szCs w:val="20"/>
+        </w:rPr>
+        <w:t>ZIMRA (2024). ZIMRA signs MOU with ZIDA. https://www.zimra.co.zw/news/2286-zimra-signs-mou-with-zida</w:t>
       </w:r>
     </w:p>
     <w:p>
@@ -28284,7 +28457,7 @@
     </w:r>
     <w:r>
       <w:rPr/>
-      <w:t>49</w:t>
+      <w:t>51</w:t>
     </w:r>
     <w:r>
       <w:rPr/>
@@ -28340,7 +28513,7 @@
     </w:r>
     <w:r>
       <w:rPr/>
-      <w:t>49</w:t>
+      <w:t>51</w:t>
     </w:r>
     <w:r>
       <w:rPr/>
@@ -28364,7 +28537,7 @@
     </w:r>
     <w:r>
       <w:rPr/>
-      <w:t>49</w:t>
+      <w:t>51</w:t>
     </w:r>
     <w:r>
       <w:rPr/>

</xml_diff>